<commit_message>
Track in-progress builds; add complete/cancel flows
Add support for marking builds as in-progress and completing or cancelling them.

Database: add isComplete bit to ProductionLog and update vw_ProductionSummary to count only completed rows as produced (and include an inProgress count). Add DROP checks for sp_CompleteLamp/sp_CancelLamp. Modify sp_BuildLamp to insert isComplete=0 and return the new logID (SCOPE_IDENTITY). Add sp_CompleteLamp to mark a log row complete and sp_CancelLamp to remove in-progress rows when a build is cancelled.

Client: update MainWindow.xaml.cs to capture the @logID output from sp_BuildLamp, call sp_CompleteLamp when a build finishes while running, or sp_CancelLamp if stopped mid-build, and add a CallProc helper to invoke those single-parameter procedures. This keeps the Kanban "producing" count accurate during simulated assembly.
</commit_message>
<xml_diff>
--- a/Documentation/Advance SQL Project Document.docx
+++ b/Documentation/Advance SQL Project Document.docx
@@ -34,6 +34,15 @@
     </w:p>
     <w:sdt>
       <w:sdtPr>
+        <w:rPr>
+          <w:rFonts w:asciiTheme="minorHAnsi" w:eastAsiaTheme="minorHAnsi" w:hAnsiTheme="minorHAnsi" w:cstheme="minorBidi"/>
+          <w:color w:val="auto"/>
+          <w:kern w:val="2"/>
+          <w:sz w:val="24"/>
+          <w:szCs w:val="24"/>
+          <w:lang w:val="en-CA"/>
+          <w14:ligatures w14:val="standardContextual"/>
+        </w:rPr>
         <w:id w:val="29923790"/>
         <w:docPartObj>
           <w:docPartGallery w:val="Table of Contents"/>
@@ -42,16 +51,9 @@
       </w:sdtPr>
       <w:sdtEndPr>
         <w:rPr>
-          <w:rFonts w:asciiTheme="minorHAnsi" w:eastAsiaTheme="minorHAnsi" w:hAnsiTheme="minorHAnsi" w:cstheme="minorBidi"/>
           <w:b/>
           <w:bCs/>
           <w:noProof/>
-          <w:color w:val="auto"/>
-          <w:kern w:val="2"/>
-          <w:sz w:val="24"/>
-          <w:szCs w:val="24"/>
-          <w:lang w:val="en-CA"/>
-          <w14:ligatures w14:val="standardContextual"/>
         </w:rPr>
       </w:sdtEndPr>
       <w:sdtContent>
@@ -70,7 +72,9 @@
               <w:tab w:val="right" w:leader="dot" w:pos="9350"/>
             </w:tabs>
             <w:rPr>
+              <w:rFonts w:eastAsiaTheme="minorEastAsia"/>
               <w:noProof/>
+              <w:lang w:eastAsia="en-CA"/>
             </w:rPr>
           </w:pPr>
           <w:r>
@@ -82,7 +86,7 @@
           <w:r>
             <w:fldChar w:fldCharType="separate"/>
           </w:r>
-          <w:hyperlink w:anchor="_Toc223993796" w:history="1">
+          <w:hyperlink w:anchor="_Toc227281512" w:history="1">
             <w:r>
               <w:rPr>
                 <w:rStyle w:val="Hyperlink"/>
@@ -112,7 +116,7 @@
                 <w:noProof/>
                 <w:webHidden/>
               </w:rPr>
-              <w:instrText xml:space="preserve"> PAGEREF _Toc223993796 \h </w:instrText>
+              <w:instrText xml:space="preserve"> PAGEREF _Toc227281512 \h </w:instrText>
             </w:r>
             <w:r>
               <w:rPr>
@@ -150,10 +154,12 @@
               <w:tab w:val="right" w:leader="dot" w:pos="9350"/>
             </w:tabs>
             <w:rPr>
+              <w:rFonts w:eastAsiaTheme="minorEastAsia"/>
               <w:noProof/>
+              <w:lang w:eastAsia="en-CA"/>
             </w:rPr>
           </w:pPr>
-          <w:hyperlink w:anchor="_Toc223993797" w:history="1">
+          <w:hyperlink w:anchor="_Toc227281513" w:history="1">
             <w:r>
               <w:rPr>
                 <w:rStyle w:val="Hyperlink"/>
@@ -182,7 +188,7 @@
                 <w:noProof/>
                 <w:webHidden/>
               </w:rPr>
-              <w:instrText xml:space="preserve"> PAGEREF _Toc223993797 \h </w:instrText>
+              <w:instrText xml:space="preserve"> PAGEREF _Toc227281513 \h </w:instrText>
             </w:r>
             <w:r>
               <w:rPr>
@@ -220,10 +226,12 @@
               <w:tab w:val="right" w:leader="dot" w:pos="9350"/>
             </w:tabs>
             <w:rPr>
+              <w:rFonts w:eastAsiaTheme="minorEastAsia"/>
               <w:noProof/>
+              <w:lang w:eastAsia="en-CA"/>
             </w:rPr>
           </w:pPr>
-          <w:hyperlink w:anchor="_Toc223993798" w:history="1">
+          <w:hyperlink w:anchor="_Toc227281514" w:history="1">
             <w:r>
               <w:rPr>
                 <w:rStyle w:val="Hyperlink"/>
@@ -266,7 +274,7 @@
                 <w:noProof/>
                 <w:webHidden/>
               </w:rPr>
-              <w:instrText xml:space="preserve"> PAGEREF _Toc223993798 \h </w:instrText>
+              <w:instrText xml:space="preserve"> PAGEREF _Toc227281514 \h </w:instrText>
             </w:r>
             <w:r>
               <w:rPr>
@@ -286,7 +294,7 @@
                 <w:noProof/>
                 <w:webHidden/>
               </w:rPr>
-              <w:t>1</w:t>
+              <w:t>2</w:t>
             </w:r>
             <w:r>
               <w:rPr>
@@ -304,10 +312,12 @@
               <w:tab w:val="right" w:leader="dot" w:pos="9350"/>
             </w:tabs>
             <w:rPr>
+              <w:rFonts w:eastAsiaTheme="minorEastAsia"/>
               <w:noProof/>
+              <w:lang w:eastAsia="en-CA"/>
             </w:rPr>
           </w:pPr>
-          <w:hyperlink w:anchor="_Toc223993799" w:history="1">
+          <w:hyperlink w:anchor="_Toc227281515" w:history="1">
             <w:r>
               <w:rPr>
                 <w:rStyle w:val="Hyperlink"/>
@@ -334,7 +344,7 @@
                 <w:noProof/>
                 <w:webHidden/>
               </w:rPr>
-              <w:instrText xml:space="preserve"> PAGEREF _Toc223993799 \h </w:instrText>
+              <w:instrText xml:space="preserve"> PAGEREF _Toc227281515 \h </w:instrText>
             </w:r>
             <w:r>
               <w:rPr>
@@ -372,10 +382,12 @@
               <w:tab w:val="right" w:leader="dot" w:pos="9350"/>
             </w:tabs>
             <w:rPr>
+              <w:rFonts w:eastAsiaTheme="minorEastAsia"/>
               <w:noProof/>
+              <w:lang w:eastAsia="en-CA"/>
             </w:rPr>
           </w:pPr>
-          <w:hyperlink w:anchor="_Toc223993800" w:history="1">
+          <w:hyperlink w:anchor="_Toc227281516" w:history="1">
             <w:r>
               <w:rPr>
                 <w:rStyle w:val="Hyperlink"/>
@@ -402,7 +414,7 @@
                 <w:noProof/>
                 <w:webHidden/>
               </w:rPr>
-              <w:instrText xml:space="preserve"> PAGEREF _Toc223993800 \h </w:instrText>
+              <w:instrText xml:space="preserve"> PAGEREF _Toc227281516 \h </w:instrText>
             </w:r>
             <w:r>
               <w:rPr>
@@ -440,11 +452,12 @@
               <w:tab w:val="right" w:leader="dot" w:pos="9350"/>
             </w:tabs>
             <w:rPr>
-              <w:rStyle w:val="Hyperlink"/>
+              <w:rFonts w:eastAsiaTheme="minorEastAsia"/>
               <w:noProof/>
+              <w:lang w:eastAsia="en-CA"/>
             </w:rPr>
           </w:pPr>
-          <w:hyperlink w:anchor="_Toc223993801" w:history="1">
+          <w:hyperlink w:anchor="_Toc227281517" w:history="1">
             <w:r>
               <w:rPr>
                 <w:rStyle w:val="Hyperlink"/>
@@ -473,7 +486,7 @@
                 <w:noProof/>
                 <w:webHidden/>
               </w:rPr>
-              <w:instrText xml:space="preserve"> PAGEREF _Toc223993801 \h </w:instrText>
+              <w:instrText xml:space="preserve"> PAGEREF _Toc227281517 \h </w:instrText>
             </w:r>
             <w:r>
               <w:rPr>
@@ -504,20 +517,498 @@
             </w:r>
           </w:hyperlink>
         </w:p>
-        <w:p/>
-        <w:p/>
-        <w:p/>
-        <w:p/>
-        <w:p/>
-        <w:p/>
-        <w:p/>
-        <w:p/>
-        <w:p/>
-        <w:p/>
-        <w:p/>
-        <w:p/>
-        <w:p/>
-        <w:p/>
+        <w:p>
+          <w:pPr>
+            <w:pStyle w:val="TOC1"/>
+            <w:tabs>
+              <w:tab w:val="right" w:leader="dot" w:pos="9350"/>
+            </w:tabs>
+            <w:rPr>
+              <w:rFonts w:eastAsiaTheme="minorEastAsia"/>
+              <w:noProof/>
+              <w:lang w:eastAsia="en-CA"/>
+            </w:rPr>
+          </w:pPr>
+          <w:hyperlink w:anchor="_Toc227281518" w:history="1">
+            <w:r>
+              <w:rPr>
+                <w:rStyle w:val="Hyperlink"/>
+                <w:b/>
+                <w:bCs/>
+                <w:noProof/>
+              </w:rPr>
+              <w:t>4. Database Implementation</w:t>
+            </w:r>
+            <w:r>
+              <w:rPr>
+                <w:noProof/>
+                <w:webHidden/>
+              </w:rPr>
+              <w:tab/>
+            </w:r>
+            <w:r>
+              <w:rPr>
+                <w:noProof/>
+                <w:webHidden/>
+              </w:rPr>
+              <w:fldChar w:fldCharType="begin"/>
+            </w:r>
+            <w:r>
+              <w:rPr>
+                <w:noProof/>
+                <w:webHidden/>
+              </w:rPr>
+              <w:instrText xml:space="preserve"> PAGEREF _Toc227281518 \h </w:instrText>
+            </w:r>
+            <w:r>
+              <w:rPr>
+                <w:noProof/>
+                <w:webHidden/>
+              </w:rPr>
+            </w:r>
+            <w:r>
+              <w:rPr>
+                <w:noProof/>
+                <w:webHidden/>
+              </w:rPr>
+              <w:fldChar w:fldCharType="separate"/>
+            </w:r>
+            <w:r>
+              <w:rPr>
+                <w:noProof/>
+                <w:webHidden/>
+              </w:rPr>
+              <w:t>4</w:t>
+            </w:r>
+            <w:r>
+              <w:rPr>
+                <w:noProof/>
+                <w:webHidden/>
+              </w:rPr>
+              <w:fldChar w:fldCharType="end"/>
+            </w:r>
+          </w:hyperlink>
+        </w:p>
+        <w:p>
+          <w:pPr>
+            <w:pStyle w:val="TOC2"/>
+            <w:tabs>
+              <w:tab w:val="right" w:leader="dot" w:pos="9350"/>
+            </w:tabs>
+            <w:rPr>
+              <w:rFonts w:eastAsiaTheme="minorEastAsia"/>
+              <w:noProof/>
+              <w:lang w:eastAsia="en-CA"/>
+            </w:rPr>
+          </w:pPr>
+          <w:hyperlink w:anchor="_Toc227281519" w:history="1">
+            <w:r>
+              <w:rPr>
+                <w:rStyle w:val="Hyperlink"/>
+                <w:noProof/>
+              </w:rPr>
+              <w:t>Database Implementation</w:t>
+            </w:r>
+            <w:r>
+              <w:rPr>
+                <w:noProof/>
+                <w:webHidden/>
+              </w:rPr>
+              <w:tab/>
+            </w:r>
+            <w:r>
+              <w:rPr>
+                <w:noProof/>
+                <w:webHidden/>
+              </w:rPr>
+              <w:fldChar w:fldCharType="begin"/>
+            </w:r>
+            <w:r>
+              <w:rPr>
+                <w:noProof/>
+                <w:webHidden/>
+              </w:rPr>
+              <w:instrText xml:space="preserve"> PAGEREF _Toc227281519 \h </w:instrText>
+            </w:r>
+            <w:r>
+              <w:rPr>
+                <w:noProof/>
+                <w:webHidden/>
+              </w:rPr>
+            </w:r>
+            <w:r>
+              <w:rPr>
+                <w:noProof/>
+                <w:webHidden/>
+              </w:rPr>
+              <w:fldChar w:fldCharType="separate"/>
+            </w:r>
+            <w:r>
+              <w:rPr>
+                <w:noProof/>
+                <w:webHidden/>
+              </w:rPr>
+              <w:t>4</w:t>
+            </w:r>
+            <w:r>
+              <w:rPr>
+                <w:noProof/>
+                <w:webHidden/>
+              </w:rPr>
+              <w:fldChar w:fldCharType="end"/>
+            </w:r>
+          </w:hyperlink>
+        </w:p>
+        <w:p>
+          <w:pPr>
+            <w:pStyle w:val="TOC2"/>
+            <w:tabs>
+              <w:tab w:val="right" w:leader="dot" w:pos="9350"/>
+            </w:tabs>
+            <w:rPr>
+              <w:rFonts w:eastAsiaTheme="minorEastAsia"/>
+              <w:noProof/>
+              <w:lang w:eastAsia="en-CA"/>
+            </w:rPr>
+          </w:pPr>
+          <w:hyperlink w:anchor="_Toc227281520" w:history="1">
+            <w:r>
+              <w:rPr>
+                <w:rStyle w:val="Hyperlink"/>
+                <w:noProof/>
+              </w:rPr>
+              <w:t>Schema Design</w:t>
+            </w:r>
+            <w:r>
+              <w:rPr>
+                <w:noProof/>
+                <w:webHidden/>
+              </w:rPr>
+              <w:tab/>
+            </w:r>
+            <w:r>
+              <w:rPr>
+                <w:noProof/>
+                <w:webHidden/>
+              </w:rPr>
+              <w:fldChar w:fldCharType="begin"/>
+            </w:r>
+            <w:r>
+              <w:rPr>
+                <w:noProof/>
+                <w:webHidden/>
+              </w:rPr>
+              <w:instrText xml:space="preserve"> PAGEREF _Toc227281520 \h </w:instrText>
+            </w:r>
+            <w:r>
+              <w:rPr>
+                <w:noProof/>
+                <w:webHidden/>
+              </w:rPr>
+            </w:r>
+            <w:r>
+              <w:rPr>
+                <w:noProof/>
+                <w:webHidden/>
+              </w:rPr>
+              <w:fldChar w:fldCharType="separate"/>
+            </w:r>
+            <w:r>
+              <w:rPr>
+                <w:noProof/>
+                <w:webHidden/>
+              </w:rPr>
+              <w:t>4</w:t>
+            </w:r>
+            <w:r>
+              <w:rPr>
+                <w:noProof/>
+                <w:webHidden/>
+              </w:rPr>
+              <w:fldChar w:fldCharType="end"/>
+            </w:r>
+          </w:hyperlink>
+        </w:p>
+        <w:p>
+          <w:pPr>
+            <w:pStyle w:val="TOC2"/>
+            <w:tabs>
+              <w:tab w:val="right" w:leader="dot" w:pos="9350"/>
+            </w:tabs>
+            <w:rPr>
+              <w:rFonts w:eastAsiaTheme="minorEastAsia"/>
+              <w:noProof/>
+              <w:lang w:eastAsia="en-CA"/>
+            </w:rPr>
+          </w:pPr>
+          <w:hyperlink w:anchor="_Toc227281521" w:history="1">
+            <w:r>
+              <w:rPr>
+                <w:rStyle w:val="Hyperlink"/>
+                <w:noProof/>
+              </w:rPr>
+              <w:t>Stored Procedures</w:t>
+            </w:r>
+            <w:r>
+              <w:rPr>
+                <w:noProof/>
+                <w:webHidden/>
+              </w:rPr>
+              <w:tab/>
+            </w:r>
+            <w:r>
+              <w:rPr>
+                <w:noProof/>
+                <w:webHidden/>
+              </w:rPr>
+              <w:fldChar w:fldCharType="begin"/>
+            </w:r>
+            <w:r>
+              <w:rPr>
+                <w:noProof/>
+                <w:webHidden/>
+              </w:rPr>
+              <w:instrText xml:space="preserve"> PAGEREF _Toc227281521 \h </w:instrText>
+            </w:r>
+            <w:r>
+              <w:rPr>
+                <w:noProof/>
+                <w:webHidden/>
+              </w:rPr>
+            </w:r>
+            <w:r>
+              <w:rPr>
+                <w:noProof/>
+                <w:webHidden/>
+              </w:rPr>
+              <w:fldChar w:fldCharType="separate"/>
+            </w:r>
+            <w:r>
+              <w:rPr>
+                <w:noProof/>
+                <w:webHidden/>
+              </w:rPr>
+              <w:t>5</w:t>
+            </w:r>
+            <w:r>
+              <w:rPr>
+                <w:noProof/>
+                <w:webHidden/>
+              </w:rPr>
+              <w:fldChar w:fldCharType="end"/>
+            </w:r>
+          </w:hyperlink>
+        </w:p>
+        <w:p>
+          <w:pPr>
+            <w:pStyle w:val="TOC2"/>
+            <w:tabs>
+              <w:tab w:val="right" w:leader="dot" w:pos="9350"/>
+            </w:tabs>
+            <w:rPr>
+              <w:rFonts w:eastAsiaTheme="minorEastAsia"/>
+              <w:noProof/>
+              <w:lang w:eastAsia="en-CA"/>
+            </w:rPr>
+          </w:pPr>
+          <w:hyperlink w:anchor="_Toc227281522" w:history="1">
+            <w:r>
+              <w:rPr>
+                <w:rStyle w:val="Hyperlink"/>
+                <w:noProof/>
+              </w:rPr>
+              <w:t>Trigger</w:t>
+            </w:r>
+            <w:r>
+              <w:rPr>
+                <w:noProof/>
+                <w:webHidden/>
+              </w:rPr>
+              <w:tab/>
+            </w:r>
+            <w:r>
+              <w:rPr>
+                <w:noProof/>
+                <w:webHidden/>
+              </w:rPr>
+              <w:fldChar w:fldCharType="begin"/>
+            </w:r>
+            <w:r>
+              <w:rPr>
+                <w:noProof/>
+                <w:webHidden/>
+              </w:rPr>
+              <w:instrText xml:space="preserve"> PAGEREF _Toc227281522 \h </w:instrText>
+            </w:r>
+            <w:r>
+              <w:rPr>
+                <w:noProof/>
+                <w:webHidden/>
+              </w:rPr>
+            </w:r>
+            <w:r>
+              <w:rPr>
+                <w:noProof/>
+                <w:webHidden/>
+              </w:rPr>
+              <w:fldChar w:fldCharType="separate"/>
+            </w:r>
+            <w:r>
+              <w:rPr>
+                <w:noProof/>
+                <w:webHidden/>
+              </w:rPr>
+              <w:t>5</w:t>
+            </w:r>
+            <w:r>
+              <w:rPr>
+                <w:noProof/>
+                <w:webHidden/>
+              </w:rPr>
+              <w:fldChar w:fldCharType="end"/>
+            </w:r>
+          </w:hyperlink>
+        </w:p>
+        <w:p>
+          <w:pPr>
+            <w:pStyle w:val="TOC2"/>
+            <w:tabs>
+              <w:tab w:val="right" w:leader="dot" w:pos="9350"/>
+            </w:tabs>
+            <w:rPr>
+              <w:rFonts w:eastAsiaTheme="minorEastAsia"/>
+              <w:noProof/>
+              <w:lang w:eastAsia="en-CA"/>
+            </w:rPr>
+          </w:pPr>
+          <w:hyperlink w:anchor="_Toc227281523" w:history="1">
+            <w:r>
+              <w:rPr>
+                <w:rStyle w:val="Hyperlink"/>
+                <w:noProof/>
+              </w:rPr>
+              <w:t>Views and Functions</w:t>
+            </w:r>
+            <w:r>
+              <w:rPr>
+                <w:noProof/>
+                <w:webHidden/>
+              </w:rPr>
+              <w:tab/>
+            </w:r>
+            <w:r>
+              <w:rPr>
+                <w:noProof/>
+                <w:webHidden/>
+              </w:rPr>
+              <w:fldChar w:fldCharType="begin"/>
+            </w:r>
+            <w:r>
+              <w:rPr>
+                <w:noProof/>
+                <w:webHidden/>
+              </w:rPr>
+              <w:instrText xml:space="preserve"> PAGEREF _Toc227281523 \h </w:instrText>
+            </w:r>
+            <w:r>
+              <w:rPr>
+                <w:noProof/>
+                <w:webHidden/>
+              </w:rPr>
+            </w:r>
+            <w:r>
+              <w:rPr>
+                <w:noProof/>
+                <w:webHidden/>
+              </w:rPr>
+              <w:fldChar w:fldCharType="separate"/>
+            </w:r>
+            <w:r>
+              <w:rPr>
+                <w:noProof/>
+                <w:webHidden/>
+              </w:rPr>
+              <w:t>6</w:t>
+            </w:r>
+            <w:r>
+              <w:rPr>
+                <w:noProof/>
+                <w:webHidden/>
+              </w:rPr>
+              <w:fldChar w:fldCharType="end"/>
+            </w:r>
+          </w:hyperlink>
+        </w:p>
+        <w:p>
+          <w:pPr>
+            <w:pStyle w:val="TOC2"/>
+            <w:tabs>
+              <w:tab w:val="right" w:leader="dot" w:pos="9350"/>
+            </w:tabs>
+            <w:rPr>
+              <w:rFonts w:eastAsiaTheme="minorEastAsia"/>
+              <w:noProof/>
+              <w:lang w:eastAsia="en-CA"/>
+            </w:rPr>
+          </w:pPr>
+          <w:hyperlink w:anchor="_Toc227281524" w:history="1">
+            <w:r>
+              <w:rPr>
+                <w:rStyle w:val="Hyperlink"/>
+                <w:noProof/>
+              </w:rPr>
+              <w:t>Indices</w:t>
+            </w:r>
+            <w:r>
+              <w:rPr>
+                <w:noProof/>
+                <w:webHidden/>
+              </w:rPr>
+              <w:tab/>
+            </w:r>
+            <w:r>
+              <w:rPr>
+                <w:noProof/>
+                <w:webHidden/>
+              </w:rPr>
+              <w:fldChar w:fldCharType="begin"/>
+            </w:r>
+            <w:r>
+              <w:rPr>
+                <w:noProof/>
+                <w:webHidden/>
+              </w:rPr>
+              <w:instrText xml:space="preserve"> PAGEREF _Toc227281524 \h </w:instrText>
+            </w:r>
+            <w:r>
+              <w:rPr>
+                <w:noProof/>
+                <w:webHidden/>
+              </w:rPr>
+            </w:r>
+            <w:r>
+              <w:rPr>
+                <w:noProof/>
+                <w:webHidden/>
+              </w:rPr>
+              <w:fldChar w:fldCharType="separate"/>
+            </w:r>
+            <w:r>
+              <w:rPr>
+                <w:noProof/>
+                <w:webHidden/>
+              </w:rPr>
+              <w:t>7</w:t>
+            </w:r>
+            <w:r>
+              <w:rPr>
+                <w:noProof/>
+                <w:webHidden/>
+              </w:rPr>
+              <w:fldChar w:fldCharType="end"/>
+            </w:r>
+          </w:hyperlink>
+        </w:p>
         <w:p>
           <w:pPr>
             <w:rPr>
@@ -537,10 +1028,28 @@
         </w:p>
       </w:sdtContent>
     </w:sdt>
-    <w:bookmarkStart w:id="0" w:name="_Toc223993796" w:displacedByCustomXml="prev"/>
+    <w:bookmarkStart w:id="0" w:name="_Toc227281512" w:displacedByCustomXml="prev"/>
     <w:p>
       <w:pPr>
         <w:pStyle w:val="Heading1"/>
+        <w:rPr>
+          <w:rFonts w:ascii="Aptos" w:hAnsi="Aptos"/>
+          <w:b/>
+          <w:bCs/>
+          <w:color w:val="000000" w:themeColor="text1"/>
+        </w:rPr>
+        <w:sectPr>
+          <w:pgSz w:w="12240" w:h="15840"/>
+          <w:pgMar w:top="1440" w:right="1440" w:bottom="1440" w:left="1440" w:header="708" w:footer="708" w:gutter="0"/>
+          <w:cols w:space="708"/>
+          <w:docGrid w:linePitch="360"/>
+        </w:sectPr>
+      </w:pPr>
+    </w:p>
+    <w:p>
+      <w:pPr>
+        <w:pStyle w:val="Heading1"/>
+        <w:shd w:val="clear" w:color="auto" w:fill="D1D1D1" w:themeFill="background2" w:themeFillShade="E6"/>
         <w:rPr>
           <w:rFonts w:ascii="Aptos" w:hAnsi="Aptos"/>
           <w:b/>
@@ -577,15 +1086,18 @@
     <w:p>
       <w:pPr>
         <w:pStyle w:val="Heading1"/>
+        <w:shd w:val="clear" w:color="auto" w:fill="D1D1D1" w:themeFill="background2" w:themeFillShade="E6"/>
         <w:rPr>
+          <w:rFonts w:ascii="Aptos" w:hAnsi="Aptos"/>
           <w:b/>
           <w:bCs/>
           <w:color w:val="000000" w:themeColor="text1"/>
         </w:rPr>
       </w:pPr>
-      <w:bookmarkStart w:id="1" w:name="_Toc223993797"/>
+      <w:bookmarkStart w:id="1" w:name="_Toc227281513"/>
       <w:r>
         <w:rPr>
+          <w:rFonts w:ascii="Aptos" w:hAnsi="Aptos"/>
           <w:b/>
           <w:bCs/>
           <w:color w:val="000000" w:themeColor="text1"/>
@@ -611,7 +1123,7 @@
           <w:color w:val="000000" w:themeColor="text1"/>
         </w:rPr>
       </w:pPr>
-      <w:bookmarkStart w:id="2" w:name="_Toc223993798"/>
+      <w:bookmarkStart w:id="2" w:name="_Toc227281514"/>
       <w:r>
         <w:rPr>
           <w:color w:val="000000" w:themeColor="text1"/>
@@ -664,7 +1176,7 @@
           <w:color w:val="000000" w:themeColor="text1"/>
         </w:rPr>
       </w:pPr>
-      <w:bookmarkStart w:id="3" w:name="_Toc223993799"/>
+      <w:bookmarkStart w:id="3" w:name="_Toc227281515"/>
       <w:r>
         <w:rPr>
           <w:color w:val="000000" w:themeColor="text1"/>
@@ -718,7 +1230,7 @@
           <w:color w:val="000000" w:themeColor="text1"/>
         </w:rPr>
       </w:pPr>
-      <w:bookmarkStart w:id="4" w:name="_Toc223993800"/>
+      <w:bookmarkStart w:id="4" w:name="_Toc227281516"/>
       <w:r>
         <w:rPr>
           <w:color w:val="000000" w:themeColor="text1"/>
@@ -789,15 +1301,18 @@
     <w:p>
       <w:pPr>
         <w:pStyle w:val="Heading1"/>
+        <w:shd w:val="clear" w:color="auto" w:fill="D1D1D1" w:themeFill="background2" w:themeFillShade="E6"/>
         <w:rPr>
+          <w:rFonts w:ascii="Aptos" w:hAnsi="Aptos"/>
           <w:b/>
           <w:bCs/>
           <w:color w:val="000000" w:themeColor="text1"/>
         </w:rPr>
       </w:pPr>
-      <w:bookmarkStart w:id="5" w:name="_Toc223993801"/>
+      <w:bookmarkStart w:id="5" w:name="_Toc227281517"/>
       <w:r>
         <w:rPr>
+          <w:rFonts w:ascii="Aptos" w:hAnsi="Aptos"/>
           <w:b/>
           <w:bCs/>
           <w:color w:val="000000" w:themeColor="text1"/>
@@ -1062,7 +1577,1889 @@
         <w:t xml:space="preserve"> for fast, real-time dashboard updates).</w:t>
       </w:r>
     </w:p>
+    <w:p>
+      <w:pPr>
+        <w:pStyle w:val="Heading1"/>
+        <w:shd w:val="clear" w:color="auto" w:fill="D1D1D1" w:themeFill="background2" w:themeFillShade="E6"/>
+        <w:rPr>
+          <w:rFonts w:ascii="Aptos" w:hAnsi="Aptos"/>
+          <w:b/>
+          <w:bCs/>
+          <w:color w:val="000000" w:themeColor="text1"/>
+        </w:rPr>
+      </w:pPr>
+      <w:bookmarkStart w:id="6" w:name="_Toc227281518"/>
+      <w:r>
+        <w:rPr>
+          <w:rFonts w:ascii="Aptos" w:hAnsi="Aptos"/>
+          <w:b/>
+          <w:bCs/>
+          <w:color w:val="000000" w:themeColor="text1"/>
+        </w:rPr>
+        <w:t>4. Database Implementation</w:t>
+      </w:r>
+      <w:bookmarkEnd w:id="6"/>
+    </w:p>
+    <w:p>
+      <w:pPr>
+        <w:pStyle w:val="Heading2"/>
+        <w:shd w:val="clear" w:color="auto" w:fill="A5C9EB" w:themeFill="text2" w:themeFillTint="40"/>
+        <w:rPr>
+          <w:color w:val="auto"/>
+        </w:rPr>
+      </w:pPr>
+      <w:bookmarkStart w:id="7" w:name="_Toc227281519"/>
+      <w:r>
+        <w:rPr>
+          <w:color w:val="auto"/>
+        </w:rPr>
+        <w:t>Database Implementation</w:t>
+      </w:r>
+      <w:bookmarkEnd w:id="7"/>
+    </w:p>
+    <w:p>
+      <w:r>
+        <w:t xml:space="preserve">With the planning phase complete, I began implementing the SQL Server database. The database, named </w:t>
+      </w:r>
+      <w:proofErr w:type="spellStart"/>
+      <w:r>
+        <w:t>FogLampAssemblyDB</w:t>
+      </w:r>
+      <w:proofErr w:type="spellEnd"/>
+      <w:r>
+        <w:t>, is created by a single idempotent script that drops and recreates every object on each execution, making it safe to run repeatedly during development and testing without leaving orphaned objects behind.</w:t>
+      </w:r>
+    </w:p>
     <w:p/>
+    <w:p>
+      <w:pPr>
+        <w:pStyle w:val="Heading2"/>
+        <w:shd w:val="clear" w:color="auto" w:fill="A5C9EB" w:themeFill="text2" w:themeFillTint="40"/>
+        <w:rPr>
+          <w:color w:val="auto"/>
+        </w:rPr>
+      </w:pPr>
+      <w:bookmarkStart w:id="8" w:name="_Toc227281520"/>
+      <w:r>
+        <w:rPr>
+          <w:color w:val="auto"/>
+        </w:rPr>
+        <w:t>Schema Design</w:t>
+      </w:r>
+      <w:bookmarkEnd w:id="8"/>
+    </w:p>
+    <w:p>
+      <w:r>
+        <w:t xml:space="preserve">The schema consists of seven tables. </w:t>
+      </w:r>
+    </w:p>
+    <w:p>
+      <w:pPr>
+        <w:pStyle w:val="ListParagraph"/>
+        <w:numPr>
+          <w:ilvl w:val="0"/>
+          <w:numId w:val="6"/>
+        </w:numPr>
+      </w:pPr>
+      <w:r>
+        <w:t xml:space="preserve">The Configuration table stores all simulation parameters as name-value pairs, with a unique constraint on the setting name so that any C# application can retrieve any parameter by name without hardcoding values. </w:t>
+      </w:r>
+    </w:p>
+    <w:p>
+      <w:pPr>
+        <w:pStyle w:val="ListParagraph"/>
+        <w:numPr>
+          <w:ilvl w:val="0"/>
+          <w:numId w:val="6"/>
+        </w:numPr>
+      </w:pPr>
+      <w:r>
+        <w:t xml:space="preserve">The Worker table holds employee records with a CHECK constraint enforcing valid skill levels (Rookie, Normal, Super). </w:t>
+      </w:r>
+    </w:p>
+    <w:p>
+      <w:pPr>
+        <w:pStyle w:val="ListParagraph"/>
+        <w:numPr>
+          <w:ilvl w:val="0"/>
+          <w:numId w:val="6"/>
+        </w:numPr>
+      </w:pPr>
+      <w:r>
+        <w:t xml:space="preserve">The Part table stores the six component types with their default bin capacities. </w:t>
+      </w:r>
+    </w:p>
+    <w:p>
+      <w:pPr>
+        <w:pStyle w:val="ListParagraph"/>
+        <w:numPr>
+          <w:ilvl w:val="0"/>
+          <w:numId w:val="6"/>
+        </w:numPr>
+      </w:pPr>
+      <w:r>
+        <w:t xml:space="preserve">The Workstation table links each station to its assigned worker and tracks a status field constrained to Running, Idle, or Blocked. </w:t>
+      </w:r>
+    </w:p>
+    <w:p>
+      <w:pPr>
+        <w:pStyle w:val="ListParagraph"/>
+        <w:numPr>
+          <w:ilvl w:val="0"/>
+          <w:numId w:val="6"/>
+        </w:numPr>
+      </w:pPr>
+      <w:r>
+        <w:lastRenderedPageBreak/>
+        <w:t xml:space="preserve">The </w:t>
+      </w:r>
+      <w:proofErr w:type="spellStart"/>
+      <w:r>
+        <w:t>WorkstationBin</w:t>
+      </w:r>
+      <w:proofErr w:type="spellEnd"/>
+      <w:r>
+        <w:t xml:space="preserve"> table represents the Cartesian product of stations and parts, enforced by a unique constraint on (</w:t>
+      </w:r>
+      <w:proofErr w:type="spellStart"/>
+      <w:r>
+        <w:t>stationID</w:t>
+      </w:r>
+      <w:proofErr w:type="spellEnd"/>
+      <w:r>
+        <w:t xml:space="preserve">, </w:t>
+      </w:r>
+      <w:proofErr w:type="spellStart"/>
+      <w:r>
+        <w:t>partID</w:t>
+      </w:r>
+      <w:proofErr w:type="spellEnd"/>
+      <w:r>
+        <w:t xml:space="preserve">) to guarantee exactly one bin per part per station. </w:t>
+      </w:r>
+    </w:p>
+    <w:p>
+      <w:pPr>
+        <w:pStyle w:val="ListParagraph"/>
+        <w:numPr>
+          <w:ilvl w:val="0"/>
+          <w:numId w:val="6"/>
+        </w:numPr>
+      </w:pPr>
+      <w:r>
+        <w:t xml:space="preserve">The </w:t>
+      </w:r>
+      <w:proofErr w:type="spellStart"/>
+      <w:r>
+        <w:t>ProductionLog</w:t>
+      </w:r>
+      <w:proofErr w:type="spellEnd"/>
+      <w:r>
+        <w:t xml:space="preserve"> table records every lamp assembled, including the build time in seconds, the QA result, and a timestamp. </w:t>
+      </w:r>
+    </w:p>
+    <w:p>
+      <w:pPr>
+        <w:pStyle w:val="ListParagraph"/>
+        <w:numPr>
+          <w:ilvl w:val="0"/>
+          <w:numId w:val="6"/>
+        </w:numPr>
+      </w:pPr>
+      <w:r>
+        <w:t xml:space="preserve">The </w:t>
+      </w:r>
+      <w:proofErr w:type="spellStart"/>
+      <w:r>
+        <w:t>LowStockAlert</w:t>
+      </w:r>
+      <w:proofErr w:type="spellEnd"/>
+      <w:r>
+        <w:t xml:space="preserve"> table stores runner notifications with an </w:t>
+      </w:r>
+      <w:proofErr w:type="spellStart"/>
+      <w:r>
+        <w:t>isResolved</w:t>
+      </w:r>
+      <w:proofErr w:type="spellEnd"/>
+      <w:r>
+        <w:t xml:space="preserve"> flag to distinguish active alerts from cleared ones</w:t>
+      </w:r>
+      <w:r>
+        <w:t>.</w:t>
+      </w:r>
+    </w:p>
+    <w:p>
+      <w:pPr>
+        <w:shd w:val="clear" w:color="auto" w:fill="A5C9EB" w:themeFill="text2" w:themeFillTint="40"/>
+      </w:pPr>
+    </w:p>
+    <w:p>
+      <w:pPr>
+        <w:pStyle w:val="ListParagraph"/>
+        <w:numPr>
+          <w:ilvl w:val="0"/>
+          <w:numId w:val="7"/>
+        </w:numPr>
+      </w:pPr>
+      <w:r>
+        <w:t xml:space="preserve">The database is seeded with six parts (Harness 55, Reflector 35, Housing 24, Lens 40, Bulb 60, Bezel 75), </w:t>
+      </w:r>
+    </w:p>
+    <w:p>
+      <w:pPr>
+        <w:pStyle w:val="ListParagraph"/>
+        <w:numPr>
+          <w:ilvl w:val="0"/>
+          <w:numId w:val="7"/>
+        </w:numPr>
+      </w:pPr>
+      <w:r>
+        <w:t xml:space="preserve">six workers across all three skill levels </w:t>
+      </w:r>
+    </w:p>
+    <w:p>
+      <w:pPr>
+        <w:pStyle w:val="ListParagraph"/>
+        <w:numPr>
+          <w:ilvl w:val="0"/>
+          <w:numId w:val="7"/>
+        </w:numPr>
+      </w:pPr>
+      <w:r>
+        <w:t>three workstations</w:t>
+      </w:r>
+    </w:p>
+    <w:p>
+      <w:pPr>
+        <w:pStyle w:val="ListParagraph"/>
+        <w:numPr>
+          <w:ilvl w:val="0"/>
+          <w:numId w:val="7"/>
+        </w:numPr>
+      </w:pPr>
+      <w:r>
+        <w:t xml:space="preserve">The </w:t>
+      </w:r>
+      <w:proofErr w:type="spellStart"/>
+      <w:r>
+        <w:t>WorkstationBin</w:t>
+      </w:r>
+      <w:proofErr w:type="spellEnd"/>
+      <w:r>
+        <w:t xml:space="preserve"> rows are populated using a CROSS JOIN between Workstation and Part so that adding a new station in the future only requires inserting one row into Workstation and running the seed query again.</w:t>
+      </w:r>
+    </w:p>
+    <w:p>
+      <w:pPr>
+        <w:pStyle w:val="Heading2"/>
+        <w:shd w:val="clear" w:color="auto" w:fill="A5C9EB" w:themeFill="text2" w:themeFillTint="40"/>
+        <w:rPr>
+          <w:color w:val="auto"/>
+        </w:rPr>
+      </w:pPr>
+      <w:bookmarkStart w:id="9" w:name="_Toc227281521"/>
+      <w:r>
+        <w:rPr>
+          <w:color w:val="auto"/>
+        </w:rPr>
+        <w:t>Stored Procedures</w:t>
+      </w:r>
+      <w:bookmarkEnd w:id="9"/>
+    </w:p>
+    <w:p>
+      <w:r>
+        <w:t xml:space="preserve">Four stored procedures encapsulate the core simulation logic. </w:t>
+      </w:r>
+    </w:p>
+    <w:p>
+      <w:pPr>
+        <w:pStyle w:val="ListParagraph"/>
+        <w:numPr>
+          <w:ilvl w:val="0"/>
+          <w:numId w:val="8"/>
+        </w:numPr>
+      </w:pPr>
+      <w:proofErr w:type="spellStart"/>
+      <w:r>
+        <w:t>sp_BuildLamp</w:t>
+      </w:r>
+      <w:proofErr w:type="spellEnd"/>
+      <w:r>
+        <w:t xml:space="preserve"> is the most critical. It first checks whether any bin at the given station has a quantity of </w:t>
+      </w:r>
+      <w:proofErr w:type="gramStart"/>
+      <w:r>
+        <w:t>zero;</w:t>
+      </w:r>
+      <w:proofErr w:type="gramEnd"/>
+      <w:r>
+        <w:t xml:space="preserve"> </w:t>
+      </w:r>
+    </w:p>
+    <w:p>
+      <w:pPr>
+        <w:pStyle w:val="ListParagraph"/>
+        <w:numPr>
+          <w:ilvl w:val="1"/>
+          <w:numId w:val="8"/>
+        </w:numPr>
+      </w:pPr>
+      <w:r>
+        <w:t xml:space="preserve">if so, it sets the station status to Blocked and returns with @built = 0. </w:t>
+      </w:r>
+    </w:p>
+    <w:p>
+      <w:pPr>
+        <w:pStyle w:val="ListParagraph"/>
+        <w:numPr>
+          <w:ilvl w:val="1"/>
+          <w:numId w:val="8"/>
+        </w:numPr>
+      </w:pPr>
+      <w:r>
+        <w:t>If all bins have stock</w:t>
+      </w:r>
+      <w:r>
+        <w:t>:</w:t>
+      </w:r>
+    </w:p>
+    <w:p>
+      <w:pPr>
+        <w:pStyle w:val="ListParagraph"/>
+        <w:numPr>
+          <w:ilvl w:val="2"/>
+          <w:numId w:val="8"/>
+        </w:numPr>
+      </w:pPr>
+      <w:r>
+        <w:t xml:space="preserve"> it retrieves the assigned worker</w:t>
+      </w:r>
+      <w:r>
+        <w:t>’</w:t>
+      </w:r>
+      <w:r>
+        <w:t>s skill level</w:t>
+      </w:r>
+    </w:p>
+    <w:p>
+      <w:pPr>
+        <w:pStyle w:val="ListParagraph"/>
+        <w:numPr>
+          <w:ilvl w:val="2"/>
+          <w:numId w:val="8"/>
+        </w:numPr>
+      </w:pPr>
+      <w:r>
+        <w:t xml:space="preserve"> generates a random build time using </w:t>
+      </w:r>
+      <w:proofErr w:type="spellStart"/>
+      <w:r>
+        <w:t>fn_GetBuildTime</w:t>
+      </w:r>
+      <w:proofErr w:type="spellEnd"/>
+    </w:p>
+    <w:p>
+      <w:pPr>
+        <w:pStyle w:val="ListParagraph"/>
+        <w:numPr>
+          <w:ilvl w:val="2"/>
+          <w:numId w:val="8"/>
+        </w:numPr>
+      </w:pPr>
+      <w:r>
+        <w:t xml:space="preserve"> applies a random defect check using </w:t>
+      </w:r>
+      <w:proofErr w:type="spellStart"/>
+      <w:r>
+        <w:t>fn_GetDefectRate</w:t>
+      </w:r>
+      <w:proofErr w:type="spellEnd"/>
+      <w:r>
+        <w:t xml:space="preserve"> </w:t>
+      </w:r>
+    </w:p>
+    <w:p>
+      <w:pPr>
+        <w:pStyle w:val="ListParagraph"/>
+        <w:numPr>
+          <w:ilvl w:val="2"/>
+          <w:numId w:val="8"/>
+        </w:numPr>
+      </w:pPr>
+      <w:r>
+        <w:t xml:space="preserve">decrements all six bins by one </w:t>
+      </w:r>
+    </w:p>
+    <w:p>
+      <w:pPr>
+        <w:pStyle w:val="ListParagraph"/>
+        <w:numPr>
+          <w:ilvl w:val="2"/>
+          <w:numId w:val="8"/>
+        </w:numPr>
+      </w:pPr>
+      <w:r>
+        <w:t xml:space="preserve">logs the result to </w:t>
+      </w:r>
+      <w:proofErr w:type="spellStart"/>
+      <w:r>
+        <w:t>ProductionLog</w:t>
+      </w:r>
+      <w:proofErr w:type="spellEnd"/>
+      <w:r>
+        <w:t>, and returns the build time, QA result</w:t>
+      </w:r>
+      <w:r>
+        <w:t>,</w:t>
+      </w:r>
+      <w:r>
+        <w:t xml:space="preserve"> and a @built = 1 flag as OUTPUT parameters.</w:t>
+      </w:r>
+    </w:p>
+    <w:p/>
+    <w:p>
+      <w:pPr>
+        <w:pStyle w:val="ListParagraph"/>
+        <w:numPr>
+          <w:ilvl w:val="0"/>
+          <w:numId w:val="8"/>
+        </w:numPr>
+      </w:pPr>
+      <w:proofErr w:type="spellStart"/>
+      <w:r>
+        <w:t>sp_RefillBin</w:t>
+      </w:r>
+      <w:proofErr w:type="spellEnd"/>
+      <w:r>
+        <w:t xml:space="preserve"> refills a single part bin by adding the part</w:t>
+      </w:r>
+      <w:r>
+        <w:t>’</w:t>
+      </w:r>
+      <w:r>
+        <w:t xml:space="preserve">s default capacity to the current quantity, so any leftover parts remain on top of the incoming full bin, exactly matching the physical Kanban replenishment rule. </w:t>
+      </w:r>
+    </w:p>
+    <w:p>
+      <w:pPr>
+        <w:pStyle w:val="ListParagraph"/>
+        <w:numPr>
+          <w:ilvl w:val="1"/>
+          <w:numId w:val="8"/>
+        </w:numPr>
+      </w:pPr>
+      <w:r>
+        <w:t xml:space="preserve">It also resolves any open alert for that bin and unblocks the station if no empty bins remain. </w:t>
+      </w:r>
+    </w:p>
+    <w:p>
+      <w:pPr>
+        <w:pStyle w:val="ListParagraph"/>
+        <w:numPr>
+          <w:ilvl w:val="0"/>
+          <w:numId w:val="8"/>
+        </w:numPr>
+      </w:pPr>
+      <w:proofErr w:type="spellStart"/>
+      <w:r>
+        <w:lastRenderedPageBreak/>
+        <w:t>sp_RefillAllBins</w:t>
+      </w:r>
+      <w:proofErr w:type="spellEnd"/>
+      <w:r>
+        <w:t xml:space="preserve"> refills every bin at a station that is at or below the low-stock threshold, which is what the runner calls after replacing bins during the five-minute cycle. </w:t>
+      </w:r>
+    </w:p>
+    <w:p>
+      <w:pPr>
+        <w:pStyle w:val="ListParagraph"/>
+        <w:numPr>
+          <w:ilvl w:val="0"/>
+          <w:numId w:val="8"/>
+        </w:numPr>
+      </w:pPr>
+      <w:proofErr w:type="spellStart"/>
+      <w:r>
+        <w:t>sp_ResetSimulation</w:t>
+      </w:r>
+      <w:proofErr w:type="spellEnd"/>
+      <w:r>
+        <w:t xml:space="preserve"> clears the </w:t>
+      </w:r>
+      <w:proofErr w:type="spellStart"/>
+      <w:r>
+        <w:t>ProductionLog</w:t>
+      </w:r>
+      <w:proofErr w:type="spellEnd"/>
+      <w:r>
+        <w:t xml:space="preserve"> and </w:t>
+      </w:r>
+      <w:proofErr w:type="spellStart"/>
+      <w:r>
+        <w:t>LowStockAlert</w:t>
+      </w:r>
+      <w:proofErr w:type="spellEnd"/>
+      <w:r>
+        <w:t xml:space="preserve"> tables and restores all bins to their default capacities; it is used by the Configuration Tool to begin a fresh production run.</w:t>
+      </w:r>
+    </w:p>
+    <w:p>
+      <w:pPr>
+        <w:pStyle w:val="Heading2"/>
+        <w:shd w:val="clear" w:color="auto" w:fill="A5C9EB" w:themeFill="text2" w:themeFillTint="40"/>
+        <w:rPr>
+          <w:color w:val="auto"/>
+        </w:rPr>
+      </w:pPr>
+      <w:bookmarkStart w:id="10" w:name="_Toc227281522"/>
+      <w:r>
+        <w:rPr>
+          <w:color w:val="auto"/>
+        </w:rPr>
+        <w:t>Trigger</w:t>
+      </w:r>
+      <w:bookmarkEnd w:id="10"/>
+    </w:p>
+    <w:p>
+      <w:r>
+        <w:t xml:space="preserve">I implemented a single AFTER UPDATE trigger on the </w:t>
+      </w:r>
+      <w:proofErr w:type="spellStart"/>
+      <w:r>
+        <w:t>WorkstationBin</w:t>
+      </w:r>
+      <w:proofErr w:type="spellEnd"/>
+      <w:r>
+        <w:t xml:space="preserve"> table named </w:t>
+      </w:r>
+      <w:proofErr w:type="spellStart"/>
+      <w:r>
+        <w:t>trg_LowStockAlert</w:t>
+      </w:r>
+      <w:proofErr w:type="spellEnd"/>
+      <w:r>
+        <w:t xml:space="preserve">. </w:t>
+      </w:r>
+    </w:p>
+    <w:p>
+      <w:pPr>
+        <w:pStyle w:val="ListParagraph"/>
+        <w:numPr>
+          <w:ilvl w:val="0"/>
+          <w:numId w:val="9"/>
+        </w:numPr>
+      </w:pPr>
+      <w:r>
+        <w:t xml:space="preserve">Each time a bin quantity is updated, the trigger reads </w:t>
+      </w:r>
+      <w:proofErr w:type="spellStart"/>
+      <w:r>
+        <w:t>LowStockThreshold</w:t>
+      </w:r>
+      <w:proofErr w:type="spellEnd"/>
+      <w:r>
+        <w:t xml:space="preserve"> from the Configuration table and inserts a new alert row only when two conditions are both true: </w:t>
+      </w:r>
+    </w:p>
+    <w:p>
+      <w:pPr>
+        <w:pStyle w:val="ListParagraph"/>
+        <w:numPr>
+          <w:ilvl w:val="1"/>
+          <w:numId w:val="9"/>
+        </w:numPr>
+      </w:pPr>
+      <w:r>
+        <w:t>the updated quantity is at or below the threshold</w:t>
+      </w:r>
+    </w:p>
+    <w:p>
+      <w:pPr>
+        <w:pStyle w:val="ListParagraph"/>
+        <w:numPr>
+          <w:ilvl w:val="1"/>
+          <w:numId w:val="9"/>
+        </w:numPr>
+      </w:pPr>
+      <w:r>
+        <w:t xml:space="preserve">no unresolved alert already exists for that station-part combination. </w:t>
+      </w:r>
+    </w:p>
+    <w:p>
+      <w:pPr>
+        <w:pStyle w:val="ListParagraph"/>
+        <w:numPr>
+          <w:ilvl w:val="0"/>
+          <w:numId w:val="9"/>
+        </w:numPr>
+      </w:pPr>
+      <w:r>
+        <w:t>Reading the threshold dynamically from the Configuration table rather than hardcoding the value of five means the alert level can be adjusted through the Configuration Tool without modifying any SQL objects</w:t>
+      </w:r>
+      <w:r>
+        <w:t>.</w:t>
+      </w:r>
+    </w:p>
+    <w:p>
+      <w:pPr>
+        <w:pStyle w:val="Heading2"/>
+        <w:shd w:val="clear" w:color="auto" w:fill="A5C9EB" w:themeFill="text2" w:themeFillTint="40"/>
+        <w:rPr>
+          <w:color w:val="auto"/>
+        </w:rPr>
+      </w:pPr>
+      <w:bookmarkStart w:id="11" w:name="_Toc227281523"/>
+      <w:r>
+        <w:rPr>
+          <w:color w:val="auto"/>
+        </w:rPr>
+        <w:t>Views and Functions</w:t>
+      </w:r>
+      <w:bookmarkEnd w:id="11"/>
+    </w:p>
+    <w:p>
+      <w:r>
+        <w:t>Three scalar functions support the stored procedures.</w:t>
+      </w:r>
+    </w:p>
+    <w:p>
+      <w:pPr>
+        <w:pStyle w:val="ListParagraph"/>
+        <w:numPr>
+          <w:ilvl w:val="0"/>
+          <w:numId w:val="10"/>
+        </w:numPr>
+        <w:rPr>
+          <w:b/>
+          <w:bCs/>
+        </w:rPr>
+      </w:pPr>
+      <w:proofErr w:type="spellStart"/>
+      <w:r>
+        <w:rPr>
+          <w:b/>
+          <w:bCs/>
+        </w:rPr>
+        <w:t>fn_GetConfigValue</w:t>
+      </w:r>
+      <w:proofErr w:type="spellEnd"/>
+      <w:r>
+        <w:rPr>
+          <w:b/>
+          <w:bCs/>
+        </w:rPr>
+        <w:t xml:space="preserve"> </w:t>
+      </w:r>
+    </w:p>
+    <w:p>
+      <w:pPr>
+        <w:pStyle w:val="ListParagraph"/>
+        <w:numPr>
+          <w:ilvl w:val="1"/>
+          <w:numId w:val="10"/>
+        </w:numPr>
+      </w:pPr>
+      <w:r>
+        <w:t xml:space="preserve">takes a setting name </w:t>
+      </w:r>
+    </w:p>
+    <w:p>
+      <w:pPr>
+        <w:pStyle w:val="ListParagraph"/>
+        <w:numPr>
+          <w:ilvl w:val="1"/>
+          <w:numId w:val="10"/>
+        </w:numPr>
+      </w:pPr>
+      <w:r>
+        <w:t xml:space="preserve">returns its value from the Configuration table. </w:t>
+      </w:r>
+    </w:p>
+    <w:p>
+      <w:pPr>
+        <w:pStyle w:val="ListParagraph"/>
+        <w:numPr>
+          <w:ilvl w:val="0"/>
+          <w:numId w:val="10"/>
+        </w:numPr>
+      </w:pPr>
+      <w:proofErr w:type="spellStart"/>
+      <w:r>
+        <w:rPr>
+          <w:b/>
+          <w:bCs/>
+        </w:rPr>
+        <w:t>fn_GetBuildTime</w:t>
+      </w:r>
+      <w:proofErr w:type="spellEnd"/>
+      <w:r>
+        <w:t xml:space="preserve"> </w:t>
+      </w:r>
+    </w:p>
+    <w:p>
+      <w:pPr>
+        <w:pStyle w:val="ListParagraph"/>
+        <w:numPr>
+          <w:ilvl w:val="1"/>
+          <w:numId w:val="10"/>
+        </w:numPr>
+      </w:pPr>
+      <w:r>
+        <w:t xml:space="preserve">accepts a skill level and a pre-computed random seed between 0.0 and 1.0 </w:t>
+      </w:r>
+    </w:p>
+    <w:p>
+      <w:pPr>
+        <w:pStyle w:val="ListParagraph"/>
+        <w:numPr>
+          <w:ilvl w:val="1"/>
+          <w:numId w:val="10"/>
+        </w:numPr>
+      </w:pPr>
+      <w:r>
+        <w:t xml:space="preserve">returns a build time mapped linearly across the configured variance range around the base time for that skill. </w:t>
+      </w:r>
+    </w:p>
+    <w:p>
+      <w:pPr>
+        <w:pStyle w:val="ListParagraph"/>
+        <w:numPr>
+          <w:ilvl w:val="0"/>
+          <w:numId w:val="10"/>
+        </w:numPr>
+      </w:pPr>
+      <w:proofErr w:type="spellStart"/>
+      <w:r>
+        <w:rPr>
+          <w:b/>
+          <w:bCs/>
+        </w:rPr>
+        <w:t>fn_GetDefectRate</w:t>
+      </w:r>
+      <w:proofErr w:type="spellEnd"/>
+      <w:r>
+        <w:t xml:space="preserve"> </w:t>
+      </w:r>
+    </w:p>
+    <w:p>
+      <w:pPr>
+        <w:pStyle w:val="ListParagraph"/>
+        <w:numPr>
+          <w:ilvl w:val="1"/>
+          <w:numId w:val="10"/>
+        </w:numPr>
+      </w:pPr>
+      <w:r>
+        <w:t>returns the configured defect percentage divided by 100, giving a fraction that can be compared directly to a random float.</w:t>
+      </w:r>
+    </w:p>
+    <w:p/>
+    <w:p/>
+    <w:p/>
+    <w:p/>
+    <w:p>
+      <w:r>
+        <w:lastRenderedPageBreak/>
+        <w:t xml:space="preserve">Three views simplify the C# data access layer. </w:t>
+      </w:r>
+    </w:p>
+    <w:p>
+      <w:proofErr w:type="spellStart"/>
+      <w:r>
+        <w:t>vw_WorkstationStatus</w:t>
+      </w:r>
+      <w:proofErr w:type="spellEnd"/>
+      <w:r>
+        <w:t xml:space="preserve"> joins Workstation, Worker, </w:t>
+      </w:r>
+      <w:proofErr w:type="spellStart"/>
+      <w:r>
+        <w:t>WorkstationBin</w:t>
+      </w:r>
+      <w:proofErr w:type="spellEnd"/>
+      <w:r>
+        <w:t>, and Part to produce one flat row per part per station, including</w:t>
+      </w:r>
+      <w:r>
+        <w:t>:</w:t>
+      </w:r>
+    </w:p>
+    <w:p>
+      <w:pPr>
+        <w:pStyle w:val="ListParagraph"/>
+        <w:numPr>
+          <w:ilvl w:val="0"/>
+          <w:numId w:val="11"/>
+        </w:numPr>
+      </w:pPr>
+      <w:r>
+        <w:t>the current quantity</w:t>
+      </w:r>
+    </w:p>
+    <w:p>
+      <w:pPr>
+        <w:pStyle w:val="ListParagraph"/>
+        <w:numPr>
+          <w:ilvl w:val="0"/>
+          <w:numId w:val="11"/>
+        </w:numPr>
+      </w:pPr>
+      <w:r>
+        <w:t xml:space="preserve">default capacity </w:t>
+      </w:r>
+    </w:p>
+    <w:p>
+      <w:pPr>
+        <w:pStyle w:val="ListParagraph"/>
+        <w:numPr>
+          <w:ilvl w:val="0"/>
+          <w:numId w:val="11"/>
+        </w:numPr>
+      </w:pPr>
+      <w:r>
+        <w:t xml:space="preserve">an </w:t>
+      </w:r>
+      <w:proofErr w:type="spellStart"/>
+      <w:r>
+        <w:t>isLowStock</w:t>
+      </w:r>
+      <w:proofErr w:type="spellEnd"/>
+      <w:r>
+        <w:t xml:space="preserve"> flag computed inline against the configuration threshold. </w:t>
+      </w:r>
+    </w:p>
+    <w:p>
+      <w:pPr>
+        <w:pStyle w:val="ListParagraph"/>
+      </w:pPr>
+    </w:p>
+    <w:p>
+      <w:proofErr w:type="spellStart"/>
+      <w:r>
+        <w:t>vw_ProductionSummary</w:t>
+      </w:r>
+      <w:proofErr w:type="spellEnd"/>
+      <w:r>
+        <w:t xml:space="preserve"> aggregates the entire </w:t>
+      </w:r>
+      <w:proofErr w:type="spellStart"/>
+      <w:r>
+        <w:t>ProductionLog</w:t>
+      </w:r>
+      <w:proofErr w:type="spellEnd"/>
+      <w:r>
+        <w:t xml:space="preserve"> to produce the Kanban board metrics: </w:t>
+      </w:r>
+    </w:p>
+    <w:p>
+      <w:pPr>
+        <w:pStyle w:val="ListParagraph"/>
+        <w:numPr>
+          <w:ilvl w:val="0"/>
+          <w:numId w:val="12"/>
+        </w:numPr>
+      </w:pPr>
+      <w:r>
+        <w:t>total produced</w:t>
+      </w:r>
+    </w:p>
+    <w:p>
+      <w:pPr>
+        <w:pStyle w:val="ListParagraph"/>
+        <w:numPr>
+          <w:ilvl w:val="0"/>
+          <w:numId w:val="12"/>
+        </w:numPr>
+      </w:pPr>
+      <w:r>
+        <w:t>total passed</w:t>
+      </w:r>
+    </w:p>
+    <w:p>
+      <w:pPr>
+        <w:pStyle w:val="ListParagraph"/>
+        <w:numPr>
+          <w:ilvl w:val="0"/>
+          <w:numId w:val="12"/>
+        </w:numPr>
+      </w:pPr>
+      <w:r>
+        <w:t xml:space="preserve">total failed </w:t>
+      </w:r>
+    </w:p>
+    <w:p>
+      <w:pPr>
+        <w:pStyle w:val="ListParagraph"/>
+        <w:numPr>
+          <w:ilvl w:val="0"/>
+          <w:numId w:val="12"/>
+        </w:numPr>
+      </w:pPr>
+      <w:r>
+        <w:t xml:space="preserve">yield percentage </w:t>
+      </w:r>
+    </w:p>
+    <w:p>
+      <w:pPr>
+        <w:pStyle w:val="ListParagraph"/>
+        <w:numPr>
+          <w:ilvl w:val="0"/>
+          <w:numId w:val="12"/>
+        </w:numPr>
+      </w:pPr>
+      <w:r>
+        <w:t xml:space="preserve">remaining order quantity. </w:t>
+      </w:r>
+    </w:p>
+    <w:p>
+      <w:pPr>
+        <w:pStyle w:val="ListParagraph"/>
+      </w:pPr>
+    </w:p>
+    <w:p>
+      <w:proofErr w:type="spellStart"/>
+      <w:r>
+        <w:t>vw_ActiveAlerts</w:t>
+      </w:r>
+      <w:proofErr w:type="spellEnd"/>
+      <w:r>
+        <w:t xml:space="preserve"> joins </w:t>
+      </w:r>
+      <w:proofErr w:type="spellStart"/>
+      <w:r>
+        <w:t>LowStockAlert</w:t>
+      </w:r>
+      <w:proofErr w:type="spellEnd"/>
+      <w:r>
+        <w:t xml:space="preserve"> with Workstation, Part, and </w:t>
+      </w:r>
+      <w:proofErr w:type="spellStart"/>
+      <w:r>
+        <w:t>WorkstationBin</w:t>
+      </w:r>
+      <w:proofErr w:type="spellEnd"/>
+      <w:r>
+        <w:t xml:space="preserve"> to produce actionable rows for the Runner Display, showing </w:t>
+      </w:r>
+    </w:p>
+    <w:p>
+      <w:pPr>
+        <w:pStyle w:val="ListParagraph"/>
+        <w:numPr>
+          <w:ilvl w:val="0"/>
+          <w:numId w:val="13"/>
+        </w:numPr>
+      </w:pPr>
+      <w:r>
+        <w:t xml:space="preserve">the live current quantity at query time </w:t>
+      </w:r>
+    </w:p>
+    <w:p>
+      <w:pPr>
+        <w:pStyle w:val="ListParagraph"/>
+        <w:numPr>
+          <w:ilvl w:val="0"/>
+          <w:numId w:val="13"/>
+        </w:numPr>
+      </w:pPr>
+      <w:r>
+        <w:t>the original alert timestamp.</w:t>
+      </w:r>
+    </w:p>
+    <w:p/>
+    <w:p>
+      <w:pPr>
+        <w:pStyle w:val="Heading2"/>
+        <w:shd w:val="clear" w:color="auto" w:fill="A5C9EB" w:themeFill="text2" w:themeFillTint="40"/>
+        <w:rPr>
+          <w:color w:val="auto"/>
+        </w:rPr>
+      </w:pPr>
+      <w:bookmarkStart w:id="12" w:name="_Toc227281524"/>
+      <w:r>
+        <w:rPr>
+          <w:color w:val="auto"/>
+        </w:rPr>
+        <w:t>Indices</w:t>
+      </w:r>
+      <w:bookmarkEnd w:id="12"/>
+    </w:p>
+    <w:p>
+      <w:r>
+        <w:t xml:space="preserve">Five non-clustered indices were added to support the read patterns of the visualization applications. </w:t>
+      </w:r>
+    </w:p>
+    <w:p>
+      <w:r>
+        <w:t>The P</w:t>
+      </w:r>
+      <w:proofErr w:type="spellStart"/>
+      <w:r>
+        <w:t>roductionLog</w:t>
+      </w:r>
+      <w:proofErr w:type="spellEnd"/>
+      <w:r>
+        <w:t xml:space="preserve"> table received three indices: </w:t>
+      </w:r>
+    </w:p>
+    <w:p>
+      <w:pPr>
+        <w:pStyle w:val="ListParagraph"/>
+        <w:numPr>
+          <w:ilvl w:val="0"/>
+          <w:numId w:val="14"/>
+        </w:numPr>
+      </w:pPr>
+      <w:r>
+        <w:t xml:space="preserve">one on </w:t>
+      </w:r>
+      <w:proofErr w:type="spellStart"/>
+      <w:r>
+        <w:t>stationID</w:t>
+      </w:r>
+      <w:proofErr w:type="spellEnd"/>
+      <w:r>
+        <w:t xml:space="preserve"> for per-station filtering </w:t>
+      </w:r>
+    </w:p>
+    <w:p>
+      <w:pPr>
+        <w:pStyle w:val="ListParagraph"/>
+        <w:numPr>
+          <w:ilvl w:val="0"/>
+          <w:numId w:val="14"/>
+        </w:numPr>
+      </w:pPr>
+      <w:r>
+        <w:t>one on timestamp for potential time-range queries</w:t>
+      </w:r>
+    </w:p>
+    <w:p>
+      <w:pPr>
+        <w:pStyle w:val="ListParagraph"/>
+        <w:numPr>
+          <w:ilvl w:val="0"/>
+          <w:numId w:val="14"/>
+        </w:numPr>
+      </w:pPr>
+      <w:r>
+        <w:t xml:space="preserve">one on </w:t>
+      </w:r>
+      <w:proofErr w:type="spellStart"/>
+      <w:r>
+        <w:t>passedQA</w:t>
+      </w:r>
+      <w:proofErr w:type="spellEnd"/>
+      <w:r>
+        <w:t xml:space="preserve"> with </w:t>
+      </w:r>
+      <w:proofErr w:type="spellStart"/>
+      <w:r>
+        <w:t>stationID</w:t>
+      </w:r>
+      <w:proofErr w:type="spellEnd"/>
+      <w:r>
+        <w:t xml:space="preserve"> and </w:t>
+      </w:r>
+      <w:proofErr w:type="spellStart"/>
+      <w:r>
+        <w:t>workerID</w:t>
+      </w:r>
+      <w:proofErr w:type="spellEnd"/>
+      <w:r>
+        <w:t xml:space="preserve"> as included columns to cover the yield calculation in </w:t>
+      </w:r>
+      <w:proofErr w:type="spellStart"/>
+      <w:r>
+        <w:t>vw_ProductionSummary</w:t>
+      </w:r>
+      <w:proofErr w:type="spellEnd"/>
+      <w:r>
+        <w:t xml:space="preserve"> without requiring a key lookup. </w:t>
+      </w:r>
+    </w:p>
+    <w:p>
+      <w:r>
+        <w:t xml:space="preserve">The </w:t>
+      </w:r>
+      <w:proofErr w:type="spellStart"/>
+      <w:r>
+        <w:t>WorkstationBin</w:t>
+      </w:r>
+      <w:proofErr w:type="spellEnd"/>
+      <w:r>
+        <w:t xml:space="preserve"> table received </w:t>
+      </w:r>
+    </w:p>
+    <w:p>
+      <w:pPr>
+        <w:pStyle w:val="ListParagraph"/>
+        <w:numPr>
+          <w:ilvl w:val="0"/>
+          <w:numId w:val="15"/>
+        </w:numPr>
+      </w:pPr>
+      <w:r>
+        <w:t xml:space="preserve">an index on </w:t>
+      </w:r>
+      <w:proofErr w:type="spellStart"/>
+      <w:r>
+        <w:t>stationID</w:t>
+      </w:r>
+      <w:proofErr w:type="spellEnd"/>
+      <w:r>
+        <w:t xml:space="preserve"> including </w:t>
+      </w:r>
+      <w:proofErr w:type="spellStart"/>
+      <w:r>
+        <w:t>partID</w:t>
+      </w:r>
+      <w:proofErr w:type="spellEnd"/>
+      <w:r>
+        <w:t xml:space="preserve">  </w:t>
+      </w:r>
+    </w:p>
+    <w:p>
+      <w:pPr>
+        <w:pStyle w:val="ListParagraph"/>
+        <w:numPr>
+          <w:ilvl w:val="0"/>
+          <w:numId w:val="15"/>
+        </w:numPr>
+      </w:pPr>
+      <w:proofErr w:type="spellStart"/>
+      <w:r>
+        <w:t>currentQuantity</w:t>
+      </w:r>
+      <w:proofErr w:type="spellEnd"/>
+    </w:p>
+    <w:p>
+      <w:pPr>
+        <w:pStyle w:val="ListParagraph"/>
+        <w:numPr>
+          <w:ilvl w:val="0"/>
+          <w:numId w:val="15"/>
+        </w:numPr>
+      </w:pPr>
+      <w:r>
+        <w:lastRenderedPageBreak/>
+        <w:t xml:space="preserve">allowing </w:t>
+      </w:r>
+      <w:proofErr w:type="spellStart"/>
+      <w:r>
+        <w:t>sp_BuildLamp</w:t>
+      </w:r>
+      <w:proofErr w:type="spellEnd"/>
+      <w:r>
+        <w:t xml:space="preserve"> to check bin levels and perform the decrement UPDATE without scanning the full table. </w:t>
+      </w:r>
+    </w:p>
+    <w:p>
+      <w:pPr>
+        <w:pStyle w:val="ListParagraph"/>
+      </w:pPr>
+    </w:p>
+    <w:p>
+      <w:r>
+        <w:t xml:space="preserve">The </w:t>
+      </w:r>
+      <w:proofErr w:type="spellStart"/>
+      <w:r>
+        <w:t>LowStockAlert</w:t>
+      </w:r>
+      <w:proofErr w:type="spellEnd"/>
+      <w:r>
+        <w:t xml:space="preserve"> table received </w:t>
+      </w:r>
+    </w:p>
+    <w:p>
+      <w:pPr>
+        <w:pStyle w:val="ListParagraph"/>
+        <w:numPr>
+          <w:ilvl w:val="0"/>
+          <w:numId w:val="16"/>
+        </w:numPr>
+      </w:pPr>
+      <w:r>
+        <w:t>a filtered index on (</w:t>
+      </w:r>
+      <w:proofErr w:type="spellStart"/>
+      <w:r>
+        <w:t>isResolved</w:t>
+      </w:r>
+      <w:proofErr w:type="spellEnd"/>
+      <w:r>
+        <w:t xml:space="preserve">, </w:t>
+      </w:r>
+      <w:proofErr w:type="spellStart"/>
+      <w:r>
+        <w:t>stationID</w:t>
+      </w:r>
+      <w:proofErr w:type="spellEnd"/>
+      <w:r>
+        <w:t xml:space="preserve">) WHERE </w:t>
+      </w:r>
+      <w:proofErr w:type="spellStart"/>
+      <w:r>
+        <w:t>isResolved</w:t>
+      </w:r>
+      <w:proofErr w:type="spellEnd"/>
+      <w:r>
+        <w:t xml:space="preserve"> = 0, so only active alerts are indexed; this keeps the index small and makes the Runner Display query fast regardless of how many resolved historical alerts accumulate over time.</w:t>
+      </w:r>
+    </w:p>
+    <w:p>
+      <w:pPr>
+        <w:pStyle w:val="Heading1"/>
+        <w:shd w:val="clear" w:color="auto" w:fill="D1D1D1" w:themeFill="background2" w:themeFillShade="E6"/>
+        <w:rPr>
+          <w:rFonts w:ascii="Aptos" w:hAnsi="Aptos"/>
+          <w:b/>
+          <w:bCs/>
+          <w:color w:val="000000" w:themeColor="text1"/>
+        </w:rPr>
+      </w:pPr>
+      <w:r>
+        <w:rPr>
+          <w:rFonts w:ascii="Aptos" w:hAnsi="Aptos"/>
+          <w:b/>
+          <w:bCs/>
+          <w:color w:val="000000" w:themeColor="text1"/>
+        </w:rPr>
+        <w:t xml:space="preserve">5. </w:t>
+      </w:r>
+      <w:r>
+        <w:rPr>
+          <w:rFonts w:ascii="Aptos" w:hAnsi="Aptos"/>
+          <w:b/>
+          <w:bCs/>
+          <w:color w:val="000000" w:themeColor="text1"/>
+        </w:rPr>
+        <w:t>APPLICATION IMPLEMENTATION</w:t>
+      </w:r>
+    </w:p>
+    <w:p>
+      <w:pPr>
+        <w:pStyle w:val="Heading2"/>
+        <w:shd w:val="clear" w:color="auto" w:fill="A5C9EB" w:themeFill="text2" w:themeFillTint="40"/>
+        <w:rPr>
+          <w:color w:val="auto"/>
+        </w:rPr>
+      </w:pPr>
+      <w:r>
+        <w:rPr>
+          <w:color w:val="auto"/>
+        </w:rPr>
+        <w:t>Application Implementation</w:t>
+      </w:r>
+    </w:p>
+    <w:p>
+      <w:r>
+        <w:t xml:space="preserve">All five programs target .NET 8.0-windows and use WPF for the graphical interface. </w:t>
+      </w:r>
+    </w:p>
+    <w:p>
+      <w:r>
+        <w:t xml:space="preserve">Each connects to </w:t>
+      </w:r>
+      <w:proofErr w:type="spellStart"/>
+      <w:r>
+        <w:t>FogLampAssemblyDB</w:t>
+      </w:r>
+      <w:proofErr w:type="spellEnd"/>
+      <w:r>
+        <w:t xml:space="preserve"> using Windows Authentication via the </w:t>
+      </w:r>
+      <w:proofErr w:type="spellStart"/>
+      <w:proofErr w:type="gramStart"/>
+      <w:r>
+        <w:t>System.Data.SqlClient</w:t>
+      </w:r>
+      <w:proofErr w:type="spellEnd"/>
+      <w:proofErr w:type="gramEnd"/>
+      <w:r>
+        <w:t xml:space="preserve"> NuGet package (version 4.9.1). </w:t>
+      </w:r>
+    </w:p>
+    <w:p>
+      <w:r>
+        <w:t xml:space="preserve">The connection string is declared as a named constant </w:t>
+      </w:r>
+      <w:proofErr w:type="spellStart"/>
+      <w:r>
+        <w:t>kConnectionString</w:t>
+      </w:r>
+      <w:proofErr w:type="spellEnd"/>
+      <w:r>
+        <w:t xml:space="preserve"> at the top of each </w:t>
+      </w:r>
+      <w:proofErr w:type="spellStart"/>
+      <w:r>
+        <w:t>MainWindow.xaml.cs</w:t>
+      </w:r>
+      <w:proofErr w:type="spellEnd"/>
+      <w:r>
+        <w:t xml:space="preserve"> file, making it trivial to update for a different SQL Server instance name or for a multi-machine deployment where the database server is on a separate computer.</w:t>
+      </w:r>
+    </w:p>
+    <w:p>
+      <w:pPr>
+        <w:pStyle w:val="Heading2"/>
+        <w:shd w:val="clear" w:color="auto" w:fill="A5C9EB" w:themeFill="text2" w:themeFillTint="40"/>
+        <w:rPr>
+          <w:color w:val="auto"/>
+        </w:rPr>
+      </w:pPr>
+      <w:r>
+        <w:rPr>
+          <w:color w:val="auto"/>
+        </w:rPr>
+        <w:t>Configuration Tool</w:t>
+      </w:r>
+    </w:p>
+    <w:p>
+      <w:r>
+        <w:t xml:space="preserve">The Configuration Tool is the simplest of the five programs but the first one a user needs. </w:t>
+      </w:r>
+    </w:p>
+    <w:p>
+      <w:pPr>
+        <w:pStyle w:val="ListParagraph"/>
+        <w:numPr>
+          <w:ilvl w:val="0"/>
+          <w:numId w:val="16"/>
+        </w:numPr>
+      </w:pPr>
+      <w:r>
+        <w:t xml:space="preserve">On startup it executes a SELECT against the Configuration table and fills a </w:t>
+      </w:r>
+      <w:proofErr w:type="spellStart"/>
+      <w:r>
+        <w:t>DataTable</w:t>
+      </w:r>
+      <w:proofErr w:type="spellEnd"/>
+      <w:r>
+        <w:t xml:space="preserve"> via </w:t>
+      </w:r>
+      <w:proofErr w:type="spellStart"/>
+      <w:r>
+        <w:t>SqlDataAdapter</w:t>
+      </w:r>
+      <w:proofErr w:type="spellEnd"/>
+      <w:r>
+        <w:t xml:space="preserve">. </w:t>
+      </w:r>
+    </w:p>
+    <w:p>
+      <w:pPr>
+        <w:pStyle w:val="ListParagraph"/>
+        <w:numPr>
+          <w:ilvl w:val="0"/>
+          <w:numId w:val="16"/>
+        </w:numPr>
+      </w:pPr>
+      <w:r>
+        <w:t xml:space="preserve">The </w:t>
+      </w:r>
+      <w:proofErr w:type="spellStart"/>
+      <w:r>
+        <w:t>DataTable</w:t>
+      </w:r>
+      <w:proofErr w:type="spellEnd"/>
+      <w:r>
+        <w:t xml:space="preserve"> is bound directly to a WPF DataGrid, making all rows immediately editable in-place. </w:t>
+      </w:r>
+    </w:p>
+    <w:p>
+      <w:pPr>
+        <w:pStyle w:val="ListParagraph"/>
+        <w:numPr>
+          <w:ilvl w:val="0"/>
+          <w:numId w:val="16"/>
+        </w:numPr>
+      </w:pPr>
+      <w:r>
+        <w:t xml:space="preserve">A </w:t>
+      </w:r>
+      <w:proofErr w:type="spellStart"/>
+      <w:r>
+        <w:t>SqlCommandBuilder</w:t>
+      </w:r>
+      <w:proofErr w:type="spellEnd"/>
+      <w:r>
+        <w:t xml:space="preserve"> generates the UPDATE command automatically from the SELECT statement, so clicking Save Changes calls </w:t>
+      </w:r>
+      <w:proofErr w:type="spellStart"/>
+      <w:r>
+        <w:t>dataAdapter.Update</w:t>
+      </w:r>
+      <w:proofErr w:type="spellEnd"/>
+      <w:r>
+        <w:t>(</w:t>
+      </w:r>
+      <w:proofErr w:type="spellStart"/>
+      <w:r>
+        <w:t>configTable</w:t>
+      </w:r>
+      <w:proofErr w:type="spellEnd"/>
+      <w:r>
+        <w:t xml:space="preserve">) and all modified rows are committed in a single operation. </w:t>
+      </w:r>
+    </w:p>
+    <w:p>
+      <w:pPr>
+        <w:pStyle w:val="ListParagraph"/>
+        <w:numPr>
+          <w:ilvl w:val="0"/>
+          <w:numId w:val="16"/>
+        </w:numPr>
+      </w:pPr>
+      <w:r>
+        <w:t xml:space="preserve">The </w:t>
+      </w:r>
+      <w:proofErr w:type="spellStart"/>
+      <w:r>
+        <w:t>configID</w:t>
+      </w:r>
+      <w:proofErr w:type="spellEnd"/>
+      <w:r>
+        <w:t xml:space="preserve"> column is set to </w:t>
+      </w:r>
+      <w:proofErr w:type="spellStart"/>
+      <w:r>
+        <w:t>ReadOnly</w:t>
+      </w:r>
+      <w:proofErr w:type="spellEnd"/>
+      <w:r>
+        <w:t xml:space="preserve"> = true in code to prevent accidental primary key modification. </w:t>
+      </w:r>
+    </w:p>
+    <w:p>
+      <w:pPr>
+        <w:pStyle w:val="ListParagraph"/>
+        <w:numPr>
+          <w:ilvl w:val="0"/>
+          <w:numId w:val="16"/>
+        </w:numPr>
+      </w:pPr>
+      <w:r>
+        <w:t xml:space="preserve">A Reset Simulation button calls </w:t>
+      </w:r>
+      <w:proofErr w:type="spellStart"/>
+      <w:r>
+        <w:t>sp_ResetSimulation</w:t>
+      </w:r>
+      <w:proofErr w:type="spellEnd"/>
+      <w:r>
+        <w:t xml:space="preserve"> after a Yes/No confirmation dialog, clearing all logs and restoring bin counts to their defaults.</w:t>
+      </w:r>
+    </w:p>
+    <w:p>
+      <w:pPr>
+        <w:pStyle w:val="Heading2"/>
+        <w:shd w:val="clear" w:color="auto" w:fill="A5C9EB" w:themeFill="text2" w:themeFillTint="40"/>
+        <w:rPr>
+          <w:color w:val="auto"/>
+        </w:rPr>
+      </w:pPr>
+      <w:r>
+        <w:rPr>
+          <w:color w:val="auto"/>
+        </w:rPr>
+        <w:t>Workstation Simulation</w:t>
+      </w:r>
+    </w:p>
+    <w:p>
+      <w:r>
+        <w:t xml:space="preserve">The Workstation Simulation is the most complex application. </w:t>
+      </w:r>
+    </w:p>
+    <w:p>
+      <w:r>
+        <w:lastRenderedPageBreak/>
+        <w:t xml:space="preserve">On start, the selected station ID is </w:t>
+      </w:r>
+      <w:proofErr w:type="gramStart"/>
+      <w:r>
+        <w:t>recorded</w:t>
+      </w:r>
+      <w:proofErr w:type="gramEnd"/>
+      <w:r>
+        <w:t xml:space="preserve"> and a background Thread is launched that loops indefinitely, calling </w:t>
+      </w:r>
+      <w:proofErr w:type="spellStart"/>
+      <w:r>
+        <w:t>sp_BuildLamp</w:t>
+      </w:r>
+      <w:proofErr w:type="spellEnd"/>
+      <w:r>
+        <w:t xml:space="preserve"> on each iteration. </w:t>
+      </w:r>
+    </w:p>
+    <w:p>
+      <w:r>
+        <w:t xml:space="preserve">The stored procedure returns three OUTPUT parameters: </w:t>
+      </w:r>
+    </w:p>
+    <w:p>
+      <w:pPr>
+        <w:pStyle w:val="ListParagraph"/>
+        <w:numPr>
+          <w:ilvl w:val="0"/>
+          <w:numId w:val="17"/>
+        </w:numPr>
+      </w:pPr>
+      <w:r>
+        <w:t>@built (0 or 1 indicating whether parts were available)</w:t>
+      </w:r>
+    </w:p>
+    <w:p>
+      <w:pPr>
+        <w:pStyle w:val="ListParagraph"/>
+        <w:numPr>
+          <w:ilvl w:val="0"/>
+          <w:numId w:val="17"/>
+        </w:numPr>
+      </w:pPr>
+      <w:r>
+        <w:t>@buildTime (the randomized assembly duration in seconds)</w:t>
+      </w:r>
+    </w:p>
+    <w:p>
+      <w:pPr>
+        <w:pStyle w:val="ListParagraph"/>
+        <w:numPr>
+          <w:ilvl w:val="0"/>
+          <w:numId w:val="17"/>
+        </w:numPr>
+      </w:pPr>
+      <w:r>
+        <w:t>@passed (the QA result).</w:t>
+      </w:r>
+    </w:p>
+    <w:p/>
+    <w:p>
+      <w:r>
+        <w:t xml:space="preserve">When @built = 1, </w:t>
+      </w:r>
+    </w:p>
+    <w:p>
+      <w:pPr>
+        <w:pStyle w:val="ListParagraph"/>
+        <w:numPr>
+          <w:ilvl w:val="0"/>
+          <w:numId w:val="18"/>
+        </w:numPr>
+      </w:pPr>
+      <w:r>
+        <w:t xml:space="preserve">the thread reads the </w:t>
+      </w:r>
+      <w:proofErr w:type="spellStart"/>
+      <w:r>
+        <w:t>TimeScaleMultiplier</w:t>
+      </w:r>
+      <w:proofErr w:type="spellEnd"/>
+      <w:r>
+        <w:t xml:space="preserve"> from the Configuration table </w:t>
+      </w:r>
+    </w:p>
+    <w:p>
+      <w:pPr>
+        <w:pStyle w:val="ListParagraph"/>
+        <w:numPr>
+          <w:ilvl w:val="0"/>
+          <w:numId w:val="18"/>
+        </w:numPr>
+      </w:pPr>
+      <w:r>
+        <w:t xml:space="preserve">calculates the real-world sleep duration as </w:t>
+      </w:r>
+      <w:proofErr w:type="spellStart"/>
+      <w:r>
+        <w:t>buildTime</w:t>
+      </w:r>
+      <w:proofErr w:type="spellEnd"/>
+      <w:r>
+        <w:t xml:space="preserve"> / </w:t>
+      </w:r>
+      <w:proofErr w:type="spellStart"/>
+      <w:r>
+        <w:t>timeScale</w:t>
+      </w:r>
+      <w:proofErr w:type="spellEnd"/>
+      <w:r>
+        <w:t xml:space="preserve"> * 1000 millisecond</w:t>
+      </w:r>
+      <w:r>
+        <w:t>s</w:t>
+      </w:r>
+      <w:r>
+        <w:t xml:space="preserve"> </w:t>
+      </w:r>
+    </w:p>
+    <w:p>
+      <w:pPr>
+        <w:pStyle w:val="ListParagraph"/>
+        <w:numPr>
+          <w:ilvl w:val="0"/>
+          <w:numId w:val="18"/>
+        </w:numPr>
+      </w:pPr>
+      <w:r>
+        <w:t xml:space="preserve">then arms the stopwatch by writing the current tick count and sleep duration to three shared fields before calling </w:t>
+      </w:r>
+      <w:proofErr w:type="spellStart"/>
+      <w:r>
+        <w:t>Thread.Sleep</w:t>
+      </w:r>
+      <w:proofErr w:type="spellEnd"/>
+      <w:r>
+        <w:t xml:space="preserve">. </w:t>
+      </w:r>
+    </w:p>
+    <w:p>
+      <w:pPr>
+        <w:pStyle w:val="ListParagraph"/>
+        <w:numPr>
+          <w:ilvl w:val="0"/>
+          <w:numId w:val="18"/>
+        </w:numPr>
+      </w:pPr>
+      <w:r>
+        <w:t>The lamp counter and result display are updated only after the sleep completes, not before it. This ordering ensures that no lamp is shown as produced until the full simulated assembly time has elapsed, correctly reflecting the physical process where packaging happens at the end of assembly rather than at the start.</w:t>
+      </w:r>
+    </w:p>
+    <w:p/>
+    <w:p>
+      <w:r>
+        <w:t xml:space="preserve">The stopwatch label and progress bar are driven by a separate </w:t>
+      </w:r>
+      <w:proofErr w:type="spellStart"/>
+      <w:r>
+        <w:t>DispatcherTimer</w:t>
+      </w:r>
+      <w:proofErr w:type="spellEnd"/>
+      <w:r>
+        <w:t xml:space="preserve"> firing every 100 milliseconds on the UI thread. </w:t>
+      </w:r>
+    </w:p>
+    <w:p>
+      <w:r>
+        <w:t>On each tick</w:t>
+      </w:r>
+      <w:r>
+        <w:t>:</w:t>
+      </w:r>
+      <w:r>
+        <w:t xml:space="preserve"> </w:t>
+      </w:r>
+    </w:p>
+    <w:p>
+      <w:pPr>
+        <w:pStyle w:val="ListParagraph"/>
+        <w:numPr>
+          <w:ilvl w:val="0"/>
+          <w:numId w:val="19"/>
+        </w:numPr>
+      </w:pPr>
+      <w:r>
+        <w:t xml:space="preserve">it reads the shared state to compute elapsed milliseconds </w:t>
+      </w:r>
+    </w:p>
+    <w:p>
+      <w:pPr>
+        <w:pStyle w:val="ListParagraph"/>
+        <w:numPr>
+          <w:ilvl w:val="0"/>
+          <w:numId w:val="19"/>
+        </w:numPr>
+      </w:pPr>
+      <w:r>
+        <w:t xml:space="preserve">formats the result as </w:t>
+      </w:r>
+      <w:proofErr w:type="gramStart"/>
+      <w:r>
+        <w:t>M:SS.cc</w:t>
+      </w:r>
+      <w:proofErr w:type="gramEnd"/>
+      <w:r>
+        <w:t xml:space="preserve"> </w:t>
+      </w:r>
+    </w:p>
+    <w:p>
+      <w:pPr>
+        <w:pStyle w:val="ListParagraph"/>
+        <w:numPr>
+          <w:ilvl w:val="0"/>
+          <w:numId w:val="19"/>
+        </w:numPr>
+      </w:pPr>
+      <w:r>
+        <w:t xml:space="preserve">updates the progress bar from 0 to 100 percent </w:t>
+      </w:r>
+    </w:p>
+    <w:p>
+      <w:pPr>
+        <w:pStyle w:val="ListParagraph"/>
+        <w:numPr>
+          <w:ilvl w:val="0"/>
+          <w:numId w:val="19"/>
+        </w:numPr>
+      </w:pPr>
+      <w:r>
+        <w:t xml:space="preserve">transitions the bar color from green to amber when the build is 85 percent complete. </w:t>
+      </w:r>
+    </w:p>
+    <w:p>
+      <w:r>
+        <w:t>When the station is in a Blocked state the timer shows BLOCKED in the stopwatch field and holds the progress bar at zero with an orange-red foreground to visually distinguish stalling from normal assembly.</w:t>
+      </w:r>
+    </w:p>
+    <w:p/>
+    <w:p/>
+    <w:p/>
+    <w:p>
+      <w:pPr>
+        <w:pStyle w:val="Heading2"/>
+        <w:shd w:val="clear" w:color="auto" w:fill="A5C9EB" w:themeFill="text2" w:themeFillTint="40"/>
+        <w:rPr>
+          <w:color w:val="auto"/>
+        </w:rPr>
+      </w:pPr>
+      <w:r>
+        <w:rPr>
+          <w:color w:val="auto"/>
+        </w:rPr>
+        <w:lastRenderedPageBreak/>
+        <w:t>Workstation Andon Display</w:t>
+      </w:r>
+    </w:p>
+    <w:p>
+      <w:r>
+        <w:t xml:space="preserve">The Workstation Andon Display uses a </w:t>
+      </w:r>
+      <w:proofErr w:type="spellStart"/>
+      <w:r>
+        <w:t>DispatcherTimer</w:t>
+      </w:r>
+      <w:proofErr w:type="spellEnd"/>
+      <w:r>
+        <w:t xml:space="preserve"> to poll </w:t>
+      </w:r>
+      <w:proofErr w:type="spellStart"/>
+      <w:r>
+        <w:t>vw_WorkstationStatus</w:t>
+      </w:r>
+      <w:proofErr w:type="spellEnd"/>
+      <w:r>
+        <w:t xml:space="preserve"> for a user-selected station every two seconds. </w:t>
+      </w:r>
+    </w:p>
+    <w:p>
+      <w:r>
+        <w:t>Each poll returns</w:t>
+      </w:r>
+      <w:r>
+        <w:t>:</w:t>
+      </w:r>
+    </w:p>
+    <w:p>
+      <w:pPr>
+        <w:pStyle w:val="ListParagraph"/>
+        <w:numPr>
+          <w:ilvl w:val="0"/>
+          <w:numId w:val="20"/>
+        </w:numPr>
+      </w:pPr>
+      <w:r>
+        <w:t>six rows (one per part) and assigns them to the DataGrid</w:t>
+      </w:r>
+      <w:r>
+        <w:t>’</w:t>
+      </w:r>
+      <w:r>
+        <w:t>s I</w:t>
+      </w:r>
+      <w:proofErr w:type="spellStart"/>
+      <w:r>
+        <w:t>temsSource</w:t>
+      </w:r>
+      <w:proofErr w:type="spellEnd"/>
+      <w:r>
+        <w:t xml:space="preserve"> as a new List. </w:t>
+      </w:r>
+    </w:p>
+    <w:p>
+      <w:pPr>
+        <w:pStyle w:val="ListParagraph"/>
+        <w:ind w:left="765"/>
+      </w:pPr>
+    </w:p>
+    <w:p>
+      <w:r>
+        <w:t xml:space="preserve">A </w:t>
+      </w:r>
+      <w:proofErr w:type="spellStart"/>
+      <w:r>
+        <w:t>DataTrigger</w:t>
+      </w:r>
+      <w:proofErr w:type="spellEnd"/>
+      <w:r>
+        <w:t xml:space="preserve"> in the row style sets the row background to red and the text to white whenever the </w:t>
+      </w:r>
+      <w:proofErr w:type="spellStart"/>
+      <w:r>
+        <w:t>IsLow</w:t>
+      </w:r>
+      <w:proofErr w:type="spellEnd"/>
+      <w:r>
+        <w:t xml:space="preserve"> property is true, giving the assembler an immediate visual indication that a runner is needed. </w:t>
+      </w:r>
+    </w:p>
+    <w:p>
+      <w:r>
+        <w:t xml:space="preserve">Above the grid, </w:t>
+      </w:r>
+    </w:p>
+    <w:p>
+      <w:pPr>
+        <w:pStyle w:val="ListParagraph"/>
+        <w:numPr>
+          <w:ilvl w:val="0"/>
+          <w:numId w:val="20"/>
+        </w:numPr>
+      </w:pPr>
+      <w:r>
+        <w:t>a red banner reading RUNNER NEEDED</w:t>
+      </w:r>
+      <w:r>
+        <w:t>!</w:t>
+      </w:r>
+      <w:r>
+        <w:t xml:space="preserve"> BIN LOW is shown or collapsed based on whether any part in the current refresh reports </w:t>
+      </w:r>
+      <w:proofErr w:type="spellStart"/>
+      <w:r>
+        <w:t>IsLow</w:t>
+      </w:r>
+      <w:proofErr w:type="spellEnd"/>
+      <w:r>
+        <w:t xml:space="preserve">. </w:t>
+      </w:r>
+    </w:p>
+    <w:p>
+      <w:pPr>
+        <w:pStyle w:val="ListParagraph"/>
+        <w:numPr>
+          <w:ilvl w:val="0"/>
+          <w:numId w:val="20"/>
+        </w:numPr>
+      </w:pPr>
+      <w:r>
+        <w:t>The station status label turns red for Blocked and green for Running. The application is designed to run as multiple instances simultaneously, with one instance per active workstation, each monitoring its own station through the dropdown selector.</w:t>
+      </w:r>
+    </w:p>
     <w:sectPr>
       <w:pgSz w:w="12240" w:h="15840"/>
       <w:pgMar w:top="1440" w:right="1440" w:bottom="1440" w:left="1440" w:header="708" w:footer="708" w:gutter="0"/>
@@ -1076,6 +3473,232 @@
 <file path=word/numbering.xml><?xml version="1.0" encoding="utf-8"?>
 <w:numbering xmlns:wpc="http://schemas.microsoft.com/office/word/2010/wordprocessingCanvas" xmlns:cx="http://schemas.microsoft.com/office/drawing/2014/chartex" xmlns:cx1="http://schemas.microsoft.com/office/drawing/2015/9/8/chartex" xmlns:cx2="http://schemas.microsoft.com/office/drawing/2015/10/21/chartex" xmlns:cx3="http://schemas.microsoft.com/office/drawing/2016/5/9/chartex" xmlns:cx4="http://schemas.microsoft.com/office/drawing/2016/5/10/chartex" xmlns:cx5="http://schemas.microsoft.com/office/drawing/2016/5/11/chartex" xmlns:cx6="http://schemas.microsoft.com/office/drawing/2016/5/12/chartex" xmlns:cx7="http://schemas.microsoft.com/office/drawing/2016/5/13/chartex" xmlns:cx8="http://schemas.microsoft.com/office/drawing/2016/5/14/chartex" xmlns:mc="http://schemas.openxmlformats.org/markup-compatibility/2006" xmlns:aink="http://schemas.microsoft.com/office/drawing/2016/ink" xmlns:am3d="http://schemas.microsoft.com/office/drawing/2017/model3d" xmlns:o="urn:schemas-microsoft-com:office:office" xmlns:oel="http://schemas.microsoft.com/office/2019/extlst" xmlns:r="http://schemas.openxmlformats.org/officeDocument/2006/relationships" xmlns:m="http://schemas.openxmlformats.org/officeDocument/2006/math" xmlns:v="urn:schemas-microsoft-com:vml" xmlns:wp14="http://schemas.microsoft.com/office/word/2010/wordprocessingDrawing" xmlns:wp="http://schemas.openxmlformats.org/drawingml/2006/wordprocessingDrawing" xmlns:w10="urn:schemas-microsoft-com:office:word" xmlns:w="http://schemas.openxmlformats.org/wordprocessingml/2006/main" xmlns:w14="http://schemas.microsoft.com/office/word/2010/wordml" xmlns:w15="http://schemas.microsoft.com/office/word/2012/wordml" xmlns:w16cex="http://schemas.microsoft.com/office/word/2018/wordml/cex" xmlns:w16cid="http://schemas.microsoft.com/office/word/2016/wordml/cid" xmlns:w16="http://schemas.microsoft.com/office/word/2018/wordml" xmlns:w16du="http://schemas.microsoft.com/office/word/2023/wordml/word16du" xmlns:w16sdtdh="http://schemas.microsoft.com/office/word/2020/wordml/sdtdatahash" xmlns:w16sdtfl="http://schemas.microsoft.com/office/word/2024/wordml/sdtformatlock" xmlns:w16se="http://schemas.microsoft.com/office/word/2015/wordml/symex" xmlns:wpg="http://schemas.microsoft.com/office/word/2010/wordprocessingGroup" xmlns:wpi="http://schemas.microsoft.com/office/word/2010/wordprocessingInk" xmlns:wne="http://schemas.microsoft.com/office/word/2006/wordml" xmlns:wps="http://schemas.microsoft.com/office/word/2010/wordprocessingShape" mc:Ignorable="w14 w15 w16se w16cid w16 w16cex w16sdtdh w16sdtfl w16du wp14">
   <w:abstractNum w:abstractNumId="0" w15:restartNumberingAfterBreak="0">
+    <w:nsid w:val="0A03566E"/>
+    <w:multiLevelType w:val="hybridMultilevel"/>
+    <w:tmpl w:val="A726C8E0"/>
+    <w:lvl w:ilvl="0" w:tplc="10090003">
+      <w:start w:val="1"/>
+      <w:numFmt w:val="bullet"/>
+      <w:lvlText w:val="o"/>
+      <w:lvlJc w:val="left"/>
+      <w:pPr>
+        <w:ind w:left="765" w:hanging="360"/>
+      </w:pPr>
+      <w:rPr>
+        <w:rFonts w:ascii="Courier New" w:hAnsi="Courier New" w:cs="Courier New" w:hint="default"/>
+      </w:rPr>
+    </w:lvl>
+    <w:lvl w:ilvl="1" w:tplc="10090003" w:tentative="1">
+      <w:start w:val="1"/>
+      <w:numFmt w:val="bullet"/>
+      <w:lvlText w:val="o"/>
+      <w:lvlJc w:val="left"/>
+      <w:pPr>
+        <w:ind w:left="1485" w:hanging="360"/>
+      </w:pPr>
+      <w:rPr>
+        <w:rFonts w:ascii="Courier New" w:hAnsi="Courier New" w:cs="Courier New" w:hint="default"/>
+      </w:rPr>
+    </w:lvl>
+    <w:lvl w:ilvl="2" w:tplc="10090005" w:tentative="1">
+      <w:start w:val="1"/>
+      <w:numFmt w:val="bullet"/>
+      <w:lvlText w:val=""/>
+      <w:lvlJc w:val="left"/>
+      <w:pPr>
+        <w:ind w:left="2205" w:hanging="360"/>
+      </w:pPr>
+      <w:rPr>
+        <w:rFonts w:ascii="Wingdings" w:hAnsi="Wingdings" w:hint="default"/>
+      </w:rPr>
+    </w:lvl>
+    <w:lvl w:ilvl="3" w:tplc="10090001" w:tentative="1">
+      <w:start w:val="1"/>
+      <w:numFmt w:val="bullet"/>
+      <w:lvlText w:val=""/>
+      <w:lvlJc w:val="left"/>
+      <w:pPr>
+        <w:ind w:left="2925" w:hanging="360"/>
+      </w:pPr>
+      <w:rPr>
+        <w:rFonts w:ascii="Symbol" w:hAnsi="Symbol" w:hint="default"/>
+      </w:rPr>
+    </w:lvl>
+    <w:lvl w:ilvl="4" w:tplc="10090003" w:tentative="1">
+      <w:start w:val="1"/>
+      <w:numFmt w:val="bullet"/>
+      <w:lvlText w:val="o"/>
+      <w:lvlJc w:val="left"/>
+      <w:pPr>
+        <w:ind w:left="3645" w:hanging="360"/>
+      </w:pPr>
+      <w:rPr>
+        <w:rFonts w:ascii="Courier New" w:hAnsi="Courier New" w:cs="Courier New" w:hint="default"/>
+      </w:rPr>
+    </w:lvl>
+    <w:lvl w:ilvl="5" w:tplc="10090005" w:tentative="1">
+      <w:start w:val="1"/>
+      <w:numFmt w:val="bullet"/>
+      <w:lvlText w:val=""/>
+      <w:lvlJc w:val="left"/>
+      <w:pPr>
+        <w:ind w:left="4365" w:hanging="360"/>
+      </w:pPr>
+      <w:rPr>
+        <w:rFonts w:ascii="Wingdings" w:hAnsi="Wingdings" w:hint="default"/>
+      </w:rPr>
+    </w:lvl>
+    <w:lvl w:ilvl="6" w:tplc="10090001" w:tentative="1">
+      <w:start w:val="1"/>
+      <w:numFmt w:val="bullet"/>
+      <w:lvlText w:val=""/>
+      <w:lvlJc w:val="left"/>
+      <w:pPr>
+        <w:ind w:left="5085" w:hanging="360"/>
+      </w:pPr>
+      <w:rPr>
+        <w:rFonts w:ascii="Symbol" w:hAnsi="Symbol" w:hint="default"/>
+      </w:rPr>
+    </w:lvl>
+    <w:lvl w:ilvl="7" w:tplc="10090003" w:tentative="1">
+      <w:start w:val="1"/>
+      <w:numFmt w:val="bullet"/>
+      <w:lvlText w:val="o"/>
+      <w:lvlJc w:val="left"/>
+      <w:pPr>
+        <w:ind w:left="5805" w:hanging="360"/>
+      </w:pPr>
+      <w:rPr>
+        <w:rFonts w:ascii="Courier New" w:hAnsi="Courier New" w:cs="Courier New" w:hint="default"/>
+      </w:rPr>
+    </w:lvl>
+    <w:lvl w:ilvl="8" w:tplc="10090005" w:tentative="1">
+      <w:start w:val="1"/>
+      <w:numFmt w:val="bullet"/>
+      <w:lvlText w:val=""/>
+      <w:lvlJc w:val="left"/>
+      <w:pPr>
+        <w:ind w:left="6525" w:hanging="360"/>
+      </w:pPr>
+      <w:rPr>
+        <w:rFonts w:ascii="Wingdings" w:hAnsi="Wingdings" w:hint="default"/>
+      </w:rPr>
+    </w:lvl>
+  </w:abstractNum>
+  <w:abstractNum w:abstractNumId="1" w15:restartNumberingAfterBreak="0">
+    <w:nsid w:val="0D7335B5"/>
+    <w:multiLevelType w:val="hybridMultilevel"/>
+    <w:tmpl w:val="63D414C8"/>
+    <w:lvl w:ilvl="0" w:tplc="10090001">
+      <w:start w:val="1"/>
+      <w:numFmt w:val="bullet"/>
+      <w:lvlText w:val=""/>
+      <w:lvlJc w:val="left"/>
+      <w:pPr>
+        <w:ind w:left="720" w:hanging="360"/>
+      </w:pPr>
+      <w:rPr>
+        <w:rFonts w:ascii="Symbol" w:hAnsi="Symbol" w:hint="default"/>
+      </w:rPr>
+    </w:lvl>
+    <w:lvl w:ilvl="1" w:tplc="10090003" w:tentative="1">
+      <w:start w:val="1"/>
+      <w:numFmt w:val="bullet"/>
+      <w:lvlText w:val="o"/>
+      <w:lvlJc w:val="left"/>
+      <w:pPr>
+        <w:ind w:left="1440" w:hanging="360"/>
+      </w:pPr>
+      <w:rPr>
+        <w:rFonts w:ascii="Courier New" w:hAnsi="Courier New" w:cs="Courier New" w:hint="default"/>
+      </w:rPr>
+    </w:lvl>
+    <w:lvl w:ilvl="2" w:tplc="10090005" w:tentative="1">
+      <w:start w:val="1"/>
+      <w:numFmt w:val="bullet"/>
+      <w:lvlText w:val=""/>
+      <w:lvlJc w:val="left"/>
+      <w:pPr>
+        <w:ind w:left="2160" w:hanging="360"/>
+      </w:pPr>
+      <w:rPr>
+        <w:rFonts w:ascii="Wingdings" w:hAnsi="Wingdings" w:hint="default"/>
+      </w:rPr>
+    </w:lvl>
+    <w:lvl w:ilvl="3" w:tplc="10090001" w:tentative="1">
+      <w:start w:val="1"/>
+      <w:numFmt w:val="bullet"/>
+      <w:lvlText w:val=""/>
+      <w:lvlJc w:val="left"/>
+      <w:pPr>
+        <w:ind w:left="2880" w:hanging="360"/>
+      </w:pPr>
+      <w:rPr>
+        <w:rFonts w:ascii="Symbol" w:hAnsi="Symbol" w:hint="default"/>
+      </w:rPr>
+    </w:lvl>
+    <w:lvl w:ilvl="4" w:tplc="10090003" w:tentative="1">
+      <w:start w:val="1"/>
+      <w:numFmt w:val="bullet"/>
+      <w:lvlText w:val="o"/>
+      <w:lvlJc w:val="left"/>
+      <w:pPr>
+        <w:ind w:left="3600" w:hanging="360"/>
+      </w:pPr>
+      <w:rPr>
+        <w:rFonts w:ascii="Courier New" w:hAnsi="Courier New" w:cs="Courier New" w:hint="default"/>
+      </w:rPr>
+    </w:lvl>
+    <w:lvl w:ilvl="5" w:tplc="10090005" w:tentative="1">
+      <w:start w:val="1"/>
+      <w:numFmt w:val="bullet"/>
+      <w:lvlText w:val=""/>
+      <w:lvlJc w:val="left"/>
+      <w:pPr>
+        <w:ind w:left="4320" w:hanging="360"/>
+      </w:pPr>
+      <w:rPr>
+        <w:rFonts w:ascii="Wingdings" w:hAnsi="Wingdings" w:hint="default"/>
+      </w:rPr>
+    </w:lvl>
+    <w:lvl w:ilvl="6" w:tplc="10090001" w:tentative="1">
+      <w:start w:val="1"/>
+      <w:numFmt w:val="bullet"/>
+      <w:lvlText w:val=""/>
+      <w:lvlJc w:val="left"/>
+      <w:pPr>
+        <w:ind w:left="5040" w:hanging="360"/>
+      </w:pPr>
+      <w:rPr>
+        <w:rFonts w:ascii="Symbol" w:hAnsi="Symbol" w:hint="default"/>
+      </w:rPr>
+    </w:lvl>
+    <w:lvl w:ilvl="7" w:tplc="10090003" w:tentative="1">
+      <w:start w:val="1"/>
+      <w:numFmt w:val="bullet"/>
+      <w:lvlText w:val="o"/>
+      <w:lvlJc w:val="left"/>
+      <w:pPr>
+        <w:ind w:left="5760" w:hanging="360"/>
+      </w:pPr>
+      <w:rPr>
+        <w:rFonts w:ascii="Courier New" w:hAnsi="Courier New" w:cs="Courier New" w:hint="default"/>
+      </w:rPr>
+    </w:lvl>
+    <w:lvl w:ilvl="8" w:tplc="10090005" w:tentative="1">
+      <w:start w:val="1"/>
+      <w:numFmt w:val="bullet"/>
+      <w:lvlText w:val=""/>
+      <w:lvlJc w:val="left"/>
+      <w:pPr>
+        <w:ind w:left="6480" w:hanging="360"/>
+      </w:pPr>
+      <w:rPr>
+        <w:rFonts w:ascii="Wingdings" w:hAnsi="Wingdings" w:hint="default"/>
+      </w:rPr>
+    </w:lvl>
+  </w:abstractNum>
+  <w:abstractNum w:abstractNumId="2" w15:restartNumberingAfterBreak="0">
     <w:nsid w:val="16113D9E"/>
     <w:multiLevelType w:val="multilevel"/>
     <w:tmpl w:val="173257E2"/>
@@ -1224,7 +3847,658 @@
       </w:rPr>
     </w:lvl>
   </w:abstractNum>
-  <w:abstractNum w:abstractNumId="1" w15:restartNumberingAfterBreak="0">
+  <w:abstractNum w:abstractNumId="3" w15:restartNumberingAfterBreak="0">
+    <w:nsid w:val="1C52253C"/>
+    <w:multiLevelType w:val="hybridMultilevel"/>
+    <w:tmpl w:val="E500C826"/>
+    <w:lvl w:ilvl="0" w:tplc="10090001">
+      <w:start w:val="1"/>
+      <w:numFmt w:val="bullet"/>
+      <w:lvlText w:val=""/>
+      <w:lvlJc w:val="left"/>
+      <w:pPr>
+        <w:ind w:left="720" w:hanging="360"/>
+      </w:pPr>
+      <w:rPr>
+        <w:rFonts w:ascii="Symbol" w:hAnsi="Symbol" w:hint="default"/>
+      </w:rPr>
+    </w:lvl>
+    <w:lvl w:ilvl="1" w:tplc="10090003">
+      <w:start w:val="1"/>
+      <w:numFmt w:val="bullet"/>
+      <w:lvlText w:val="o"/>
+      <w:lvlJc w:val="left"/>
+      <w:pPr>
+        <w:ind w:left="1440" w:hanging="360"/>
+      </w:pPr>
+      <w:rPr>
+        <w:rFonts w:ascii="Courier New" w:hAnsi="Courier New" w:cs="Courier New" w:hint="default"/>
+      </w:rPr>
+    </w:lvl>
+    <w:lvl w:ilvl="2" w:tplc="10090005">
+      <w:start w:val="1"/>
+      <w:numFmt w:val="bullet"/>
+      <w:lvlText w:val=""/>
+      <w:lvlJc w:val="left"/>
+      <w:pPr>
+        <w:ind w:left="2160" w:hanging="360"/>
+      </w:pPr>
+      <w:rPr>
+        <w:rFonts w:ascii="Wingdings" w:hAnsi="Wingdings" w:hint="default"/>
+      </w:rPr>
+    </w:lvl>
+    <w:lvl w:ilvl="3" w:tplc="10090001" w:tentative="1">
+      <w:start w:val="1"/>
+      <w:numFmt w:val="bullet"/>
+      <w:lvlText w:val=""/>
+      <w:lvlJc w:val="left"/>
+      <w:pPr>
+        <w:ind w:left="2880" w:hanging="360"/>
+      </w:pPr>
+      <w:rPr>
+        <w:rFonts w:ascii="Symbol" w:hAnsi="Symbol" w:hint="default"/>
+      </w:rPr>
+    </w:lvl>
+    <w:lvl w:ilvl="4" w:tplc="10090003" w:tentative="1">
+      <w:start w:val="1"/>
+      <w:numFmt w:val="bullet"/>
+      <w:lvlText w:val="o"/>
+      <w:lvlJc w:val="left"/>
+      <w:pPr>
+        <w:ind w:left="3600" w:hanging="360"/>
+      </w:pPr>
+      <w:rPr>
+        <w:rFonts w:ascii="Courier New" w:hAnsi="Courier New" w:cs="Courier New" w:hint="default"/>
+      </w:rPr>
+    </w:lvl>
+    <w:lvl w:ilvl="5" w:tplc="10090005" w:tentative="1">
+      <w:start w:val="1"/>
+      <w:numFmt w:val="bullet"/>
+      <w:lvlText w:val=""/>
+      <w:lvlJc w:val="left"/>
+      <w:pPr>
+        <w:ind w:left="4320" w:hanging="360"/>
+      </w:pPr>
+      <w:rPr>
+        <w:rFonts w:ascii="Wingdings" w:hAnsi="Wingdings" w:hint="default"/>
+      </w:rPr>
+    </w:lvl>
+    <w:lvl w:ilvl="6" w:tplc="10090001" w:tentative="1">
+      <w:start w:val="1"/>
+      <w:numFmt w:val="bullet"/>
+      <w:lvlText w:val=""/>
+      <w:lvlJc w:val="left"/>
+      <w:pPr>
+        <w:ind w:left="5040" w:hanging="360"/>
+      </w:pPr>
+      <w:rPr>
+        <w:rFonts w:ascii="Symbol" w:hAnsi="Symbol" w:hint="default"/>
+      </w:rPr>
+    </w:lvl>
+    <w:lvl w:ilvl="7" w:tplc="10090003" w:tentative="1">
+      <w:start w:val="1"/>
+      <w:numFmt w:val="bullet"/>
+      <w:lvlText w:val="o"/>
+      <w:lvlJc w:val="left"/>
+      <w:pPr>
+        <w:ind w:left="5760" w:hanging="360"/>
+      </w:pPr>
+      <w:rPr>
+        <w:rFonts w:ascii="Courier New" w:hAnsi="Courier New" w:cs="Courier New" w:hint="default"/>
+      </w:rPr>
+    </w:lvl>
+    <w:lvl w:ilvl="8" w:tplc="10090005" w:tentative="1">
+      <w:start w:val="1"/>
+      <w:numFmt w:val="bullet"/>
+      <w:lvlText w:val=""/>
+      <w:lvlJc w:val="left"/>
+      <w:pPr>
+        <w:ind w:left="6480" w:hanging="360"/>
+      </w:pPr>
+      <w:rPr>
+        <w:rFonts w:ascii="Wingdings" w:hAnsi="Wingdings" w:hint="default"/>
+      </w:rPr>
+    </w:lvl>
+  </w:abstractNum>
+  <w:abstractNum w:abstractNumId="4" w15:restartNumberingAfterBreak="0">
+    <w:nsid w:val="210459A6"/>
+    <w:multiLevelType w:val="hybridMultilevel"/>
+    <w:tmpl w:val="F7CA8148"/>
+    <w:lvl w:ilvl="0" w:tplc="10090003">
+      <w:start w:val="1"/>
+      <w:numFmt w:val="bullet"/>
+      <w:lvlText w:val="o"/>
+      <w:lvlJc w:val="left"/>
+      <w:pPr>
+        <w:ind w:left="720" w:hanging="360"/>
+      </w:pPr>
+      <w:rPr>
+        <w:rFonts w:ascii="Courier New" w:hAnsi="Courier New" w:cs="Courier New" w:hint="default"/>
+      </w:rPr>
+    </w:lvl>
+    <w:lvl w:ilvl="1" w:tplc="10090003" w:tentative="1">
+      <w:start w:val="1"/>
+      <w:numFmt w:val="bullet"/>
+      <w:lvlText w:val="o"/>
+      <w:lvlJc w:val="left"/>
+      <w:pPr>
+        <w:ind w:left="1440" w:hanging="360"/>
+      </w:pPr>
+      <w:rPr>
+        <w:rFonts w:ascii="Courier New" w:hAnsi="Courier New" w:cs="Courier New" w:hint="default"/>
+      </w:rPr>
+    </w:lvl>
+    <w:lvl w:ilvl="2" w:tplc="10090005" w:tentative="1">
+      <w:start w:val="1"/>
+      <w:numFmt w:val="bullet"/>
+      <w:lvlText w:val=""/>
+      <w:lvlJc w:val="left"/>
+      <w:pPr>
+        <w:ind w:left="2160" w:hanging="360"/>
+      </w:pPr>
+      <w:rPr>
+        <w:rFonts w:ascii="Wingdings" w:hAnsi="Wingdings" w:hint="default"/>
+      </w:rPr>
+    </w:lvl>
+    <w:lvl w:ilvl="3" w:tplc="10090001" w:tentative="1">
+      <w:start w:val="1"/>
+      <w:numFmt w:val="bullet"/>
+      <w:lvlText w:val=""/>
+      <w:lvlJc w:val="left"/>
+      <w:pPr>
+        <w:ind w:left="2880" w:hanging="360"/>
+      </w:pPr>
+      <w:rPr>
+        <w:rFonts w:ascii="Symbol" w:hAnsi="Symbol" w:hint="default"/>
+      </w:rPr>
+    </w:lvl>
+    <w:lvl w:ilvl="4" w:tplc="10090003" w:tentative="1">
+      <w:start w:val="1"/>
+      <w:numFmt w:val="bullet"/>
+      <w:lvlText w:val="o"/>
+      <w:lvlJc w:val="left"/>
+      <w:pPr>
+        <w:ind w:left="3600" w:hanging="360"/>
+      </w:pPr>
+      <w:rPr>
+        <w:rFonts w:ascii="Courier New" w:hAnsi="Courier New" w:cs="Courier New" w:hint="default"/>
+      </w:rPr>
+    </w:lvl>
+    <w:lvl w:ilvl="5" w:tplc="10090005" w:tentative="1">
+      <w:start w:val="1"/>
+      <w:numFmt w:val="bullet"/>
+      <w:lvlText w:val=""/>
+      <w:lvlJc w:val="left"/>
+      <w:pPr>
+        <w:ind w:left="4320" w:hanging="360"/>
+      </w:pPr>
+      <w:rPr>
+        <w:rFonts w:ascii="Wingdings" w:hAnsi="Wingdings" w:hint="default"/>
+      </w:rPr>
+    </w:lvl>
+    <w:lvl w:ilvl="6" w:tplc="10090001" w:tentative="1">
+      <w:start w:val="1"/>
+      <w:numFmt w:val="bullet"/>
+      <w:lvlText w:val=""/>
+      <w:lvlJc w:val="left"/>
+      <w:pPr>
+        <w:ind w:left="5040" w:hanging="360"/>
+      </w:pPr>
+      <w:rPr>
+        <w:rFonts w:ascii="Symbol" w:hAnsi="Symbol" w:hint="default"/>
+      </w:rPr>
+    </w:lvl>
+    <w:lvl w:ilvl="7" w:tplc="10090003" w:tentative="1">
+      <w:start w:val="1"/>
+      <w:numFmt w:val="bullet"/>
+      <w:lvlText w:val="o"/>
+      <w:lvlJc w:val="left"/>
+      <w:pPr>
+        <w:ind w:left="5760" w:hanging="360"/>
+      </w:pPr>
+      <w:rPr>
+        <w:rFonts w:ascii="Courier New" w:hAnsi="Courier New" w:cs="Courier New" w:hint="default"/>
+      </w:rPr>
+    </w:lvl>
+    <w:lvl w:ilvl="8" w:tplc="10090005" w:tentative="1">
+      <w:start w:val="1"/>
+      <w:numFmt w:val="bullet"/>
+      <w:lvlText w:val=""/>
+      <w:lvlJc w:val="left"/>
+      <w:pPr>
+        <w:ind w:left="6480" w:hanging="360"/>
+      </w:pPr>
+      <w:rPr>
+        <w:rFonts w:ascii="Wingdings" w:hAnsi="Wingdings" w:hint="default"/>
+      </w:rPr>
+    </w:lvl>
+  </w:abstractNum>
+  <w:abstractNum w:abstractNumId="5" w15:restartNumberingAfterBreak="0">
+    <w:nsid w:val="222930F1"/>
+    <w:multiLevelType w:val="hybridMultilevel"/>
+    <w:tmpl w:val="79AC3FAE"/>
+    <w:lvl w:ilvl="0" w:tplc="10090003">
+      <w:start w:val="1"/>
+      <w:numFmt w:val="bullet"/>
+      <w:lvlText w:val="o"/>
+      <w:lvlJc w:val="left"/>
+      <w:pPr>
+        <w:ind w:left="720" w:hanging="360"/>
+      </w:pPr>
+      <w:rPr>
+        <w:rFonts w:ascii="Courier New" w:hAnsi="Courier New" w:cs="Courier New" w:hint="default"/>
+      </w:rPr>
+    </w:lvl>
+    <w:lvl w:ilvl="1" w:tplc="10090003" w:tentative="1">
+      <w:start w:val="1"/>
+      <w:numFmt w:val="bullet"/>
+      <w:lvlText w:val="o"/>
+      <w:lvlJc w:val="left"/>
+      <w:pPr>
+        <w:ind w:left="1440" w:hanging="360"/>
+      </w:pPr>
+      <w:rPr>
+        <w:rFonts w:ascii="Courier New" w:hAnsi="Courier New" w:cs="Courier New" w:hint="default"/>
+      </w:rPr>
+    </w:lvl>
+    <w:lvl w:ilvl="2" w:tplc="10090005" w:tentative="1">
+      <w:start w:val="1"/>
+      <w:numFmt w:val="bullet"/>
+      <w:lvlText w:val=""/>
+      <w:lvlJc w:val="left"/>
+      <w:pPr>
+        <w:ind w:left="2160" w:hanging="360"/>
+      </w:pPr>
+      <w:rPr>
+        <w:rFonts w:ascii="Wingdings" w:hAnsi="Wingdings" w:hint="default"/>
+      </w:rPr>
+    </w:lvl>
+    <w:lvl w:ilvl="3" w:tplc="10090001" w:tentative="1">
+      <w:start w:val="1"/>
+      <w:numFmt w:val="bullet"/>
+      <w:lvlText w:val=""/>
+      <w:lvlJc w:val="left"/>
+      <w:pPr>
+        <w:ind w:left="2880" w:hanging="360"/>
+      </w:pPr>
+      <w:rPr>
+        <w:rFonts w:ascii="Symbol" w:hAnsi="Symbol" w:hint="default"/>
+      </w:rPr>
+    </w:lvl>
+    <w:lvl w:ilvl="4" w:tplc="10090003" w:tentative="1">
+      <w:start w:val="1"/>
+      <w:numFmt w:val="bullet"/>
+      <w:lvlText w:val="o"/>
+      <w:lvlJc w:val="left"/>
+      <w:pPr>
+        <w:ind w:left="3600" w:hanging="360"/>
+      </w:pPr>
+      <w:rPr>
+        <w:rFonts w:ascii="Courier New" w:hAnsi="Courier New" w:cs="Courier New" w:hint="default"/>
+      </w:rPr>
+    </w:lvl>
+    <w:lvl w:ilvl="5" w:tplc="10090005" w:tentative="1">
+      <w:start w:val="1"/>
+      <w:numFmt w:val="bullet"/>
+      <w:lvlText w:val=""/>
+      <w:lvlJc w:val="left"/>
+      <w:pPr>
+        <w:ind w:left="4320" w:hanging="360"/>
+      </w:pPr>
+      <w:rPr>
+        <w:rFonts w:ascii="Wingdings" w:hAnsi="Wingdings" w:hint="default"/>
+      </w:rPr>
+    </w:lvl>
+    <w:lvl w:ilvl="6" w:tplc="10090001" w:tentative="1">
+      <w:start w:val="1"/>
+      <w:numFmt w:val="bullet"/>
+      <w:lvlText w:val=""/>
+      <w:lvlJc w:val="left"/>
+      <w:pPr>
+        <w:ind w:left="5040" w:hanging="360"/>
+      </w:pPr>
+      <w:rPr>
+        <w:rFonts w:ascii="Symbol" w:hAnsi="Symbol" w:hint="default"/>
+      </w:rPr>
+    </w:lvl>
+    <w:lvl w:ilvl="7" w:tplc="10090003" w:tentative="1">
+      <w:start w:val="1"/>
+      <w:numFmt w:val="bullet"/>
+      <w:lvlText w:val="o"/>
+      <w:lvlJc w:val="left"/>
+      <w:pPr>
+        <w:ind w:left="5760" w:hanging="360"/>
+      </w:pPr>
+      <w:rPr>
+        <w:rFonts w:ascii="Courier New" w:hAnsi="Courier New" w:cs="Courier New" w:hint="default"/>
+      </w:rPr>
+    </w:lvl>
+    <w:lvl w:ilvl="8" w:tplc="10090005" w:tentative="1">
+      <w:start w:val="1"/>
+      <w:numFmt w:val="bullet"/>
+      <w:lvlText w:val=""/>
+      <w:lvlJc w:val="left"/>
+      <w:pPr>
+        <w:ind w:left="6480" w:hanging="360"/>
+      </w:pPr>
+      <w:rPr>
+        <w:rFonts w:ascii="Wingdings" w:hAnsi="Wingdings" w:hint="default"/>
+      </w:rPr>
+    </w:lvl>
+  </w:abstractNum>
+  <w:abstractNum w:abstractNumId="6" w15:restartNumberingAfterBreak="0">
+    <w:nsid w:val="2D183672"/>
+    <w:multiLevelType w:val="hybridMultilevel"/>
+    <w:tmpl w:val="EB384C80"/>
+    <w:lvl w:ilvl="0" w:tplc="1009000F">
+      <w:start w:val="1"/>
+      <w:numFmt w:val="decimal"/>
+      <w:lvlText w:val="%1."/>
+      <w:lvlJc w:val="left"/>
+      <w:pPr>
+        <w:ind w:left="720" w:hanging="360"/>
+      </w:pPr>
+    </w:lvl>
+    <w:lvl w:ilvl="1" w:tplc="10090019">
+      <w:start w:val="1"/>
+      <w:numFmt w:val="lowerLetter"/>
+      <w:lvlText w:val="%2."/>
+      <w:lvlJc w:val="left"/>
+      <w:pPr>
+        <w:ind w:left="1440" w:hanging="360"/>
+      </w:pPr>
+    </w:lvl>
+    <w:lvl w:ilvl="2" w:tplc="1009001B" w:tentative="1">
+      <w:start w:val="1"/>
+      <w:numFmt w:val="lowerRoman"/>
+      <w:lvlText w:val="%3."/>
+      <w:lvlJc w:val="right"/>
+      <w:pPr>
+        <w:ind w:left="2160" w:hanging="180"/>
+      </w:pPr>
+    </w:lvl>
+    <w:lvl w:ilvl="3" w:tplc="1009000F" w:tentative="1">
+      <w:start w:val="1"/>
+      <w:numFmt w:val="decimal"/>
+      <w:lvlText w:val="%4."/>
+      <w:lvlJc w:val="left"/>
+      <w:pPr>
+        <w:ind w:left="2880" w:hanging="360"/>
+      </w:pPr>
+    </w:lvl>
+    <w:lvl w:ilvl="4" w:tplc="10090019" w:tentative="1">
+      <w:start w:val="1"/>
+      <w:numFmt w:val="lowerLetter"/>
+      <w:lvlText w:val="%5."/>
+      <w:lvlJc w:val="left"/>
+      <w:pPr>
+        <w:ind w:left="3600" w:hanging="360"/>
+      </w:pPr>
+    </w:lvl>
+    <w:lvl w:ilvl="5" w:tplc="1009001B" w:tentative="1">
+      <w:start w:val="1"/>
+      <w:numFmt w:val="lowerRoman"/>
+      <w:lvlText w:val="%6."/>
+      <w:lvlJc w:val="right"/>
+      <w:pPr>
+        <w:ind w:left="4320" w:hanging="180"/>
+      </w:pPr>
+    </w:lvl>
+    <w:lvl w:ilvl="6" w:tplc="1009000F" w:tentative="1">
+      <w:start w:val="1"/>
+      <w:numFmt w:val="decimal"/>
+      <w:lvlText w:val="%7."/>
+      <w:lvlJc w:val="left"/>
+      <w:pPr>
+        <w:ind w:left="5040" w:hanging="360"/>
+      </w:pPr>
+    </w:lvl>
+    <w:lvl w:ilvl="7" w:tplc="10090019" w:tentative="1">
+      <w:start w:val="1"/>
+      <w:numFmt w:val="lowerLetter"/>
+      <w:lvlText w:val="%8."/>
+      <w:lvlJc w:val="left"/>
+      <w:pPr>
+        <w:ind w:left="5760" w:hanging="360"/>
+      </w:pPr>
+    </w:lvl>
+    <w:lvl w:ilvl="8" w:tplc="1009001B" w:tentative="1">
+      <w:start w:val="1"/>
+      <w:numFmt w:val="lowerRoman"/>
+      <w:lvlText w:val="%9."/>
+      <w:lvlJc w:val="right"/>
+      <w:pPr>
+        <w:ind w:left="6480" w:hanging="180"/>
+      </w:pPr>
+    </w:lvl>
+  </w:abstractNum>
+  <w:abstractNum w:abstractNumId="7" w15:restartNumberingAfterBreak="0">
+    <w:nsid w:val="406536A7"/>
+    <w:multiLevelType w:val="hybridMultilevel"/>
+    <w:tmpl w:val="B6F2FEAE"/>
+    <w:lvl w:ilvl="0" w:tplc="10090003">
+      <w:start w:val="1"/>
+      <w:numFmt w:val="bullet"/>
+      <w:lvlText w:val="o"/>
+      <w:lvlJc w:val="left"/>
+      <w:pPr>
+        <w:ind w:left="720" w:hanging="360"/>
+      </w:pPr>
+      <w:rPr>
+        <w:rFonts w:ascii="Courier New" w:hAnsi="Courier New" w:cs="Courier New" w:hint="default"/>
+      </w:rPr>
+    </w:lvl>
+    <w:lvl w:ilvl="1" w:tplc="10090003" w:tentative="1">
+      <w:start w:val="1"/>
+      <w:numFmt w:val="bullet"/>
+      <w:lvlText w:val="o"/>
+      <w:lvlJc w:val="left"/>
+      <w:pPr>
+        <w:ind w:left="1440" w:hanging="360"/>
+      </w:pPr>
+      <w:rPr>
+        <w:rFonts w:ascii="Courier New" w:hAnsi="Courier New" w:cs="Courier New" w:hint="default"/>
+      </w:rPr>
+    </w:lvl>
+    <w:lvl w:ilvl="2" w:tplc="10090005" w:tentative="1">
+      <w:start w:val="1"/>
+      <w:numFmt w:val="bullet"/>
+      <w:lvlText w:val=""/>
+      <w:lvlJc w:val="left"/>
+      <w:pPr>
+        <w:ind w:left="2160" w:hanging="360"/>
+      </w:pPr>
+      <w:rPr>
+        <w:rFonts w:ascii="Wingdings" w:hAnsi="Wingdings" w:hint="default"/>
+      </w:rPr>
+    </w:lvl>
+    <w:lvl w:ilvl="3" w:tplc="10090001" w:tentative="1">
+      <w:start w:val="1"/>
+      <w:numFmt w:val="bullet"/>
+      <w:lvlText w:val=""/>
+      <w:lvlJc w:val="left"/>
+      <w:pPr>
+        <w:ind w:left="2880" w:hanging="360"/>
+      </w:pPr>
+      <w:rPr>
+        <w:rFonts w:ascii="Symbol" w:hAnsi="Symbol" w:hint="default"/>
+      </w:rPr>
+    </w:lvl>
+    <w:lvl w:ilvl="4" w:tplc="10090003" w:tentative="1">
+      <w:start w:val="1"/>
+      <w:numFmt w:val="bullet"/>
+      <w:lvlText w:val="o"/>
+      <w:lvlJc w:val="left"/>
+      <w:pPr>
+        <w:ind w:left="3600" w:hanging="360"/>
+      </w:pPr>
+      <w:rPr>
+        <w:rFonts w:ascii="Courier New" w:hAnsi="Courier New" w:cs="Courier New" w:hint="default"/>
+      </w:rPr>
+    </w:lvl>
+    <w:lvl w:ilvl="5" w:tplc="10090005" w:tentative="1">
+      <w:start w:val="1"/>
+      <w:numFmt w:val="bullet"/>
+      <w:lvlText w:val=""/>
+      <w:lvlJc w:val="left"/>
+      <w:pPr>
+        <w:ind w:left="4320" w:hanging="360"/>
+      </w:pPr>
+      <w:rPr>
+        <w:rFonts w:ascii="Wingdings" w:hAnsi="Wingdings" w:hint="default"/>
+      </w:rPr>
+    </w:lvl>
+    <w:lvl w:ilvl="6" w:tplc="10090001" w:tentative="1">
+      <w:start w:val="1"/>
+      <w:numFmt w:val="bullet"/>
+      <w:lvlText w:val=""/>
+      <w:lvlJc w:val="left"/>
+      <w:pPr>
+        <w:ind w:left="5040" w:hanging="360"/>
+      </w:pPr>
+      <w:rPr>
+        <w:rFonts w:ascii="Symbol" w:hAnsi="Symbol" w:hint="default"/>
+      </w:rPr>
+    </w:lvl>
+    <w:lvl w:ilvl="7" w:tplc="10090003" w:tentative="1">
+      <w:start w:val="1"/>
+      <w:numFmt w:val="bullet"/>
+      <w:lvlText w:val="o"/>
+      <w:lvlJc w:val="left"/>
+      <w:pPr>
+        <w:ind w:left="5760" w:hanging="360"/>
+      </w:pPr>
+      <w:rPr>
+        <w:rFonts w:ascii="Courier New" w:hAnsi="Courier New" w:cs="Courier New" w:hint="default"/>
+      </w:rPr>
+    </w:lvl>
+    <w:lvl w:ilvl="8" w:tplc="10090005" w:tentative="1">
+      <w:start w:val="1"/>
+      <w:numFmt w:val="bullet"/>
+      <w:lvlText w:val=""/>
+      <w:lvlJc w:val="left"/>
+      <w:pPr>
+        <w:ind w:left="6480" w:hanging="360"/>
+      </w:pPr>
+      <w:rPr>
+        <w:rFonts w:ascii="Wingdings" w:hAnsi="Wingdings" w:hint="default"/>
+      </w:rPr>
+    </w:lvl>
+  </w:abstractNum>
+  <w:abstractNum w:abstractNumId="8" w15:restartNumberingAfterBreak="0">
+    <w:nsid w:val="49144844"/>
+    <w:multiLevelType w:val="hybridMultilevel"/>
+    <w:tmpl w:val="2394601C"/>
+    <w:lvl w:ilvl="0" w:tplc="10090003">
+      <w:start w:val="1"/>
+      <w:numFmt w:val="bullet"/>
+      <w:lvlText w:val="o"/>
+      <w:lvlJc w:val="left"/>
+      <w:pPr>
+        <w:ind w:left="720" w:hanging="360"/>
+      </w:pPr>
+      <w:rPr>
+        <w:rFonts w:ascii="Courier New" w:hAnsi="Courier New" w:cs="Courier New" w:hint="default"/>
+      </w:rPr>
+    </w:lvl>
+    <w:lvl w:ilvl="1" w:tplc="10090003" w:tentative="1">
+      <w:start w:val="1"/>
+      <w:numFmt w:val="bullet"/>
+      <w:lvlText w:val="o"/>
+      <w:lvlJc w:val="left"/>
+      <w:pPr>
+        <w:ind w:left="1440" w:hanging="360"/>
+      </w:pPr>
+      <w:rPr>
+        <w:rFonts w:ascii="Courier New" w:hAnsi="Courier New" w:cs="Courier New" w:hint="default"/>
+      </w:rPr>
+    </w:lvl>
+    <w:lvl w:ilvl="2" w:tplc="10090005" w:tentative="1">
+      <w:start w:val="1"/>
+      <w:numFmt w:val="bullet"/>
+      <w:lvlText w:val=""/>
+      <w:lvlJc w:val="left"/>
+      <w:pPr>
+        <w:ind w:left="2160" w:hanging="360"/>
+      </w:pPr>
+      <w:rPr>
+        <w:rFonts w:ascii="Wingdings" w:hAnsi="Wingdings" w:hint="default"/>
+      </w:rPr>
+    </w:lvl>
+    <w:lvl w:ilvl="3" w:tplc="10090001" w:tentative="1">
+      <w:start w:val="1"/>
+      <w:numFmt w:val="bullet"/>
+      <w:lvlText w:val=""/>
+      <w:lvlJc w:val="left"/>
+      <w:pPr>
+        <w:ind w:left="2880" w:hanging="360"/>
+      </w:pPr>
+      <w:rPr>
+        <w:rFonts w:ascii="Symbol" w:hAnsi="Symbol" w:hint="default"/>
+      </w:rPr>
+    </w:lvl>
+    <w:lvl w:ilvl="4" w:tplc="10090003" w:tentative="1">
+      <w:start w:val="1"/>
+      <w:numFmt w:val="bullet"/>
+      <w:lvlText w:val="o"/>
+      <w:lvlJc w:val="left"/>
+      <w:pPr>
+        <w:ind w:left="3600" w:hanging="360"/>
+      </w:pPr>
+      <w:rPr>
+        <w:rFonts w:ascii="Courier New" w:hAnsi="Courier New" w:cs="Courier New" w:hint="default"/>
+      </w:rPr>
+    </w:lvl>
+    <w:lvl w:ilvl="5" w:tplc="10090005" w:tentative="1">
+      <w:start w:val="1"/>
+      <w:numFmt w:val="bullet"/>
+      <w:lvlText w:val=""/>
+      <w:lvlJc w:val="left"/>
+      <w:pPr>
+        <w:ind w:left="4320" w:hanging="360"/>
+      </w:pPr>
+      <w:rPr>
+        <w:rFonts w:ascii="Wingdings" w:hAnsi="Wingdings" w:hint="default"/>
+      </w:rPr>
+    </w:lvl>
+    <w:lvl w:ilvl="6" w:tplc="10090001" w:tentative="1">
+      <w:start w:val="1"/>
+      <w:numFmt w:val="bullet"/>
+      <w:lvlText w:val=""/>
+      <w:lvlJc w:val="left"/>
+      <w:pPr>
+        <w:ind w:left="5040" w:hanging="360"/>
+      </w:pPr>
+      <w:rPr>
+        <w:rFonts w:ascii="Symbol" w:hAnsi="Symbol" w:hint="default"/>
+      </w:rPr>
+    </w:lvl>
+    <w:lvl w:ilvl="7" w:tplc="10090003" w:tentative="1">
+      <w:start w:val="1"/>
+      <w:numFmt w:val="bullet"/>
+      <w:lvlText w:val="o"/>
+      <w:lvlJc w:val="left"/>
+      <w:pPr>
+        <w:ind w:left="5760" w:hanging="360"/>
+      </w:pPr>
+      <w:rPr>
+        <w:rFonts w:ascii="Courier New" w:hAnsi="Courier New" w:cs="Courier New" w:hint="default"/>
+      </w:rPr>
+    </w:lvl>
+    <w:lvl w:ilvl="8" w:tplc="10090005" w:tentative="1">
+      <w:start w:val="1"/>
+      <w:numFmt w:val="bullet"/>
+      <w:lvlText w:val=""/>
+      <w:lvlJc w:val="left"/>
+      <w:pPr>
+        <w:ind w:left="6480" w:hanging="360"/>
+      </w:pPr>
+      <w:rPr>
+        <w:rFonts w:ascii="Wingdings" w:hAnsi="Wingdings" w:hint="default"/>
+      </w:rPr>
+    </w:lvl>
+  </w:abstractNum>
+  <w:abstractNum w:abstractNumId="9" w15:restartNumberingAfterBreak="0">
     <w:nsid w:val="49AC7DE0"/>
     <w:multiLevelType w:val="multilevel"/>
     <w:tmpl w:val="B8C29B34"/>
@@ -1373,7 +4647,120 @@
       </w:rPr>
     </w:lvl>
   </w:abstractNum>
-  <w:abstractNum w:abstractNumId="2" w15:restartNumberingAfterBreak="0">
+  <w:abstractNum w:abstractNumId="10" w15:restartNumberingAfterBreak="0">
+    <w:nsid w:val="50785CC2"/>
+    <w:multiLevelType w:val="hybridMultilevel"/>
+    <w:tmpl w:val="678031B4"/>
+    <w:lvl w:ilvl="0" w:tplc="10090003">
+      <w:start w:val="1"/>
+      <w:numFmt w:val="bullet"/>
+      <w:lvlText w:val="o"/>
+      <w:lvlJc w:val="left"/>
+      <w:pPr>
+        <w:ind w:left="720" w:hanging="360"/>
+      </w:pPr>
+      <w:rPr>
+        <w:rFonts w:ascii="Courier New" w:hAnsi="Courier New" w:cs="Courier New" w:hint="default"/>
+      </w:rPr>
+    </w:lvl>
+    <w:lvl w:ilvl="1" w:tplc="10090003" w:tentative="1">
+      <w:start w:val="1"/>
+      <w:numFmt w:val="bullet"/>
+      <w:lvlText w:val="o"/>
+      <w:lvlJc w:val="left"/>
+      <w:pPr>
+        <w:ind w:left="1440" w:hanging="360"/>
+      </w:pPr>
+      <w:rPr>
+        <w:rFonts w:ascii="Courier New" w:hAnsi="Courier New" w:cs="Courier New" w:hint="default"/>
+      </w:rPr>
+    </w:lvl>
+    <w:lvl w:ilvl="2" w:tplc="10090005" w:tentative="1">
+      <w:start w:val="1"/>
+      <w:numFmt w:val="bullet"/>
+      <w:lvlText w:val=""/>
+      <w:lvlJc w:val="left"/>
+      <w:pPr>
+        <w:ind w:left="2160" w:hanging="360"/>
+      </w:pPr>
+      <w:rPr>
+        <w:rFonts w:ascii="Wingdings" w:hAnsi="Wingdings" w:hint="default"/>
+      </w:rPr>
+    </w:lvl>
+    <w:lvl w:ilvl="3" w:tplc="10090001" w:tentative="1">
+      <w:start w:val="1"/>
+      <w:numFmt w:val="bullet"/>
+      <w:lvlText w:val=""/>
+      <w:lvlJc w:val="left"/>
+      <w:pPr>
+        <w:ind w:left="2880" w:hanging="360"/>
+      </w:pPr>
+      <w:rPr>
+        <w:rFonts w:ascii="Symbol" w:hAnsi="Symbol" w:hint="default"/>
+      </w:rPr>
+    </w:lvl>
+    <w:lvl w:ilvl="4" w:tplc="10090003" w:tentative="1">
+      <w:start w:val="1"/>
+      <w:numFmt w:val="bullet"/>
+      <w:lvlText w:val="o"/>
+      <w:lvlJc w:val="left"/>
+      <w:pPr>
+        <w:ind w:left="3600" w:hanging="360"/>
+      </w:pPr>
+      <w:rPr>
+        <w:rFonts w:ascii="Courier New" w:hAnsi="Courier New" w:cs="Courier New" w:hint="default"/>
+      </w:rPr>
+    </w:lvl>
+    <w:lvl w:ilvl="5" w:tplc="10090005" w:tentative="1">
+      <w:start w:val="1"/>
+      <w:numFmt w:val="bullet"/>
+      <w:lvlText w:val=""/>
+      <w:lvlJc w:val="left"/>
+      <w:pPr>
+        <w:ind w:left="4320" w:hanging="360"/>
+      </w:pPr>
+      <w:rPr>
+        <w:rFonts w:ascii="Wingdings" w:hAnsi="Wingdings" w:hint="default"/>
+      </w:rPr>
+    </w:lvl>
+    <w:lvl w:ilvl="6" w:tplc="10090001" w:tentative="1">
+      <w:start w:val="1"/>
+      <w:numFmt w:val="bullet"/>
+      <w:lvlText w:val=""/>
+      <w:lvlJc w:val="left"/>
+      <w:pPr>
+        <w:ind w:left="5040" w:hanging="360"/>
+      </w:pPr>
+      <w:rPr>
+        <w:rFonts w:ascii="Symbol" w:hAnsi="Symbol" w:hint="default"/>
+      </w:rPr>
+    </w:lvl>
+    <w:lvl w:ilvl="7" w:tplc="10090003" w:tentative="1">
+      <w:start w:val="1"/>
+      <w:numFmt w:val="bullet"/>
+      <w:lvlText w:val="o"/>
+      <w:lvlJc w:val="left"/>
+      <w:pPr>
+        <w:ind w:left="5760" w:hanging="360"/>
+      </w:pPr>
+      <w:rPr>
+        <w:rFonts w:ascii="Courier New" w:hAnsi="Courier New" w:cs="Courier New" w:hint="default"/>
+      </w:rPr>
+    </w:lvl>
+    <w:lvl w:ilvl="8" w:tplc="10090005" w:tentative="1">
+      <w:start w:val="1"/>
+      <w:numFmt w:val="bullet"/>
+      <w:lvlText w:val=""/>
+      <w:lvlJc w:val="left"/>
+      <w:pPr>
+        <w:ind w:left="6480" w:hanging="360"/>
+      </w:pPr>
+      <w:rPr>
+        <w:rFonts w:ascii="Wingdings" w:hAnsi="Wingdings" w:hint="default"/>
+      </w:rPr>
+    </w:lvl>
+  </w:abstractNum>
+  <w:abstractNum w:abstractNumId="11" w15:restartNumberingAfterBreak="0">
     <w:nsid w:val="5D9B3D15"/>
     <w:multiLevelType w:val="multilevel"/>
     <w:tmpl w:val="2FBEE524"/>
@@ -1522,7 +4909,432 @@
       </w:rPr>
     </w:lvl>
   </w:abstractNum>
-  <w:abstractNum w:abstractNumId="3" w15:restartNumberingAfterBreak="0">
+  <w:abstractNum w:abstractNumId="12" w15:restartNumberingAfterBreak="0">
+    <w:nsid w:val="5FA7446C"/>
+    <w:multiLevelType w:val="hybridMultilevel"/>
+    <w:tmpl w:val="2D14BBE8"/>
+    <w:lvl w:ilvl="0" w:tplc="10090003">
+      <w:start w:val="1"/>
+      <w:numFmt w:val="bullet"/>
+      <w:lvlText w:val="o"/>
+      <w:lvlJc w:val="left"/>
+      <w:pPr>
+        <w:ind w:left="720" w:hanging="360"/>
+      </w:pPr>
+      <w:rPr>
+        <w:rFonts w:ascii="Courier New" w:hAnsi="Courier New" w:cs="Courier New" w:hint="default"/>
+      </w:rPr>
+    </w:lvl>
+    <w:lvl w:ilvl="1" w:tplc="10090003" w:tentative="1">
+      <w:start w:val="1"/>
+      <w:numFmt w:val="bullet"/>
+      <w:lvlText w:val="o"/>
+      <w:lvlJc w:val="left"/>
+      <w:pPr>
+        <w:ind w:left="1440" w:hanging="360"/>
+      </w:pPr>
+      <w:rPr>
+        <w:rFonts w:ascii="Courier New" w:hAnsi="Courier New" w:cs="Courier New" w:hint="default"/>
+      </w:rPr>
+    </w:lvl>
+    <w:lvl w:ilvl="2" w:tplc="10090005" w:tentative="1">
+      <w:start w:val="1"/>
+      <w:numFmt w:val="bullet"/>
+      <w:lvlText w:val=""/>
+      <w:lvlJc w:val="left"/>
+      <w:pPr>
+        <w:ind w:left="2160" w:hanging="360"/>
+      </w:pPr>
+      <w:rPr>
+        <w:rFonts w:ascii="Wingdings" w:hAnsi="Wingdings" w:hint="default"/>
+      </w:rPr>
+    </w:lvl>
+    <w:lvl w:ilvl="3" w:tplc="10090001" w:tentative="1">
+      <w:start w:val="1"/>
+      <w:numFmt w:val="bullet"/>
+      <w:lvlText w:val=""/>
+      <w:lvlJc w:val="left"/>
+      <w:pPr>
+        <w:ind w:left="2880" w:hanging="360"/>
+      </w:pPr>
+      <w:rPr>
+        <w:rFonts w:ascii="Symbol" w:hAnsi="Symbol" w:hint="default"/>
+      </w:rPr>
+    </w:lvl>
+    <w:lvl w:ilvl="4" w:tplc="10090003" w:tentative="1">
+      <w:start w:val="1"/>
+      <w:numFmt w:val="bullet"/>
+      <w:lvlText w:val="o"/>
+      <w:lvlJc w:val="left"/>
+      <w:pPr>
+        <w:ind w:left="3600" w:hanging="360"/>
+      </w:pPr>
+      <w:rPr>
+        <w:rFonts w:ascii="Courier New" w:hAnsi="Courier New" w:cs="Courier New" w:hint="default"/>
+      </w:rPr>
+    </w:lvl>
+    <w:lvl w:ilvl="5" w:tplc="10090005" w:tentative="1">
+      <w:start w:val="1"/>
+      <w:numFmt w:val="bullet"/>
+      <w:lvlText w:val=""/>
+      <w:lvlJc w:val="left"/>
+      <w:pPr>
+        <w:ind w:left="4320" w:hanging="360"/>
+      </w:pPr>
+      <w:rPr>
+        <w:rFonts w:ascii="Wingdings" w:hAnsi="Wingdings" w:hint="default"/>
+      </w:rPr>
+    </w:lvl>
+    <w:lvl w:ilvl="6" w:tplc="10090001" w:tentative="1">
+      <w:start w:val="1"/>
+      <w:numFmt w:val="bullet"/>
+      <w:lvlText w:val=""/>
+      <w:lvlJc w:val="left"/>
+      <w:pPr>
+        <w:ind w:left="5040" w:hanging="360"/>
+      </w:pPr>
+      <w:rPr>
+        <w:rFonts w:ascii="Symbol" w:hAnsi="Symbol" w:hint="default"/>
+      </w:rPr>
+    </w:lvl>
+    <w:lvl w:ilvl="7" w:tplc="10090003" w:tentative="1">
+      <w:start w:val="1"/>
+      <w:numFmt w:val="bullet"/>
+      <w:lvlText w:val="o"/>
+      <w:lvlJc w:val="left"/>
+      <w:pPr>
+        <w:ind w:left="5760" w:hanging="360"/>
+      </w:pPr>
+      <w:rPr>
+        <w:rFonts w:ascii="Courier New" w:hAnsi="Courier New" w:cs="Courier New" w:hint="default"/>
+      </w:rPr>
+    </w:lvl>
+    <w:lvl w:ilvl="8" w:tplc="10090005" w:tentative="1">
+      <w:start w:val="1"/>
+      <w:numFmt w:val="bullet"/>
+      <w:lvlText w:val=""/>
+      <w:lvlJc w:val="left"/>
+      <w:pPr>
+        <w:ind w:left="6480" w:hanging="360"/>
+      </w:pPr>
+      <w:rPr>
+        <w:rFonts w:ascii="Wingdings" w:hAnsi="Wingdings" w:hint="default"/>
+      </w:rPr>
+    </w:lvl>
+  </w:abstractNum>
+  <w:abstractNum w:abstractNumId="13" w15:restartNumberingAfterBreak="0">
+    <w:nsid w:val="639F097A"/>
+    <w:multiLevelType w:val="hybridMultilevel"/>
+    <w:tmpl w:val="881AD294"/>
+    <w:lvl w:ilvl="0" w:tplc="10090003">
+      <w:start w:val="1"/>
+      <w:numFmt w:val="bullet"/>
+      <w:lvlText w:val="o"/>
+      <w:lvlJc w:val="left"/>
+      <w:pPr>
+        <w:ind w:left="720" w:hanging="360"/>
+      </w:pPr>
+      <w:rPr>
+        <w:rFonts w:ascii="Courier New" w:hAnsi="Courier New" w:cs="Courier New" w:hint="default"/>
+      </w:rPr>
+    </w:lvl>
+    <w:lvl w:ilvl="1" w:tplc="10090003" w:tentative="1">
+      <w:start w:val="1"/>
+      <w:numFmt w:val="bullet"/>
+      <w:lvlText w:val="o"/>
+      <w:lvlJc w:val="left"/>
+      <w:pPr>
+        <w:ind w:left="1440" w:hanging="360"/>
+      </w:pPr>
+      <w:rPr>
+        <w:rFonts w:ascii="Courier New" w:hAnsi="Courier New" w:cs="Courier New" w:hint="default"/>
+      </w:rPr>
+    </w:lvl>
+    <w:lvl w:ilvl="2" w:tplc="10090005" w:tentative="1">
+      <w:start w:val="1"/>
+      <w:numFmt w:val="bullet"/>
+      <w:lvlText w:val=""/>
+      <w:lvlJc w:val="left"/>
+      <w:pPr>
+        <w:ind w:left="2160" w:hanging="360"/>
+      </w:pPr>
+      <w:rPr>
+        <w:rFonts w:ascii="Wingdings" w:hAnsi="Wingdings" w:hint="default"/>
+      </w:rPr>
+    </w:lvl>
+    <w:lvl w:ilvl="3" w:tplc="10090001" w:tentative="1">
+      <w:start w:val="1"/>
+      <w:numFmt w:val="bullet"/>
+      <w:lvlText w:val=""/>
+      <w:lvlJc w:val="left"/>
+      <w:pPr>
+        <w:ind w:left="2880" w:hanging="360"/>
+      </w:pPr>
+      <w:rPr>
+        <w:rFonts w:ascii="Symbol" w:hAnsi="Symbol" w:hint="default"/>
+      </w:rPr>
+    </w:lvl>
+    <w:lvl w:ilvl="4" w:tplc="10090003" w:tentative="1">
+      <w:start w:val="1"/>
+      <w:numFmt w:val="bullet"/>
+      <w:lvlText w:val="o"/>
+      <w:lvlJc w:val="left"/>
+      <w:pPr>
+        <w:ind w:left="3600" w:hanging="360"/>
+      </w:pPr>
+      <w:rPr>
+        <w:rFonts w:ascii="Courier New" w:hAnsi="Courier New" w:cs="Courier New" w:hint="default"/>
+      </w:rPr>
+    </w:lvl>
+    <w:lvl w:ilvl="5" w:tplc="10090005" w:tentative="1">
+      <w:start w:val="1"/>
+      <w:numFmt w:val="bullet"/>
+      <w:lvlText w:val=""/>
+      <w:lvlJc w:val="left"/>
+      <w:pPr>
+        <w:ind w:left="4320" w:hanging="360"/>
+      </w:pPr>
+      <w:rPr>
+        <w:rFonts w:ascii="Wingdings" w:hAnsi="Wingdings" w:hint="default"/>
+      </w:rPr>
+    </w:lvl>
+    <w:lvl w:ilvl="6" w:tplc="10090001" w:tentative="1">
+      <w:start w:val="1"/>
+      <w:numFmt w:val="bullet"/>
+      <w:lvlText w:val=""/>
+      <w:lvlJc w:val="left"/>
+      <w:pPr>
+        <w:ind w:left="5040" w:hanging="360"/>
+      </w:pPr>
+      <w:rPr>
+        <w:rFonts w:ascii="Symbol" w:hAnsi="Symbol" w:hint="default"/>
+      </w:rPr>
+    </w:lvl>
+    <w:lvl w:ilvl="7" w:tplc="10090003" w:tentative="1">
+      <w:start w:val="1"/>
+      <w:numFmt w:val="bullet"/>
+      <w:lvlText w:val="o"/>
+      <w:lvlJc w:val="left"/>
+      <w:pPr>
+        <w:ind w:left="5760" w:hanging="360"/>
+      </w:pPr>
+      <w:rPr>
+        <w:rFonts w:ascii="Courier New" w:hAnsi="Courier New" w:cs="Courier New" w:hint="default"/>
+      </w:rPr>
+    </w:lvl>
+    <w:lvl w:ilvl="8" w:tplc="10090005" w:tentative="1">
+      <w:start w:val="1"/>
+      <w:numFmt w:val="bullet"/>
+      <w:lvlText w:val=""/>
+      <w:lvlJc w:val="left"/>
+      <w:pPr>
+        <w:ind w:left="6480" w:hanging="360"/>
+      </w:pPr>
+      <w:rPr>
+        <w:rFonts w:ascii="Wingdings" w:hAnsi="Wingdings" w:hint="default"/>
+      </w:rPr>
+    </w:lvl>
+  </w:abstractNum>
+  <w:abstractNum w:abstractNumId="14" w15:restartNumberingAfterBreak="0">
+    <w:nsid w:val="671B3650"/>
+    <w:multiLevelType w:val="hybridMultilevel"/>
+    <w:tmpl w:val="F72E60C8"/>
+    <w:lvl w:ilvl="0" w:tplc="10090001">
+      <w:start w:val="1"/>
+      <w:numFmt w:val="bullet"/>
+      <w:lvlText w:val=""/>
+      <w:lvlJc w:val="left"/>
+      <w:pPr>
+        <w:ind w:left="720" w:hanging="360"/>
+      </w:pPr>
+      <w:rPr>
+        <w:rFonts w:ascii="Symbol" w:hAnsi="Symbol" w:hint="default"/>
+      </w:rPr>
+    </w:lvl>
+    <w:lvl w:ilvl="1" w:tplc="10090003">
+      <w:start w:val="1"/>
+      <w:numFmt w:val="bullet"/>
+      <w:lvlText w:val="o"/>
+      <w:lvlJc w:val="left"/>
+      <w:pPr>
+        <w:ind w:left="1440" w:hanging="360"/>
+      </w:pPr>
+      <w:rPr>
+        <w:rFonts w:ascii="Courier New" w:hAnsi="Courier New" w:cs="Courier New" w:hint="default"/>
+      </w:rPr>
+    </w:lvl>
+    <w:lvl w:ilvl="2" w:tplc="10090005" w:tentative="1">
+      <w:start w:val="1"/>
+      <w:numFmt w:val="bullet"/>
+      <w:lvlText w:val=""/>
+      <w:lvlJc w:val="left"/>
+      <w:pPr>
+        <w:ind w:left="2160" w:hanging="360"/>
+      </w:pPr>
+      <w:rPr>
+        <w:rFonts w:ascii="Wingdings" w:hAnsi="Wingdings" w:hint="default"/>
+      </w:rPr>
+    </w:lvl>
+    <w:lvl w:ilvl="3" w:tplc="10090001" w:tentative="1">
+      <w:start w:val="1"/>
+      <w:numFmt w:val="bullet"/>
+      <w:lvlText w:val=""/>
+      <w:lvlJc w:val="left"/>
+      <w:pPr>
+        <w:ind w:left="2880" w:hanging="360"/>
+      </w:pPr>
+      <w:rPr>
+        <w:rFonts w:ascii="Symbol" w:hAnsi="Symbol" w:hint="default"/>
+      </w:rPr>
+    </w:lvl>
+    <w:lvl w:ilvl="4" w:tplc="10090003" w:tentative="1">
+      <w:start w:val="1"/>
+      <w:numFmt w:val="bullet"/>
+      <w:lvlText w:val="o"/>
+      <w:lvlJc w:val="left"/>
+      <w:pPr>
+        <w:ind w:left="3600" w:hanging="360"/>
+      </w:pPr>
+      <w:rPr>
+        <w:rFonts w:ascii="Courier New" w:hAnsi="Courier New" w:cs="Courier New" w:hint="default"/>
+      </w:rPr>
+    </w:lvl>
+    <w:lvl w:ilvl="5" w:tplc="10090005" w:tentative="1">
+      <w:start w:val="1"/>
+      <w:numFmt w:val="bullet"/>
+      <w:lvlText w:val=""/>
+      <w:lvlJc w:val="left"/>
+      <w:pPr>
+        <w:ind w:left="4320" w:hanging="360"/>
+      </w:pPr>
+      <w:rPr>
+        <w:rFonts w:ascii="Wingdings" w:hAnsi="Wingdings" w:hint="default"/>
+      </w:rPr>
+    </w:lvl>
+    <w:lvl w:ilvl="6" w:tplc="10090001" w:tentative="1">
+      <w:start w:val="1"/>
+      <w:numFmt w:val="bullet"/>
+      <w:lvlText w:val=""/>
+      <w:lvlJc w:val="left"/>
+      <w:pPr>
+        <w:ind w:left="5040" w:hanging="360"/>
+      </w:pPr>
+      <w:rPr>
+        <w:rFonts w:ascii="Symbol" w:hAnsi="Symbol" w:hint="default"/>
+      </w:rPr>
+    </w:lvl>
+    <w:lvl w:ilvl="7" w:tplc="10090003" w:tentative="1">
+      <w:start w:val="1"/>
+      <w:numFmt w:val="bullet"/>
+      <w:lvlText w:val="o"/>
+      <w:lvlJc w:val="left"/>
+      <w:pPr>
+        <w:ind w:left="5760" w:hanging="360"/>
+      </w:pPr>
+      <w:rPr>
+        <w:rFonts w:ascii="Courier New" w:hAnsi="Courier New" w:cs="Courier New" w:hint="default"/>
+      </w:rPr>
+    </w:lvl>
+    <w:lvl w:ilvl="8" w:tplc="10090005" w:tentative="1">
+      <w:start w:val="1"/>
+      <w:numFmt w:val="bullet"/>
+      <w:lvlText w:val=""/>
+      <w:lvlJc w:val="left"/>
+      <w:pPr>
+        <w:ind w:left="6480" w:hanging="360"/>
+      </w:pPr>
+      <w:rPr>
+        <w:rFonts w:ascii="Wingdings" w:hAnsi="Wingdings" w:hint="default"/>
+      </w:rPr>
+    </w:lvl>
+  </w:abstractNum>
+  <w:abstractNum w:abstractNumId="15" w15:restartNumberingAfterBreak="0">
+    <w:nsid w:val="724523D1"/>
+    <w:multiLevelType w:val="hybridMultilevel"/>
+    <w:tmpl w:val="7BB8A27C"/>
+    <w:lvl w:ilvl="0" w:tplc="1009000F">
+      <w:start w:val="1"/>
+      <w:numFmt w:val="decimal"/>
+      <w:lvlText w:val="%1."/>
+      <w:lvlJc w:val="left"/>
+      <w:pPr>
+        <w:ind w:left="720" w:hanging="360"/>
+      </w:pPr>
+    </w:lvl>
+    <w:lvl w:ilvl="1" w:tplc="10090019" w:tentative="1">
+      <w:start w:val="1"/>
+      <w:numFmt w:val="lowerLetter"/>
+      <w:lvlText w:val="%2."/>
+      <w:lvlJc w:val="left"/>
+      <w:pPr>
+        <w:ind w:left="1440" w:hanging="360"/>
+      </w:pPr>
+    </w:lvl>
+    <w:lvl w:ilvl="2" w:tplc="1009001B" w:tentative="1">
+      <w:start w:val="1"/>
+      <w:numFmt w:val="lowerRoman"/>
+      <w:lvlText w:val="%3."/>
+      <w:lvlJc w:val="right"/>
+      <w:pPr>
+        <w:ind w:left="2160" w:hanging="180"/>
+      </w:pPr>
+    </w:lvl>
+    <w:lvl w:ilvl="3" w:tplc="1009000F" w:tentative="1">
+      <w:start w:val="1"/>
+      <w:numFmt w:val="decimal"/>
+      <w:lvlText w:val="%4."/>
+      <w:lvlJc w:val="left"/>
+      <w:pPr>
+        <w:ind w:left="2880" w:hanging="360"/>
+      </w:pPr>
+    </w:lvl>
+    <w:lvl w:ilvl="4" w:tplc="10090019" w:tentative="1">
+      <w:start w:val="1"/>
+      <w:numFmt w:val="lowerLetter"/>
+      <w:lvlText w:val="%5."/>
+      <w:lvlJc w:val="left"/>
+      <w:pPr>
+        <w:ind w:left="3600" w:hanging="360"/>
+      </w:pPr>
+    </w:lvl>
+    <w:lvl w:ilvl="5" w:tplc="1009001B" w:tentative="1">
+      <w:start w:val="1"/>
+      <w:numFmt w:val="lowerRoman"/>
+      <w:lvlText w:val="%6."/>
+      <w:lvlJc w:val="right"/>
+      <w:pPr>
+        <w:ind w:left="4320" w:hanging="180"/>
+      </w:pPr>
+    </w:lvl>
+    <w:lvl w:ilvl="6" w:tplc="1009000F" w:tentative="1">
+      <w:start w:val="1"/>
+      <w:numFmt w:val="decimal"/>
+      <w:lvlText w:val="%7."/>
+      <w:lvlJc w:val="left"/>
+      <w:pPr>
+        <w:ind w:left="5040" w:hanging="360"/>
+      </w:pPr>
+    </w:lvl>
+    <w:lvl w:ilvl="7" w:tplc="10090019" w:tentative="1">
+      <w:start w:val="1"/>
+      <w:numFmt w:val="lowerLetter"/>
+      <w:lvlText w:val="%8."/>
+      <w:lvlJc w:val="left"/>
+      <w:pPr>
+        <w:ind w:left="5760" w:hanging="360"/>
+      </w:pPr>
+    </w:lvl>
+    <w:lvl w:ilvl="8" w:tplc="1009001B" w:tentative="1">
+      <w:start w:val="1"/>
+      <w:numFmt w:val="lowerRoman"/>
+      <w:lvlText w:val="%9."/>
+      <w:lvlJc w:val="right"/>
+      <w:pPr>
+        <w:ind w:left="6480" w:hanging="180"/>
+      </w:pPr>
+    </w:lvl>
+  </w:abstractNum>
+  <w:abstractNum w:abstractNumId="16" w15:restartNumberingAfterBreak="0">
     <w:nsid w:val="73B6659D"/>
     <w:multiLevelType w:val="multilevel"/>
     <w:tmpl w:val="19B6D302"/>
@@ -1671,7 +5483,233 @@
       </w:rPr>
     </w:lvl>
   </w:abstractNum>
-  <w:abstractNum w:abstractNumId="4" w15:restartNumberingAfterBreak="0">
+  <w:abstractNum w:abstractNumId="17" w15:restartNumberingAfterBreak="0">
+    <w:nsid w:val="79155B46"/>
+    <w:multiLevelType w:val="hybridMultilevel"/>
+    <w:tmpl w:val="8888497E"/>
+    <w:lvl w:ilvl="0" w:tplc="10090003">
+      <w:start w:val="1"/>
+      <w:numFmt w:val="bullet"/>
+      <w:lvlText w:val="o"/>
+      <w:lvlJc w:val="left"/>
+      <w:pPr>
+        <w:ind w:left="720" w:hanging="360"/>
+      </w:pPr>
+      <w:rPr>
+        <w:rFonts w:ascii="Courier New" w:hAnsi="Courier New" w:cs="Courier New" w:hint="default"/>
+      </w:rPr>
+    </w:lvl>
+    <w:lvl w:ilvl="1" w:tplc="10090003" w:tentative="1">
+      <w:start w:val="1"/>
+      <w:numFmt w:val="bullet"/>
+      <w:lvlText w:val="o"/>
+      <w:lvlJc w:val="left"/>
+      <w:pPr>
+        <w:ind w:left="1440" w:hanging="360"/>
+      </w:pPr>
+      <w:rPr>
+        <w:rFonts w:ascii="Courier New" w:hAnsi="Courier New" w:cs="Courier New" w:hint="default"/>
+      </w:rPr>
+    </w:lvl>
+    <w:lvl w:ilvl="2" w:tplc="10090005" w:tentative="1">
+      <w:start w:val="1"/>
+      <w:numFmt w:val="bullet"/>
+      <w:lvlText w:val=""/>
+      <w:lvlJc w:val="left"/>
+      <w:pPr>
+        <w:ind w:left="2160" w:hanging="360"/>
+      </w:pPr>
+      <w:rPr>
+        <w:rFonts w:ascii="Wingdings" w:hAnsi="Wingdings" w:hint="default"/>
+      </w:rPr>
+    </w:lvl>
+    <w:lvl w:ilvl="3" w:tplc="10090001" w:tentative="1">
+      <w:start w:val="1"/>
+      <w:numFmt w:val="bullet"/>
+      <w:lvlText w:val=""/>
+      <w:lvlJc w:val="left"/>
+      <w:pPr>
+        <w:ind w:left="2880" w:hanging="360"/>
+      </w:pPr>
+      <w:rPr>
+        <w:rFonts w:ascii="Symbol" w:hAnsi="Symbol" w:hint="default"/>
+      </w:rPr>
+    </w:lvl>
+    <w:lvl w:ilvl="4" w:tplc="10090003" w:tentative="1">
+      <w:start w:val="1"/>
+      <w:numFmt w:val="bullet"/>
+      <w:lvlText w:val="o"/>
+      <w:lvlJc w:val="left"/>
+      <w:pPr>
+        <w:ind w:left="3600" w:hanging="360"/>
+      </w:pPr>
+      <w:rPr>
+        <w:rFonts w:ascii="Courier New" w:hAnsi="Courier New" w:cs="Courier New" w:hint="default"/>
+      </w:rPr>
+    </w:lvl>
+    <w:lvl w:ilvl="5" w:tplc="10090005" w:tentative="1">
+      <w:start w:val="1"/>
+      <w:numFmt w:val="bullet"/>
+      <w:lvlText w:val=""/>
+      <w:lvlJc w:val="left"/>
+      <w:pPr>
+        <w:ind w:left="4320" w:hanging="360"/>
+      </w:pPr>
+      <w:rPr>
+        <w:rFonts w:ascii="Wingdings" w:hAnsi="Wingdings" w:hint="default"/>
+      </w:rPr>
+    </w:lvl>
+    <w:lvl w:ilvl="6" w:tplc="10090001" w:tentative="1">
+      <w:start w:val="1"/>
+      <w:numFmt w:val="bullet"/>
+      <w:lvlText w:val=""/>
+      <w:lvlJc w:val="left"/>
+      <w:pPr>
+        <w:ind w:left="5040" w:hanging="360"/>
+      </w:pPr>
+      <w:rPr>
+        <w:rFonts w:ascii="Symbol" w:hAnsi="Symbol" w:hint="default"/>
+      </w:rPr>
+    </w:lvl>
+    <w:lvl w:ilvl="7" w:tplc="10090003" w:tentative="1">
+      <w:start w:val="1"/>
+      <w:numFmt w:val="bullet"/>
+      <w:lvlText w:val="o"/>
+      <w:lvlJc w:val="left"/>
+      <w:pPr>
+        <w:ind w:left="5760" w:hanging="360"/>
+      </w:pPr>
+      <w:rPr>
+        <w:rFonts w:ascii="Courier New" w:hAnsi="Courier New" w:cs="Courier New" w:hint="default"/>
+      </w:rPr>
+    </w:lvl>
+    <w:lvl w:ilvl="8" w:tplc="10090005" w:tentative="1">
+      <w:start w:val="1"/>
+      <w:numFmt w:val="bullet"/>
+      <w:lvlText w:val=""/>
+      <w:lvlJc w:val="left"/>
+      <w:pPr>
+        <w:ind w:left="6480" w:hanging="360"/>
+      </w:pPr>
+      <w:rPr>
+        <w:rFonts w:ascii="Wingdings" w:hAnsi="Wingdings" w:hint="default"/>
+      </w:rPr>
+    </w:lvl>
+  </w:abstractNum>
+  <w:abstractNum w:abstractNumId="18" w15:restartNumberingAfterBreak="0">
+    <w:nsid w:val="7AD16F69"/>
+    <w:multiLevelType w:val="hybridMultilevel"/>
+    <w:tmpl w:val="B08C5E3E"/>
+    <w:lvl w:ilvl="0" w:tplc="10090003">
+      <w:start w:val="1"/>
+      <w:numFmt w:val="bullet"/>
+      <w:lvlText w:val="o"/>
+      <w:lvlJc w:val="left"/>
+      <w:pPr>
+        <w:ind w:left="720" w:hanging="360"/>
+      </w:pPr>
+      <w:rPr>
+        <w:rFonts w:ascii="Courier New" w:hAnsi="Courier New" w:cs="Courier New" w:hint="default"/>
+      </w:rPr>
+    </w:lvl>
+    <w:lvl w:ilvl="1" w:tplc="10090003" w:tentative="1">
+      <w:start w:val="1"/>
+      <w:numFmt w:val="bullet"/>
+      <w:lvlText w:val="o"/>
+      <w:lvlJc w:val="left"/>
+      <w:pPr>
+        <w:ind w:left="1440" w:hanging="360"/>
+      </w:pPr>
+      <w:rPr>
+        <w:rFonts w:ascii="Courier New" w:hAnsi="Courier New" w:cs="Courier New" w:hint="default"/>
+      </w:rPr>
+    </w:lvl>
+    <w:lvl w:ilvl="2" w:tplc="10090005" w:tentative="1">
+      <w:start w:val="1"/>
+      <w:numFmt w:val="bullet"/>
+      <w:lvlText w:val=""/>
+      <w:lvlJc w:val="left"/>
+      <w:pPr>
+        <w:ind w:left="2160" w:hanging="360"/>
+      </w:pPr>
+      <w:rPr>
+        <w:rFonts w:ascii="Wingdings" w:hAnsi="Wingdings" w:hint="default"/>
+      </w:rPr>
+    </w:lvl>
+    <w:lvl w:ilvl="3" w:tplc="10090001" w:tentative="1">
+      <w:start w:val="1"/>
+      <w:numFmt w:val="bullet"/>
+      <w:lvlText w:val=""/>
+      <w:lvlJc w:val="left"/>
+      <w:pPr>
+        <w:ind w:left="2880" w:hanging="360"/>
+      </w:pPr>
+      <w:rPr>
+        <w:rFonts w:ascii="Symbol" w:hAnsi="Symbol" w:hint="default"/>
+      </w:rPr>
+    </w:lvl>
+    <w:lvl w:ilvl="4" w:tplc="10090003" w:tentative="1">
+      <w:start w:val="1"/>
+      <w:numFmt w:val="bullet"/>
+      <w:lvlText w:val="o"/>
+      <w:lvlJc w:val="left"/>
+      <w:pPr>
+        <w:ind w:left="3600" w:hanging="360"/>
+      </w:pPr>
+      <w:rPr>
+        <w:rFonts w:ascii="Courier New" w:hAnsi="Courier New" w:cs="Courier New" w:hint="default"/>
+      </w:rPr>
+    </w:lvl>
+    <w:lvl w:ilvl="5" w:tplc="10090005" w:tentative="1">
+      <w:start w:val="1"/>
+      <w:numFmt w:val="bullet"/>
+      <w:lvlText w:val=""/>
+      <w:lvlJc w:val="left"/>
+      <w:pPr>
+        <w:ind w:left="4320" w:hanging="360"/>
+      </w:pPr>
+      <w:rPr>
+        <w:rFonts w:ascii="Wingdings" w:hAnsi="Wingdings" w:hint="default"/>
+      </w:rPr>
+    </w:lvl>
+    <w:lvl w:ilvl="6" w:tplc="10090001" w:tentative="1">
+      <w:start w:val="1"/>
+      <w:numFmt w:val="bullet"/>
+      <w:lvlText w:val=""/>
+      <w:lvlJc w:val="left"/>
+      <w:pPr>
+        <w:ind w:left="5040" w:hanging="360"/>
+      </w:pPr>
+      <w:rPr>
+        <w:rFonts w:ascii="Symbol" w:hAnsi="Symbol" w:hint="default"/>
+      </w:rPr>
+    </w:lvl>
+    <w:lvl w:ilvl="7" w:tplc="10090003" w:tentative="1">
+      <w:start w:val="1"/>
+      <w:numFmt w:val="bullet"/>
+      <w:lvlText w:val="o"/>
+      <w:lvlJc w:val="left"/>
+      <w:pPr>
+        <w:ind w:left="5760" w:hanging="360"/>
+      </w:pPr>
+      <w:rPr>
+        <w:rFonts w:ascii="Courier New" w:hAnsi="Courier New" w:cs="Courier New" w:hint="default"/>
+      </w:rPr>
+    </w:lvl>
+    <w:lvl w:ilvl="8" w:tplc="10090005" w:tentative="1">
+      <w:start w:val="1"/>
+      <w:numFmt w:val="bullet"/>
+      <w:lvlText w:val=""/>
+      <w:lvlJc w:val="left"/>
+      <w:pPr>
+        <w:ind w:left="6480" w:hanging="360"/>
+      </w:pPr>
+      <w:rPr>
+        <w:rFonts w:ascii="Wingdings" w:hAnsi="Wingdings" w:hint="default"/>
+      </w:rPr>
+    </w:lvl>
+  </w:abstractNum>
+  <w:abstractNum w:abstractNumId="19" w15:restartNumberingAfterBreak="0">
     <w:nsid w:val="7C790E04"/>
     <w:multiLevelType w:val="multilevel"/>
     <w:tmpl w:val="D6D2B538"/>
@@ -1821,19 +5859,64 @@
     </w:lvl>
   </w:abstractNum>
   <w:num w:numId="1" w16cid:durableId="2059546780">
-    <w:abstractNumId w:val="0"/>
+    <w:abstractNumId w:val="2"/>
   </w:num>
   <w:num w:numId="2" w16cid:durableId="1371960010">
+    <w:abstractNumId w:val="19"/>
+  </w:num>
+  <w:num w:numId="3" w16cid:durableId="1405028834">
+    <w:abstractNumId w:val="16"/>
+  </w:num>
+  <w:num w:numId="4" w16cid:durableId="164131932">
+    <w:abstractNumId w:val="11"/>
+  </w:num>
+  <w:num w:numId="5" w16cid:durableId="1636910233">
+    <w:abstractNumId w:val="9"/>
+  </w:num>
+  <w:num w:numId="6" w16cid:durableId="987246510">
+    <w:abstractNumId w:val="15"/>
+  </w:num>
+  <w:num w:numId="7" w16cid:durableId="922488949">
+    <w:abstractNumId w:val="1"/>
+  </w:num>
+  <w:num w:numId="8" w16cid:durableId="1645116094">
+    <w:abstractNumId w:val="3"/>
+  </w:num>
+  <w:num w:numId="9" w16cid:durableId="1132405274">
+    <w:abstractNumId w:val="14"/>
+  </w:num>
+  <w:num w:numId="10" w16cid:durableId="908998290">
+    <w:abstractNumId w:val="6"/>
+  </w:num>
+  <w:num w:numId="11" w16cid:durableId="1320425814">
     <w:abstractNumId w:val="4"/>
   </w:num>
-  <w:num w:numId="3" w16cid:durableId="1405028834">
-    <w:abstractNumId w:val="3"/>
+  <w:num w:numId="12" w16cid:durableId="1592548144">
+    <w:abstractNumId w:val="18"/>
   </w:num>
-  <w:num w:numId="4" w16cid:durableId="164131932">
-    <w:abstractNumId w:val="2"/>
+  <w:num w:numId="13" w16cid:durableId="377247495">
+    <w:abstractNumId w:val="12"/>
   </w:num>
-  <w:num w:numId="5" w16cid:durableId="1636910233">
-    <w:abstractNumId w:val="1"/>
+  <w:num w:numId="14" w16cid:durableId="336736483">
+    <w:abstractNumId w:val="5"/>
+  </w:num>
+  <w:num w:numId="15" w16cid:durableId="638538552">
+    <w:abstractNumId w:val="8"/>
+  </w:num>
+  <w:num w:numId="16" w16cid:durableId="2071688141">
+    <w:abstractNumId w:val="10"/>
+  </w:num>
+  <w:num w:numId="17" w16cid:durableId="677462565">
+    <w:abstractNumId w:val="7"/>
+  </w:num>
+  <w:num w:numId="18" w16cid:durableId="869756951">
+    <w:abstractNumId w:val="13"/>
+  </w:num>
+  <w:num w:numId="19" w16cid:durableId="1526285372">
+    <w:abstractNumId w:val="17"/>
+  </w:num>
+  <w:num w:numId="20" w16cid:durableId="841629299">
+    <w:abstractNumId w:val="0"/>
   </w:num>
 </w:numbering>
 </file>

</xml_diff>

<commit_message>
Update Advance SQL Project document
Replace Documentation/Advance SQL Project Document.docx with an updated Word document. This is a binary file change so content diffs are not shown in the git output; the commit updates the project documentation to a newer version.
</commit_message>
<xml_diff>
--- a/Documentation/Advance SQL Project Document.docx
+++ b/Documentation/Advance SQL Project Document.docx
@@ -86,7 +86,7 @@
           <w:r>
             <w:fldChar w:fldCharType="separate"/>
           </w:r>
-          <w:hyperlink w:anchor="_Toc227281512" w:history="1">
+          <w:hyperlink w:anchor="_Toc227285415" w:history="1">
             <w:r>
               <w:rPr>
                 <w:rStyle w:val="Hyperlink"/>
@@ -116,7 +116,7 @@
                 <w:noProof/>
                 <w:webHidden/>
               </w:rPr>
-              <w:instrText xml:space="preserve"> PAGEREF _Toc227281512 \h </w:instrText>
+              <w:instrText xml:space="preserve"> PAGEREF _Toc227285415 \h </w:instrText>
             </w:r>
             <w:r>
               <w:rPr>
@@ -136,7 +136,7 @@
                 <w:noProof/>
                 <w:webHidden/>
               </w:rPr>
-              <w:t>1</w:t>
+              <w:t>2</w:t>
             </w:r>
             <w:r>
               <w:rPr>
@@ -159,10 +159,11 @@
               <w:lang w:eastAsia="en-CA"/>
             </w:rPr>
           </w:pPr>
-          <w:hyperlink w:anchor="_Toc227281513" w:history="1">
+          <w:hyperlink w:anchor="_Toc227285416" w:history="1">
             <w:r>
               <w:rPr>
                 <w:rStyle w:val="Hyperlink"/>
+                <w:rFonts w:ascii="Aptos" w:hAnsi="Aptos"/>
                 <w:b/>
                 <w:bCs/>
                 <w:noProof/>
@@ -188,7 +189,7 @@
                 <w:noProof/>
                 <w:webHidden/>
               </w:rPr>
-              <w:instrText xml:space="preserve"> PAGEREF _Toc227281513 \h </w:instrText>
+              <w:instrText xml:space="preserve"> PAGEREF _Toc227285416 \h </w:instrText>
             </w:r>
             <w:r>
               <w:rPr>
@@ -208,7 +209,7 @@
                 <w:noProof/>
                 <w:webHidden/>
               </w:rPr>
-              <w:t>1</w:t>
+              <w:t>2</w:t>
             </w:r>
             <w:r>
               <w:rPr>
@@ -231,7 +232,7 @@
               <w:lang w:eastAsia="en-CA"/>
             </w:rPr>
           </w:pPr>
-          <w:hyperlink w:anchor="_Toc227281514" w:history="1">
+          <w:hyperlink w:anchor="_Toc227285417" w:history="1">
             <w:r>
               <w:rPr>
                 <w:rStyle w:val="Hyperlink"/>
@@ -274,7 +275,7 @@
                 <w:noProof/>
                 <w:webHidden/>
               </w:rPr>
-              <w:instrText xml:space="preserve"> PAGEREF _Toc227281514 \h </w:instrText>
+              <w:instrText xml:space="preserve"> PAGEREF _Toc227285417 \h </w:instrText>
             </w:r>
             <w:r>
               <w:rPr>
@@ -317,7 +318,7 @@
               <w:lang w:eastAsia="en-CA"/>
             </w:rPr>
           </w:pPr>
-          <w:hyperlink w:anchor="_Toc227281515" w:history="1">
+          <w:hyperlink w:anchor="_Toc227285418" w:history="1">
             <w:r>
               <w:rPr>
                 <w:rStyle w:val="Hyperlink"/>
@@ -344,7 +345,7 @@
                 <w:noProof/>
                 <w:webHidden/>
               </w:rPr>
-              <w:instrText xml:space="preserve"> PAGEREF _Toc227281515 \h </w:instrText>
+              <w:instrText xml:space="preserve"> PAGEREF _Toc227285418 \h </w:instrText>
             </w:r>
             <w:r>
               <w:rPr>
@@ -387,7 +388,7 @@
               <w:lang w:eastAsia="en-CA"/>
             </w:rPr>
           </w:pPr>
-          <w:hyperlink w:anchor="_Toc227281516" w:history="1">
+          <w:hyperlink w:anchor="_Toc227285419" w:history="1">
             <w:r>
               <w:rPr>
                 <w:rStyle w:val="Hyperlink"/>
@@ -414,7 +415,7 @@
                 <w:noProof/>
                 <w:webHidden/>
               </w:rPr>
-              <w:instrText xml:space="preserve"> PAGEREF _Toc227281516 \h </w:instrText>
+              <w:instrText xml:space="preserve"> PAGEREF _Toc227285419 \h </w:instrText>
             </w:r>
             <w:r>
               <w:rPr>
@@ -457,10 +458,11 @@
               <w:lang w:eastAsia="en-CA"/>
             </w:rPr>
           </w:pPr>
-          <w:hyperlink w:anchor="_Toc227281517" w:history="1">
+          <w:hyperlink w:anchor="_Toc227285420" w:history="1">
             <w:r>
               <w:rPr>
                 <w:rStyle w:val="Hyperlink"/>
+                <w:rFonts w:ascii="Aptos" w:hAnsi="Aptos"/>
                 <w:b/>
                 <w:bCs/>
                 <w:noProof/>
@@ -486,7 +488,7 @@
                 <w:noProof/>
                 <w:webHidden/>
               </w:rPr>
-              <w:instrText xml:space="preserve"> PAGEREF _Toc227281517 \h </w:instrText>
+              <w:instrText xml:space="preserve"> PAGEREF _Toc227285420 \h </w:instrText>
             </w:r>
             <w:r>
               <w:rPr>
@@ -506,7 +508,7 @@
                 <w:noProof/>
                 <w:webHidden/>
               </w:rPr>
-              <w:t>2</w:t>
+              <w:t>3</w:t>
             </w:r>
             <w:r>
               <w:rPr>
@@ -529,10 +531,11 @@
               <w:lang w:eastAsia="en-CA"/>
             </w:rPr>
           </w:pPr>
-          <w:hyperlink w:anchor="_Toc227281518" w:history="1">
+          <w:hyperlink w:anchor="_Toc227285421" w:history="1">
             <w:r>
               <w:rPr>
                 <w:rStyle w:val="Hyperlink"/>
+                <w:rFonts w:ascii="Aptos" w:hAnsi="Aptos"/>
                 <w:b/>
                 <w:bCs/>
                 <w:noProof/>
@@ -558,7 +561,7 @@
                 <w:noProof/>
                 <w:webHidden/>
               </w:rPr>
-              <w:instrText xml:space="preserve"> PAGEREF _Toc227281518 \h </w:instrText>
+              <w:instrText xml:space="preserve"> PAGEREF _Toc227285421 \h </w:instrText>
             </w:r>
             <w:r>
               <w:rPr>
@@ -578,7 +581,7 @@
                 <w:noProof/>
                 <w:webHidden/>
               </w:rPr>
-              <w:t>4</w:t>
+              <w:t>5</w:t>
             </w:r>
             <w:r>
               <w:rPr>
@@ -601,7 +604,7 @@
               <w:lang w:eastAsia="en-CA"/>
             </w:rPr>
           </w:pPr>
-          <w:hyperlink w:anchor="_Toc227281519" w:history="1">
+          <w:hyperlink w:anchor="_Toc227285422" w:history="1">
             <w:r>
               <w:rPr>
                 <w:rStyle w:val="Hyperlink"/>
@@ -628,7 +631,7 @@
                 <w:noProof/>
                 <w:webHidden/>
               </w:rPr>
-              <w:instrText xml:space="preserve"> PAGEREF _Toc227281519 \h </w:instrText>
+              <w:instrText xml:space="preserve"> PAGEREF _Toc227285422 \h </w:instrText>
             </w:r>
             <w:r>
               <w:rPr>
@@ -648,7 +651,7 @@
                 <w:noProof/>
                 <w:webHidden/>
               </w:rPr>
-              <w:t>4</w:t>
+              <w:t>5</w:t>
             </w:r>
             <w:r>
               <w:rPr>
@@ -671,7 +674,7 @@
               <w:lang w:eastAsia="en-CA"/>
             </w:rPr>
           </w:pPr>
-          <w:hyperlink w:anchor="_Toc227281520" w:history="1">
+          <w:hyperlink w:anchor="_Toc227285423" w:history="1">
             <w:r>
               <w:rPr>
                 <w:rStyle w:val="Hyperlink"/>
@@ -698,7 +701,7 @@
                 <w:noProof/>
                 <w:webHidden/>
               </w:rPr>
-              <w:instrText xml:space="preserve"> PAGEREF _Toc227281520 \h </w:instrText>
+              <w:instrText xml:space="preserve"> PAGEREF _Toc227285423 \h </w:instrText>
             </w:r>
             <w:r>
               <w:rPr>
@@ -718,7 +721,7 @@
                 <w:noProof/>
                 <w:webHidden/>
               </w:rPr>
-              <w:t>4</w:t>
+              <w:t>5</w:t>
             </w:r>
             <w:r>
               <w:rPr>
@@ -741,7 +744,7 @@
               <w:lang w:eastAsia="en-CA"/>
             </w:rPr>
           </w:pPr>
-          <w:hyperlink w:anchor="_Toc227281521" w:history="1">
+          <w:hyperlink w:anchor="_Toc227285424" w:history="1">
             <w:r>
               <w:rPr>
                 <w:rStyle w:val="Hyperlink"/>
@@ -768,7 +771,7 @@
                 <w:noProof/>
                 <w:webHidden/>
               </w:rPr>
-              <w:instrText xml:space="preserve"> PAGEREF _Toc227281521 \h </w:instrText>
+              <w:instrText xml:space="preserve"> PAGEREF _Toc227285424 \h </w:instrText>
             </w:r>
             <w:r>
               <w:rPr>
@@ -788,7 +791,7 @@
                 <w:noProof/>
                 <w:webHidden/>
               </w:rPr>
-              <w:t>5</w:t>
+              <w:t>6</w:t>
             </w:r>
             <w:r>
               <w:rPr>
@@ -811,7 +814,7 @@
               <w:lang w:eastAsia="en-CA"/>
             </w:rPr>
           </w:pPr>
-          <w:hyperlink w:anchor="_Toc227281522" w:history="1">
+          <w:hyperlink w:anchor="_Toc227285425" w:history="1">
             <w:r>
               <w:rPr>
                 <w:rStyle w:val="Hyperlink"/>
@@ -838,7 +841,7 @@
                 <w:noProof/>
                 <w:webHidden/>
               </w:rPr>
-              <w:instrText xml:space="preserve"> PAGEREF _Toc227281522 \h </w:instrText>
+              <w:instrText xml:space="preserve"> PAGEREF _Toc227285425 \h </w:instrText>
             </w:r>
             <w:r>
               <w:rPr>
@@ -858,7 +861,7 @@
                 <w:noProof/>
                 <w:webHidden/>
               </w:rPr>
-              <w:t>5</w:t>
+              <w:t>6</w:t>
             </w:r>
             <w:r>
               <w:rPr>
@@ -881,7 +884,7 @@
               <w:lang w:eastAsia="en-CA"/>
             </w:rPr>
           </w:pPr>
-          <w:hyperlink w:anchor="_Toc227281523" w:history="1">
+          <w:hyperlink w:anchor="_Toc227285426" w:history="1">
             <w:r>
               <w:rPr>
                 <w:rStyle w:val="Hyperlink"/>
@@ -908,7 +911,7 @@
                 <w:noProof/>
                 <w:webHidden/>
               </w:rPr>
-              <w:instrText xml:space="preserve"> PAGEREF _Toc227281523 \h </w:instrText>
+              <w:instrText xml:space="preserve"> PAGEREF _Toc227285426 \h </w:instrText>
             </w:r>
             <w:r>
               <w:rPr>
@@ -928,7 +931,7 @@
                 <w:noProof/>
                 <w:webHidden/>
               </w:rPr>
-              <w:t>6</w:t>
+              <w:t>7</w:t>
             </w:r>
             <w:r>
               <w:rPr>
@@ -951,7 +954,7 @@
               <w:lang w:eastAsia="en-CA"/>
             </w:rPr>
           </w:pPr>
-          <w:hyperlink w:anchor="_Toc227281524" w:history="1">
+          <w:hyperlink w:anchor="_Toc227285427" w:history="1">
             <w:r>
               <w:rPr>
                 <w:rStyle w:val="Hyperlink"/>
@@ -978,7 +981,7 @@
                 <w:noProof/>
                 <w:webHidden/>
               </w:rPr>
-              <w:instrText xml:space="preserve"> PAGEREF _Toc227281524 \h </w:instrText>
+              <w:instrText xml:space="preserve"> PAGEREF _Toc227285427 \h </w:instrText>
             </w:r>
             <w:r>
               <w:rPr>
@@ -998,7 +1001,643 @@
                 <w:noProof/>
                 <w:webHidden/>
               </w:rPr>
-              <w:t>7</w:t>
+              <w:t>8</w:t>
+            </w:r>
+            <w:r>
+              <w:rPr>
+                <w:noProof/>
+                <w:webHidden/>
+              </w:rPr>
+              <w:fldChar w:fldCharType="end"/>
+            </w:r>
+          </w:hyperlink>
+        </w:p>
+        <w:p>
+          <w:pPr>
+            <w:pStyle w:val="TOC1"/>
+            <w:tabs>
+              <w:tab w:val="right" w:leader="dot" w:pos="9350"/>
+            </w:tabs>
+            <w:rPr>
+              <w:rFonts w:eastAsiaTheme="minorEastAsia"/>
+              <w:noProof/>
+              <w:lang w:eastAsia="en-CA"/>
+            </w:rPr>
+          </w:pPr>
+          <w:hyperlink w:anchor="_Toc227285428" w:history="1">
+            <w:r>
+              <w:rPr>
+                <w:rStyle w:val="Hyperlink"/>
+                <w:rFonts w:ascii="Aptos" w:hAnsi="Aptos"/>
+                <w:b/>
+                <w:bCs/>
+                <w:noProof/>
+              </w:rPr>
+              <w:t>5. APPLICATION IMPLEMENTATION</w:t>
+            </w:r>
+            <w:r>
+              <w:rPr>
+                <w:noProof/>
+                <w:webHidden/>
+              </w:rPr>
+              <w:tab/>
+            </w:r>
+            <w:r>
+              <w:rPr>
+                <w:noProof/>
+                <w:webHidden/>
+              </w:rPr>
+              <w:fldChar w:fldCharType="begin"/>
+            </w:r>
+            <w:r>
+              <w:rPr>
+                <w:noProof/>
+                <w:webHidden/>
+              </w:rPr>
+              <w:instrText xml:space="preserve"> PAGEREF _Toc227285428 \h </w:instrText>
+            </w:r>
+            <w:r>
+              <w:rPr>
+                <w:noProof/>
+                <w:webHidden/>
+              </w:rPr>
+            </w:r>
+            <w:r>
+              <w:rPr>
+                <w:noProof/>
+                <w:webHidden/>
+              </w:rPr>
+              <w:fldChar w:fldCharType="separate"/>
+            </w:r>
+            <w:r>
+              <w:rPr>
+                <w:noProof/>
+                <w:webHidden/>
+              </w:rPr>
+              <w:t>9</w:t>
+            </w:r>
+            <w:r>
+              <w:rPr>
+                <w:noProof/>
+                <w:webHidden/>
+              </w:rPr>
+              <w:fldChar w:fldCharType="end"/>
+            </w:r>
+          </w:hyperlink>
+        </w:p>
+        <w:p>
+          <w:pPr>
+            <w:pStyle w:val="TOC2"/>
+            <w:tabs>
+              <w:tab w:val="right" w:leader="dot" w:pos="9350"/>
+            </w:tabs>
+            <w:rPr>
+              <w:rFonts w:eastAsiaTheme="minorEastAsia"/>
+              <w:noProof/>
+              <w:lang w:eastAsia="en-CA"/>
+            </w:rPr>
+          </w:pPr>
+          <w:hyperlink w:anchor="_Toc227285429" w:history="1">
+            <w:r>
+              <w:rPr>
+                <w:rStyle w:val="Hyperlink"/>
+                <w:noProof/>
+              </w:rPr>
+              <w:t>Application Implementation</w:t>
+            </w:r>
+            <w:r>
+              <w:rPr>
+                <w:noProof/>
+                <w:webHidden/>
+              </w:rPr>
+              <w:tab/>
+            </w:r>
+            <w:r>
+              <w:rPr>
+                <w:noProof/>
+                <w:webHidden/>
+              </w:rPr>
+              <w:fldChar w:fldCharType="begin"/>
+            </w:r>
+            <w:r>
+              <w:rPr>
+                <w:noProof/>
+                <w:webHidden/>
+              </w:rPr>
+              <w:instrText xml:space="preserve"> PAGEREF _Toc227285429 \h </w:instrText>
+            </w:r>
+            <w:r>
+              <w:rPr>
+                <w:noProof/>
+                <w:webHidden/>
+              </w:rPr>
+            </w:r>
+            <w:r>
+              <w:rPr>
+                <w:noProof/>
+                <w:webHidden/>
+              </w:rPr>
+              <w:fldChar w:fldCharType="separate"/>
+            </w:r>
+            <w:r>
+              <w:rPr>
+                <w:noProof/>
+                <w:webHidden/>
+              </w:rPr>
+              <w:t>9</w:t>
+            </w:r>
+            <w:r>
+              <w:rPr>
+                <w:noProof/>
+                <w:webHidden/>
+              </w:rPr>
+              <w:fldChar w:fldCharType="end"/>
+            </w:r>
+          </w:hyperlink>
+        </w:p>
+        <w:p>
+          <w:pPr>
+            <w:pStyle w:val="TOC2"/>
+            <w:tabs>
+              <w:tab w:val="right" w:leader="dot" w:pos="9350"/>
+            </w:tabs>
+            <w:rPr>
+              <w:rFonts w:eastAsiaTheme="minorEastAsia"/>
+              <w:noProof/>
+              <w:lang w:eastAsia="en-CA"/>
+            </w:rPr>
+          </w:pPr>
+          <w:hyperlink w:anchor="_Toc227285430" w:history="1">
+            <w:r>
+              <w:rPr>
+                <w:rStyle w:val="Hyperlink"/>
+                <w:noProof/>
+              </w:rPr>
+              <w:t>Configuration Tool</w:t>
+            </w:r>
+            <w:r>
+              <w:rPr>
+                <w:noProof/>
+                <w:webHidden/>
+              </w:rPr>
+              <w:tab/>
+            </w:r>
+            <w:r>
+              <w:rPr>
+                <w:noProof/>
+                <w:webHidden/>
+              </w:rPr>
+              <w:fldChar w:fldCharType="begin"/>
+            </w:r>
+            <w:r>
+              <w:rPr>
+                <w:noProof/>
+                <w:webHidden/>
+              </w:rPr>
+              <w:instrText xml:space="preserve"> PAGEREF _Toc227285430 \h </w:instrText>
+            </w:r>
+            <w:r>
+              <w:rPr>
+                <w:noProof/>
+                <w:webHidden/>
+              </w:rPr>
+            </w:r>
+            <w:r>
+              <w:rPr>
+                <w:noProof/>
+                <w:webHidden/>
+              </w:rPr>
+              <w:fldChar w:fldCharType="separate"/>
+            </w:r>
+            <w:r>
+              <w:rPr>
+                <w:noProof/>
+                <w:webHidden/>
+              </w:rPr>
+              <w:t>9</w:t>
+            </w:r>
+            <w:r>
+              <w:rPr>
+                <w:noProof/>
+                <w:webHidden/>
+              </w:rPr>
+              <w:fldChar w:fldCharType="end"/>
+            </w:r>
+          </w:hyperlink>
+        </w:p>
+        <w:p>
+          <w:pPr>
+            <w:pStyle w:val="TOC2"/>
+            <w:tabs>
+              <w:tab w:val="right" w:leader="dot" w:pos="9350"/>
+            </w:tabs>
+            <w:rPr>
+              <w:rFonts w:eastAsiaTheme="minorEastAsia"/>
+              <w:noProof/>
+              <w:lang w:eastAsia="en-CA"/>
+            </w:rPr>
+          </w:pPr>
+          <w:hyperlink w:anchor="_Toc227285431" w:history="1">
+            <w:r>
+              <w:rPr>
+                <w:rStyle w:val="Hyperlink"/>
+                <w:noProof/>
+              </w:rPr>
+              <w:t>Workstation Simulation</w:t>
+            </w:r>
+            <w:r>
+              <w:rPr>
+                <w:noProof/>
+                <w:webHidden/>
+              </w:rPr>
+              <w:tab/>
+            </w:r>
+            <w:r>
+              <w:rPr>
+                <w:noProof/>
+                <w:webHidden/>
+              </w:rPr>
+              <w:fldChar w:fldCharType="begin"/>
+            </w:r>
+            <w:r>
+              <w:rPr>
+                <w:noProof/>
+                <w:webHidden/>
+              </w:rPr>
+              <w:instrText xml:space="preserve"> PAGEREF _Toc227285431 \h </w:instrText>
+            </w:r>
+            <w:r>
+              <w:rPr>
+                <w:noProof/>
+                <w:webHidden/>
+              </w:rPr>
+            </w:r>
+            <w:r>
+              <w:rPr>
+                <w:noProof/>
+                <w:webHidden/>
+              </w:rPr>
+              <w:fldChar w:fldCharType="separate"/>
+            </w:r>
+            <w:r>
+              <w:rPr>
+                <w:noProof/>
+                <w:webHidden/>
+              </w:rPr>
+              <w:t>9</w:t>
+            </w:r>
+            <w:r>
+              <w:rPr>
+                <w:noProof/>
+                <w:webHidden/>
+              </w:rPr>
+              <w:fldChar w:fldCharType="end"/>
+            </w:r>
+          </w:hyperlink>
+        </w:p>
+        <w:p>
+          <w:pPr>
+            <w:pStyle w:val="TOC2"/>
+            <w:tabs>
+              <w:tab w:val="right" w:leader="dot" w:pos="9350"/>
+            </w:tabs>
+            <w:rPr>
+              <w:rFonts w:eastAsiaTheme="minorEastAsia"/>
+              <w:noProof/>
+              <w:lang w:eastAsia="en-CA"/>
+            </w:rPr>
+          </w:pPr>
+          <w:hyperlink w:anchor="_Toc227285432" w:history="1">
+            <w:r>
+              <w:rPr>
+                <w:rStyle w:val="Hyperlink"/>
+                <w:noProof/>
+              </w:rPr>
+              <w:t>Workstation Andon Display</w:t>
+            </w:r>
+            <w:r>
+              <w:rPr>
+                <w:noProof/>
+                <w:webHidden/>
+              </w:rPr>
+              <w:tab/>
+            </w:r>
+            <w:r>
+              <w:rPr>
+                <w:noProof/>
+                <w:webHidden/>
+              </w:rPr>
+              <w:fldChar w:fldCharType="begin"/>
+            </w:r>
+            <w:r>
+              <w:rPr>
+                <w:noProof/>
+                <w:webHidden/>
+              </w:rPr>
+              <w:instrText xml:space="preserve"> PAGEREF _Toc227285432 \h </w:instrText>
+            </w:r>
+            <w:r>
+              <w:rPr>
+                <w:noProof/>
+                <w:webHidden/>
+              </w:rPr>
+            </w:r>
+            <w:r>
+              <w:rPr>
+                <w:noProof/>
+                <w:webHidden/>
+              </w:rPr>
+              <w:fldChar w:fldCharType="separate"/>
+            </w:r>
+            <w:r>
+              <w:rPr>
+                <w:noProof/>
+                <w:webHidden/>
+              </w:rPr>
+              <w:t>10</w:t>
+            </w:r>
+            <w:r>
+              <w:rPr>
+                <w:noProof/>
+                <w:webHidden/>
+              </w:rPr>
+              <w:fldChar w:fldCharType="end"/>
+            </w:r>
+          </w:hyperlink>
+        </w:p>
+        <w:p>
+          <w:pPr>
+            <w:pStyle w:val="TOC2"/>
+            <w:tabs>
+              <w:tab w:val="right" w:leader="dot" w:pos="9350"/>
+            </w:tabs>
+            <w:rPr>
+              <w:rFonts w:eastAsiaTheme="minorEastAsia"/>
+              <w:noProof/>
+              <w:lang w:eastAsia="en-CA"/>
+            </w:rPr>
+          </w:pPr>
+          <w:hyperlink w:anchor="_Toc227285433" w:history="1">
+            <w:r>
+              <w:rPr>
+                <w:rStyle w:val="Hyperlink"/>
+                <w:noProof/>
+              </w:rPr>
+              <w:t>Runner Display</w:t>
+            </w:r>
+            <w:r>
+              <w:rPr>
+                <w:noProof/>
+                <w:webHidden/>
+              </w:rPr>
+              <w:tab/>
+            </w:r>
+            <w:r>
+              <w:rPr>
+                <w:noProof/>
+                <w:webHidden/>
+              </w:rPr>
+              <w:fldChar w:fldCharType="begin"/>
+            </w:r>
+            <w:r>
+              <w:rPr>
+                <w:noProof/>
+                <w:webHidden/>
+              </w:rPr>
+              <w:instrText xml:space="preserve"> PAGEREF _Toc227285433 \h </w:instrText>
+            </w:r>
+            <w:r>
+              <w:rPr>
+                <w:noProof/>
+                <w:webHidden/>
+              </w:rPr>
+            </w:r>
+            <w:r>
+              <w:rPr>
+                <w:noProof/>
+                <w:webHidden/>
+              </w:rPr>
+              <w:fldChar w:fldCharType="separate"/>
+            </w:r>
+            <w:r>
+              <w:rPr>
+                <w:noProof/>
+                <w:webHidden/>
+              </w:rPr>
+              <w:t>11</w:t>
+            </w:r>
+            <w:r>
+              <w:rPr>
+                <w:noProof/>
+                <w:webHidden/>
+              </w:rPr>
+              <w:fldChar w:fldCharType="end"/>
+            </w:r>
+          </w:hyperlink>
+        </w:p>
+        <w:p>
+          <w:pPr>
+            <w:pStyle w:val="TOC2"/>
+            <w:tabs>
+              <w:tab w:val="right" w:leader="dot" w:pos="9350"/>
+            </w:tabs>
+            <w:rPr>
+              <w:rFonts w:eastAsiaTheme="minorEastAsia"/>
+              <w:noProof/>
+              <w:lang w:eastAsia="en-CA"/>
+            </w:rPr>
+          </w:pPr>
+          <w:hyperlink w:anchor="_Toc227285434" w:history="1">
+            <w:r>
+              <w:rPr>
+                <w:rStyle w:val="Hyperlink"/>
+                <w:noProof/>
+              </w:rPr>
+              <w:t>Assembly Line Kanban Board</w:t>
+            </w:r>
+            <w:r>
+              <w:rPr>
+                <w:noProof/>
+                <w:webHidden/>
+              </w:rPr>
+              <w:tab/>
+            </w:r>
+            <w:r>
+              <w:rPr>
+                <w:noProof/>
+                <w:webHidden/>
+              </w:rPr>
+              <w:fldChar w:fldCharType="begin"/>
+            </w:r>
+            <w:r>
+              <w:rPr>
+                <w:noProof/>
+                <w:webHidden/>
+              </w:rPr>
+              <w:instrText xml:space="preserve"> PAGEREF _Toc227285434 \h </w:instrText>
+            </w:r>
+            <w:r>
+              <w:rPr>
+                <w:noProof/>
+                <w:webHidden/>
+              </w:rPr>
+            </w:r>
+            <w:r>
+              <w:rPr>
+                <w:noProof/>
+                <w:webHidden/>
+              </w:rPr>
+              <w:fldChar w:fldCharType="separate"/>
+            </w:r>
+            <w:r>
+              <w:rPr>
+                <w:noProof/>
+                <w:webHidden/>
+              </w:rPr>
+              <w:t>12</w:t>
+            </w:r>
+            <w:r>
+              <w:rPr>
+                <w:noProof/>
+                <w:webHidden/>
+              </w:rPr>
+              <w:fldChar w:fldCharType="end"/>
+            </w:r>
+          </w:hyperlink>
+        </w:p>
+        <w:p>
+          <w:pPr>
+            <w:pStyle w:val="TOC1"/>
+            <w:tabs>
+              <w:tab w:val="right" w:leader="dot" w:pos="9350"/>
+            </w:tabs>
+            <w:rPr>
+              <w:rFonts w:eastAsiaTheme="minorEastAsia"/>
+              <w:noProof/>
+              <w:lang w:eastAsia="en-CA"/>
+            </w:rPr>
+          </w:pPr>
+          <w:hyperlink w:anchor="_Toc227285435" w:history="1">
+            <w:r>
+              <w:rPr>
+                <w:rStyle w:val="Hyperlink"/>
+                <w:rFonts w:ascii="Aptos" w:hAnsi="Aptos"/>
+                <w:b/>
+                <w:bCs/>
+                <w:noProof/>
+              </w:rPr>
+              <w:t>6. Design Decisions and Challenges</w:t>
+            </w:r>
+            <w:r>
+              <w:rPr>
+                <w:noProof/>
+                <w:webHidden/>
+              </w:rPr>
+              <w:tab/>
+            </w:r>
+            <w:r>
+              <w:rPr>
+                <w:noProof/>
+                <w:webHidden/>
+              </w:rPr>
+              <w:fldChar w:fldCharType="begin"/>
+            </w:r>
+            <w:r>
+              <w:rPr>
+                <w:noProof/>
+                <w:webHidden/>
+              </w:rPr>
+              <w:instrText xml:space="preserve"> PAGEREF _Toc227285435 \h </w:instrText>
+            </w:r>
+            <w:r>
+              <w:rPr>
+                <w:noProof/>
+                <w:webHidden/>
+              </w:rPr>
+            </w:r>
+            <w:r>
+              <w:rPr>
+                <w:noProof/>
+                <w:webHidden/>
+              </w:rPr>
+              <w:fldChar w:fldCharType="separate"/>
+            </w:r>
+            <w:r>
+              <w:rPr>
+                <w:noProof/>
+                <w:webHidden/>
+              </w:rPr>
+              <w:t>13</w:t>
+            </w:r>
+            <w:r>
+              <w:rPr>
+                <w:noProof/>
+                <w:webHidden/>
+              </w:rPr>
+              <w:fldChar w:fldCharType="end"/>
+            </w:r>
+          </w:hyperlink>
+        </w:p>
+        <w:p>
+          <w:pPr>
+            <w:pStyle w:val="TOC2"/>
+            <w:tabs>
+              <w:tab w:val="right" w:leader="dot" w:pos="9350"/>
+            </w:tabs>
+            <w:rPr>
+              <w:rFonts w:eastAsiaTheme="minorEastAsia"/>
+              <w:noProof/>
+              <w:lang w:eastAsia="en-CA"/>
+            </w:rPr>
+          </w:pPr>
+          <w:hyperlink w:anchor="_Toc227285436" w:history="1">
+            <w:r>
+              <w:rPr>
+                <w:rStyle w:val="Hyperlink"/>
+                <w:noProof/>
+              </w:rPr>
+              <w:t>True Randomness in SQL</w:t>
+            </w:r>
+            <w:r>
+              <w:rPr>
+                <w:noProof/>
+                <w:webHidden/>
+              </w:rPr>
+              <w:tab/>
+            </w:r>
+            <w:r>
+              <w:rPr>
+                <w:noProof/>
+                <w:webHidden/>
+              </w:rPr>
+              <w:fldChar w:fldCharType="begin"/>
+            </w:r>
+            <w:r>
+              <w:rPr>
+                <w:noProof/>
+                <w:webHidden/>
+              </w:rPr>
+              <w:instrText xml:space="preserve"> PAGEREF _Toc227285436 \h </w:instrText>
+            </w:r>
+            <w:r>
+              <w:rPr>
+                <w:noProof/>
+                <w:webHidden/>
+              </w:rPr>
+            </w:r>
+            <w:r>
+              <w:rPr>
+                <w:noProof/>
+                <w:webHidden/>
+              </w:rPr>
+              <w:fldChar w:fldCharType="separate"/>
+            </w:r>
+            <w:r>
+              <w:rPr>
+                <w:noProof/>
+                <w:webHidden/>
+              </w:rPr>
+              <w:t>13</w:t>
             </w:r>
             <w:r>
               <w:rPr>
@@ -1028,7 +1667,6 @@
         </w:p>
       </w:sdtContent>
     </w:sdt>
-    <w:bookmarkStart w:id="0" w:name="_Toc227281512" w:displacedByCustomXml="prev"/>
     <w:p>
       <w:pPr>
         <w:pStyle w:val="Heading1"/>
@@ -1049,7 +1687,6 @@
     <w:p>
       <w:pPr>
         <w:pStyle w:val="Heading1"/>
-        <w:shd w:val="clear" w:color="auto" w:fill="D1D1D1" w:themeFill="background2" w:themeFillShade="E6"/>
         <w:rPr>
           <w:rFonts w:ascii="Aptos" w:hAnsi="Aptos"/>
           <w:b/>
@@ -1057,6 +1694,7 @@
           <w:color w:val="000000" w:themeColor="text1"/>
         </w:rPr>
       </w:pPr>
+      <w:bookmarkStart w:id="0" w:name="_Toc227285415"/>
       <w:r>
         <w:rPr>
           <w:rFonts w:ascii="Aptos" w:hAnsi="Aptos"/>
@@ -1086,7 +1724,6 @@
     <w:p>
       <w:pPr>
         <w:pStyle w:val="Heading1"/>
-        <w:shd w:val="clear" w:color="auto" w:fill="D1D1D1" w:themeFill="background2" w:themeFillShade="E6"/>
         <w:rPr>
           <w:rFonts w:ascii="Aptos" w:hAnsi="Aptos"/>
           <w:b/>
@@ -1094,7 +1731,7 @@
           <w:color w:val="000000" w:themeColor="text1"/>
         </w:rPr>
       </w:pPr>
-      <w:bookmarkStart w:id="1" w:name="_Toc227281513"/>
+      <w:bookmarkStart w:id="1" w:name="_Toc227285416"/>
       <w:r>
         <w:rPr>
           <w:rFonts w:ascii="Aptos" w:hAnsi="Aptos"/>
@@ -1123,7 +1760,7 @@
           <w:color w:val="000000" w:themeColor="text1"/>
         </w:rPr>
       </w:pPr>
-      <w:bookmarkStart w:id="2" w:name="_Toc227281514"/>
+      <w:bookmarkStart w:id="2" w:name="_Toc227285417"/>
       <w:r>
         <w:rPr>
           <w:color w:val="000000" w:themeColor="text1"/>
@@ -1168,7 +1805,6 @@
         <w:t>Configuration Management: Developing a WPF-based Configuration Tool to allow floor managers to adjust simulation parameters (e.g., bin capacities, time scales) without altering application code.</w:t>
       </w:r>
     </w:p>
-    <w:p/>
     <w:p>
       <w:pPr>
         <w:pStyle w:val="Heading2"/>
@@ -1176,7 +1812,7 @@
           <w:color w:val="000000" w:themeColor="text1"/>
         </w:rPr>
       </w:pPr>
-      <w:bookmarkStart w:id="3" w:name="_Toc227281515"/>
+      <w:bookmarkStart w:id="3" w:name="_Toc227285418"/>
       <w:r>
         <w:rPr>
           <w:color w:val="000000" w:themeColor="text1"/>
@@ -1230,7 +1866,7 @@
           <w:color w:val="000000" w:themeColor="text1"/>
         </w:rPr>
       </w:pPr>
-      <w:bookmarkStart w:id="4" w:name="_Toc227281516"/>
+      <w:bookmarkStart w:id="4" w:name="_Toc227285419"/>
       <w:r>
         <w:rPr>
           <w:color w:val="000000" w:themeColor="text1"/>
@@ -1293,15 +1929,12 @@
           <w:rFonts w:eastAsiaTheme="majorEastAsia" w:cstheme="majorBidi"/>
           <w:color w:val="000000" w:themeColor="text1"/>
         </w:rPr>
-        <w:lastRenderedPageBreak/>
         <w:t>Runner Display: Building a dedicated interface for material handlers to view active replenishment alerts and resolve them with a digital button press.</w:t>
       </w:r>
     </w:p>
-    <w:p/>
     <w:p>
       <w:pPr>
         <w:pStyle w:val="Heading1"/>
-        <w:shd w:val="clear" w:color="auto" w:fill="D1D1D1" w:themeFill="background2" w:themeFillShade="E6"/>
         <w:rPr>
           <w:rFonts w:ascii="Aptos" w:hAnsi="Aptos"/>
           <w:b/>
@@ -1309,7 +1942,7 @@
           <w:color w:val="000000" w:themeColor="text1"/>
         </w:rPr>
       </w:pPr>
-      <w:bookmarkStart w:id="5" w:name="_Toc227281517"/>
+      <w:bookmarkStart w:id="5" w:name="_Toc227285420"/>
       <w:r>
         <w:rPr>
           <w:rFonts w:ascii="Aptos" w:hAnsi="Aptos"/>
@@ -1317,6 +1950,7 @@
           <w:bCs/>
           <w:color w:val="000000" w:themeColor="text1"/>
         </w:rPr>
+        <w:lastRenderedPageBreak/>
         <w:t>3. Implementation Strategy</w:t>
       </w:r>
       <w:bookmarkEnd w:id="5"/>
@@ -1502,7 +2136,6 @@
         </w:numPr>
       </w:pPr>
       <w:r>
-        <w:lastRenderedPageBreak/>
         <w:t>Relational Database Management (T-SQL): * Creating scalable schemas and applying proper indexing to optimize data retrieval times for the real-time dashboards.</w:t>
       </w:r>
     </w:p>
@@ -1525,6 +2158,7 @@
         </w:numPr>
       </w:pPr>
       <w:r>
+        <w:lastRenderedPageBreak/>
         <w:t>C# and .NET Framework / .NET 8:</w:t>
       </w:r>
     </w:p>
@@ -1587,15 +2221,33 @@
           <w:bCs/>
           <w:color w:val="000000" w:themeColor="text1"/>
         </w:rPr>
-      </w:pPr>
-      <w:bookmarkStart w:id="6" w:name="_Toc227281518"/>
-      <w:r>
+        <w:sectPr>
+          <w:pgSz w:w="12240" w:h="15840"/>
+          <w:pgMar w:top="1440" w:right="1440" w:bottom="1440" w:left="1440" w:header="708" w:footer="708" w:gutter="0"/>
+          <w:cols w:space="708"/>
+          <w:docGrid w:linePitch="360"/>
+        </w:sectPr>
+      </w:pPr>
+    </w:p>
+    <w:p>
+      <w:pPr>
+        <w:pStyle w:val="Heading1"/>
         <w:rPr>
           <w:rFonts w:ascii="Aptos" w:hAnsi="Aptos"/>
           <w:b/>
           <w:bCs/>
           <w:color w:val="000000" w:themeColor="text1"/>
         </w:rPr>
+      </w:pPr>
+      <w:bookmarkStart w:id="6" w:name="_Toc227285421"/>
+      <w:r>
+        <w:rPr>
+          <w:rFonts w:ascii="Aptos" w:hAnsi="Aptos"/>
+          <w:b/>
+          <w:bCs/>
+          <w:color w:val="000000" w:themeColor="text1"/>
+        </w:rPr>
+        <w:lastRenderedPageBreak/>
         <w:t>4. Database Implementation</w:t>
       </w:r>
       <w:bookmarkEnd w:id="6"/>
@@ -1608,7 +2260,7 @@
           <w:color w:val="auto"/>
         </w:rPr>
       </w:pPr>
-      <w:bookmarkStart w:id="7" w:name="_Toc227281519"/>
+      <w:bookmarkStart w:id="7" w:name="_Toc227285422"/>
       <w:r>
         <w:rPr>
           <w:color w:val="auto"/>
@@ -1619,15 +2271,7 @@
     </w:p>
     <w:p>
       <w:r>
-        <w:t xml:space="preserve">With the planning phase complete, I began implementing the SQL Server database. The database, named </w:t>
-      </w:r>
-      <w:proofErr w:type="spellStart"/>
-      <w:r>
-        <w:t>FogLampAssemblyDB</w:t>
-      </w:r>
-      <w:proofErr w:type="spellEnd"/>
-      <w:r>
-        <w:t>, is created by a single idempotent script that drops and recreates every object on each execution, making it safe to run repeatedly during development and testing without leaving orphaned objects behind.</w:t>
+        <w:t>With the planning phase complete, I began implementing the SQL Server database. The database, named FogLampAssemblyDB, is created by a single idempotent script that drops and recreates every object on each execution, making it safe to run repeatedly during development and testing without leaving orphaned objects behind.</w:t>
       </w:r>
     </w:p>
     <w:p/>
@@ -1639,7 +2283,7 @@
           <w:color w:val="auto"/>
         </w:rPr>
       </w:pPr>
-      <w:bookmarkStart w:id="8" w:name="_Toc227281520"/>
+      <w:bookmarkStart w:id="8" w:name="_Toc227285423"/>
       <w:r>
         <w:rPr>
           <w:color w:val="auto"/>
@@ -1710,32 +2354,7 @@
         </w:numPr>
       </w:pPr>
       <w:r>
-        <w:lastRenderedPageBreak/>
-        <w:t xml:space="preserve">The </w:t>
-      </w:r>
-      <w:proofErr w:type="spellStart"/>
-      <w:r>
-        <w:t>WorkstationBin</w:t>
-      </w:r>
-      <w:proofErr w:type="spellEnd"/>
-      <w:r>
-        <w:t xml:space="preserve"> table represents the Cartesian product of stations and parts, enforced by a unique constraint on (</w:t>
-      </w:r>
-      <w:proofErr w:type="spellStart"/>
-      <w:r>
-        <w:t>stationID</w:t>
-      </w:r>
-      <w:proofErr w:type="spellEnd"/>
-      <w:r>
-        <w:t xml:space="preserve">, </w:t>
-      </w:r>
-      <w:proofErr w:type="spellStart"/>
-      <w:r>
-        <w:t>partID</w:t>
-      </w:r>
-      <w:proofErr w:type="spellEnd"/>
-      <w:r>
-        <w:t xml:space="preserve">) to guarantee exactly one bin per part per station. </w:t>
+        <w:t xml:space="preserve">The WorkstationBin table represents the Cartesian product of stations and parts, enforced by a unique constraint on (stationID, partID) to guarantee exactly one bin per part per station. </w:t>
       </w:r>
     </w:p>
     <w:p>
@@ -1747,15 +2366,7 @@
         </w:numPr>
       </w:pPr>
       <w:r>
-        <w:t xml:space="preserve">The </w:t>
-      </w:r>
-      <w:proofErr w:type="spellStart"/>
-      <w:r>
-        <w:t>ProductionLog</w:t>
-      </w:r>
-      <w:proofErr w:type="spellEnd"/>
-      <w:r>
-        <w:t xml:space="preserve"> table records every lamp assembled, including the build time in seconds, the QA result, and a timestamp. </w:t>
+        <w:t xml:space="preserve">The ProductionLog table records every lamp assembled, including the build time in seconds, the QA result, and a timestamp. </w:t>
       </w:r>
     </w:p>
     <w:p>
@@ -1767,23 +2378,7 @@
         </w:numPr>
       </w:pPr>
       <w:r>
-        <w:t xml:space="preserve">The </w:t>
-      </w:r>
-      <w:proofErr w:type="spellStart"/>
-      <w:r>
-        <w:t>LowStockAlert</w:t>
-      </w:r>
-      <w:proofErr w:type="spellEnd"/>
-      <w:r>
-        <w:t xml:space="preserve"> table stores runner notifications with an </w:t>
-      </w:r>
-      <w:proofErr w:type="spellStart"/>
-      <w:r>
-        <w:t>isResolved</w:t>
-      </w:r>
-      <w:proofErr w:type="spellEnd"/>
-      <w:r>
-        <w:t xml:space="preserve"> flag to distinguish active alerts from cleared ones</w:t>
+        <w:t>The LowStockAlert table stores runner notifications with an isResolved flag to distinguish active alerts from cleared ones</w:t>
       </w:r>
       <w:r>
         <w:t>.</w:t>
@@ -1839,15 +2434,7 @@
         </w:numPr>
       </w:pPr>
       <w:r>
-        <w:t xml:space="preserve">The </w:t>
-      </w:r>
-      <w:proofErr w:type="spellStart"/>
-      <w:r>
-        <w:t>WorkstationBin</w:t>
-      </w:r>
-      <w:proofErr w:type="spellEnd"/>
-      <w:r>
-        <w:t xml:space="preserve"> rows are populated using a CROSS JOIN between Workstation and Part so that adding a new station in the future only requires inserting one row into Workstation and running the seed query again.</w:t>
+        <w:t>The WorkstationBin rows are populated using a CROSS JOIN between Workstation and Part so that adding a new station in the future only requires inserting one row into Workstation and running the seed query again.</w:t>
       </w:r>
     </w:p>
     <w:p>
@@ -1858,11 +2445,12 @@
           <w:color w:val="auto"/>
         </w:rPr>
       </w:pPr>
-      <w:bookmarkStart w:id="9" w:name="_Toc227281521"/>
+      <w:bookmarkStart w:id="9" w:name="_Toc227285424"/>
       <w:r>
         <w:rPr>
           <w:color w:val="auto"/>
         </w:rPr>
+        <w:lastRenderedPageBreak/>
         <w:t>Stored Procedures</w:t>
       </w:r>
       <w:bookmarkEnd w:id="9"/>
@@ -1880,21 +2468,8 @@
           <w:numId w:val="8"/>
         </w:numPr>
       </w:pPr>
-      <w:proofErr w:type="spellStart"/>
-      <w:r>
-        <w:t>sp_BuildLamp</w:t>
-      </w:r>
-      <w:proofErr w:type="spellEnd"/>
-      <w:r>
-        <w:t xml:space="preserve"> is the most critical. It first checks whether any bin at the given station has a quantity of </w:t>
-      </w:r>
-      <w:proofErr w:type="gramStart"/>
-      <w:r>
-        <w:t>zero;</w:t>
-      </w:r>
-      <w:proofErr w:type="gramEnd"/>
-      <w:r>
-        <w:t xml:space="preserve"> </w:t>
+      <w:r>
+        <w:t xml:space="preserve">sp_BuildLamp is the most critical. It first checks whether any bin at the given station has a quantity of zero; </w:t>
       </w:r>
     </w:p>
     <w:p>
@@ -1951,13 +2526,8 @@
         </w:numPr>
       </w:pPr>
       <w:r>
-        <w:t xml:space="preserve"> generates a random build time using </w:t>
-      </w:r>
-      <w:proofErr w:type="spellStart"/>
-      <w:r>
-        <w:t>fn_GetBuildTime</w:t>
-      </w:r>
-      <w:proofErr w:type="spellEnd"/>
+        <w:t xml:space="preserve"> generates a random build time using fn_GetBuildTime</w:t>
+      </w:r>
     </w:p>
     <w:p>
       <w:pPr>
@@ -1968,15 +2538,7 @@
         </w:numPr>
       </w:pPr>
       <w:r>
-        <w:t xml:space="preserve"> applies a random defect check using </w:t>
-      </w:r>
-      <w:proofErr w:type="spellStart"/>
-      <w:r>
-        <w:t>fn_GetDefectRate</w:t>
-      </w:r>
-      <w:proofErr w:type="spellEnd"/>
-      <w:r>
-        <w:t xml:space="preserve"> </w:t>
+        <w:t xml:space="preserve"> applies a random defect check using fn_GetDefectRate </w:t>
       </w:r>
     </w:p>
     <w:p>
@@ -2000,15 +2562,7 @@
         </w:numPr>
       </w:pPr>
       <w:r>
-        <w:t xml:space="preserve">logs the result to </w:t>
-      </w:r>
-      <w:proofErr w:type="spellStart"/>
-      <w:r>
-        <w:t>ProductionLog</w:t>
-      </w:r>
-      <w:proofErr w:type="spellEnd"/>
-      <w:r>
-        <w:t>, and returns the build time, QA result</w:t>
+        <w:t>logs the result to ProductionLog, and returns the build time, QA result</w:t>
       </w:r>
       <w:r>
         <w:t>,</w:t>
@@ -2026,13 +2580,8 @@
           <w:numId w:val="8"/>
         </w:numPr>
       </w:pPr>
-      <w:proofErr w:type="spellStart"/>
-      <w:r>
-        <w:t>sp_RefillBin</w:t>
-      </w:r>
-      <w:proofErr w:type="spellEnd"/>
-      <w:r>
-        <w:t xml:space="preserve"> refills a single part bin by adding the part</w:t>
+      <w:r>
+        <w:t>sp_RefillBin refills a single part bin by adding the part</w:t>
       </w:r>
       <w:r>
         <w:t>’</w:t>
@@ -2061,14 +2610,8 @@
           <w:numId w:val="8"/>
         </w:numPr>
       </w:pPr>
-      <w:proofErr w:type="spellStart"/>
-      <w:r>
-        <w:lastRenderedPageBreak/>
-        <w:t>sp_RefillAllBins</w:t>
-      </w:r>
-      <w:proofErr w:type="spellEnd"/>
-      <w:r>
-        <w:t xml:space="preserve"> refills every bin at a station that is at or below the low-stock threshold, which is what the runner calls after replacing bins during the five-minute cycle. </w:t>
+      <w:r>
+        <w:t xml:space="preserve">sp_RefillAllBins refills every bin at a station that is at or below the low-stock threshold, which is what the runner calls after replacing bins during the five-minute cycle. </w:t>
       </w:r>
     </w:p>
     <w:p>
@@ -2079,29 +2622,8 @@
           <w:numId w:val="8"/>
         </w:numPr>
       </w:pPr>
-      <w:proofErr w:type="spellStart"/>
-      <w:r>
-        <w:t>sp_ResetSimulation</w:t>
-      </w:r>
-      <w:proofErr w:type="spellEnd"/>
-      <w:r>
-        <w:t xml:space="preserve"> clears the </w:t>
-      </w:r>
-      <w:proofErr w:type="spellStart"/>
-      <w:r>
-        <w:t>ProductionLog</w:t>
-      </w:r>
-      <w:proofErr w:type="spellEnd"/>
-      <w:r>
-        <w:t xml:space="preserve"> and </w:t>
-      </w:r>
-      <w:proofErr w:type="spellStart"/>
-      <w:r>
-        <w:t>LowStockAlert</w:t>
-      </w:r>
-      <w:proofErr w:type="spellEnd"/>
-      <w:r>
-        <w:t xml:space="preserve"> tables and restores all bins to their default capacities; it is used by the Configuration Tool to begin a fresh production run.</w:t>
+      <w:r>
+        <w:t>sp_ResetSimulation clears the ProductionLog and LowStockAlert tables and restores all bins to their default capacities; it is used by the Configuration Tool to begin a fresh production run.</w:t>
       </w:r>
     </w:p>
     <w:p>
@@ -2112,7 +2634,7 @@
           <w:color w:val="auto"/>
         </w:rPr>
       </w:pPr>
-      <w:bookmarkStart w:id="10" w:name="_Toc227281522"/>
+      <w:bookmarkStart w:id="10" w:name="_Toc227285425"/>
       <w:r>
         <w:rPr>
           <w:color w:val="auto"/>
@@ -2123,23 +2645,7 @@
     </w:p>
     <w:p>
       <w:r>
-        <w:t xml:space="preserve">I implemented a single AFTER UPDATE trigger on the </w:t>
-      </w:r>
-      <w:proofErr w:type="spellStart"/>
-      <w:r>
-        <w:t>WorkstationBin</w:t>
-      </w:r>
-      <w:proofErr w:type="spellEnd"/>
-      <w:r>
-        <w:t xml:space="preserve"> table named </w:t>
-      </w:r>
-      <w:proofErr w:type="spellStart"/>
-      <w:r>
-        <w:t>trg_LowStockAlert</w:t>
-      </w:r>
-      <w:proofErr w:type="spellEnd"/>
-      <w:r>
-        <w:t xml:space="preserve">. </w:t>
+        <w:t xml:space="preserve">I implemented a single AFTER UPDATE trigger on the WorkstationBin table named trg_LowStockAlert. </w:t>
       </w:r>
     </w:p>
     <w:p>
@@ -2151,15 +2657,7 @@
         </w:numPr>
       </w:pPr>
       <w:r>
-        <w:t xml:space="preserve">Each time a bin quantity is updated, the trigger reads </w:t>
-      </w:r>
-      <w:proofErr w:type="spellStart"/>
-      <w:r>
-        <w:t>LowStockThreshold</w:t>
-      </w:r>
-      <w:proofErr w:type="spellEnd"/>
-      <w:r>
-        <w:t xml:space="preserve"> from the Configuration table and inserts a new alert row only when two conditions are both true: </w:t>
+        <w:t xml:space="preserve">Each time a bin quantity is updated, the trigger reads LowStockThreshold from the Configuration table and inserts a new alert row only when two conditions are both true: </w:t>
       </w:r>
     </w:p>
     <w:p>
@@ -2195,6 +2693,7 @@
         </w:numPr>
       </w:pPr>
       <w:r>
+        <w:lastRenderedPageBreak/>
         <w:t>Reading the threshold dynamically from the Configuration table rather than hardcoding the value of five means the alert level can be adjusted through the Configuration Tool without modifying any SQL objects</w:t>
       </w:r>
       <w:r>
@@ -2209,7 +2708,7 @@
           <w:color w:val="auto"/>
         </w:rPr>
       </w:pPr>
-      <w:bookmarkStart w:id="11" w:name="_Toc227281523"/>
+      <w:bookmarkStart w:id="11" w:name="_Toc227285426"/>
       <w:r>
         <w:rPr>
           <w:color w:val="auto"/>
@@ -2235,20 +2734,54 @@
           <w:bCs/>
         </w:rPr>
       </w:pPr>
-      <w:proofErr w:type="spellStart"/>
       <w:r>
         <w:rPr>
           <w:b/>
           <w:bCs/>
         </w:rPr>
-        <w:t>fn_GetConfigValue</w:t>
-      </w:r>
-      <w:proofErr w:type="spellEnd"/>
+        <w:t xml:space="preserve">fn_GetConfigValue </w:t>
+      </w:r>
+    </w:p>
+    <w:p>
+      <w:pPr>
+        <w:pStyle w:val="ListParagraph"/>
+        <w:numPr>
+          <w:ilvl w:val="1"/>
+          <w:numId w:val="10"/>
+        </w:numPr>
+      </w:pPr>
+      <w:r>
+        <w:t xml:space="preserve">takes a setting name </w:t>
+      </w:r>
+    </w:p>
+    <w:p>
+      <w:pPr>
+        <w:pStyle w:val="ListParagraph"/>
+        <w:numPr>
+          <w:ilvl w:val="1"/>
+          <w:numId w:val="10"/>
+        </w:numPr>
+      </w:pPr>
+      <w:r>
+        <w:t xml:space="preserve">returns its value from the Configuration table. </w:t>
+      </w:r>
+    </w:p>
+    <w:p>
+      <w:pPr>
+        <w:pStyle w:val="ListParagraph"/>
+        <w:numPr>
+          <w:ilvl w:val="0"/>
+          <w:numId w:val="10"/>
+        </w:numPr>
+      </w:pPr>
       <w:r>
         <w:rPr>
           <w:b/>
           <w:bCs/>
         </w:rPr>
+        <w:t>fn_GetBuildTime</w:t>
+      </w:r>
+      <w:r>
         <w:t xml:space="preserve"> </w:t>
       </w:r>
     </w:p>
@@ -2261,7 +2794,7 @@
         </w:numPr>
       </w:pPr>
       <w:r>
-        <w:t xml:space="preserve">takes a setting name </w:t>
+        <w:t xml:space="preserve">accepts a skill level and a pre-computed random seed between 0.0 and 1.0 </w:t>
       </w:r>
     </w:p>
     <w:p>
@@ -2273,7 +2806,7 @@
         </w:numPr>
       </w:pPr>
       <w:r>
-        <w:t xml:space="preserve">returns its value from the Configuration table. </w:t>
+        <w:t xml:space="preserve">returns a build time mapped linearly across the configured variance range around the base time for that skill. </w:t>
       </w:r>
     </w:p>
     <w:p>
@@ -2284,60 +2817,13 @@
           <w:numId w:val="10"/>
         </w:numPr>
       </w:pPr>
-      <w:proofErr w:type="spellStart"/>
       <w:r>
         <w:rPr>
           <w:b/>
           <w:bCs/>
         </w:rPr>
-        <w:t>fn_GetBuildTime</w:t>
-      </w:r>
-      <w:proofErr w:type="spellEnd"/>
-      <w:r>
-        <w:t xml:space="preserve"> </w:t>
-      </w:r>
-    </w:p>
-    <w:p>
-      <w:pPr>
-        <w:pStyle w:val="ListParagraph"/>
-        <w:numPr>
-          <w:ilvl w:val="1"/>
-          <w:numId w:val="10"/>
-        </w:numPr>
-      </w:pPr>
-      <w:r>
-        <w:t xml:space="preserve">accepts a skill level and a pre-computed random seed between 0.0 and 1.0 </w:t>
-      </w:r>
-    </w:p>
-    <w:p>
-      <w:pPr>
-        <w:pStyle w:val="ListParagraph"/>
-        <w:numPr>
-          <w:ilvl w:val="1"/>
-          <w:numId w:val="10"/>
-        </w:numPr>
-      </w:pPr>
-      <w:r>
-        <w:t xml:space="preserve">returns a build time mapped linearly across the configured variance range around the base time for that skill. </w:t>
-      </w:r>
-    </w:p>
-    <w:p>
-      <w:pPr>
-        <w:pStyle w:val="ListParagraph"/>
-        <w:numPr>
-          <w:ilvl w:val="0"/>
-          <w:numId w:val="10"/>
-        </w:numPr>
-      </w:pPr>
-      <w:proofErr w:type="spellStart"/>
-      <w:r>
-        <w:rPr>
-          <w:b/>
-          <w:bCs/>
-        </w:rPr>
         <w:t>fn_GetDefectRate</w:t>
       </w:r>
-      <w:proofErr w:type="spellEnd"/>
       <w:r>
         <w:t xml:space="preserve"> </w:t>
       </w:r>
@@ -2360,26 +2846,12 @@
     <w:p/>
     <w:p>
       <w:r>
-        <w:lastRenderedPageBreak/>
         <w:t xml:space="preserve">Three views simplify the C# data access layer. </w:t>
       </w:r>
     </w:p>
     <w:p>
-      <w:proofErr w:type="spellStart"/>
-      <w:r>
-        <w:t>vw_WorkstationStatus</w:t>
-      </w:r>
-      <w:proofErr w:type="spellEnd"/>
-      <w:r>
-        <w:t xml:space="preserve"> joins Workstation, Worker, </w:t>
-      </w:r>
-      <w:proofErr w:type="spellStart"/>
-      <w:r>
-        <w:t>WorkstationBin</w:t>
-      </w:r>
-      <w:proofErr w:type="spellEnd"/>
-      <w:r>
-        <w:t>, and Part to produce one flat row per part per station, including</w:t>
+      <w:r>
+        <w:t>vw_WorkstationStatus joins Workstation, Worker, WorkstationBin, and Part to produce one flat row per part per station, including</w:t>
       </w:r>
       <w:r>
         <w:t>:</w:t>
@@ -2418,38 +2890,17 @@
         </w:numPr>
       </w:pPr>
       <w:r>
-        <w:t xml:space="preserve">an </w:t>
-      </w:r>
-      <w:proofErr w:type="spellStart"/>
-      <w:r>
-        <w:t>isLowStock</w:t>
-      </w:r>
-      <w:proofErr w:type="spellEnd"/>
-      <w:r>
-        <w:t xml:space="preserve"> flag computed inline against the configuration threshold. </w:t>
-      </w:r>
-    </w:p>
-    <w:p>
-      <w:pPr>
-        <w:pStyle w:val="ListParagraph"/>
-      </w:pPr>
-    </w:p>
-    <w:p>
-      <w:proofErr w:type="spellStart"/>
-      <w:r>
-        <w:t>vw_ProductionSummary</w:t>
-      </w:r>
-      <w:proofErr w:type="spellEnd"/>
-      <w:r>
-        <w:t xml:space="preserve"> aggregates the entire </w:t>
-      </w:r>
-      <w:proofErr w:type="spellStart"/>
-      <w:r>
-        <w:t>ProductionLog</w:t>
-      </w:r>
-      <w:proofErr w:type="spellEnd"/>
-      <w:r>
-        <w:t xml:space="preserve"> to produce the Kanban board metrics: </w:t>
+        <w:t xml:space="preserve">an isLowStock flag computed inline against the configuration threshold. </w:t>
+      </w:r>
+    </w:p>
+    <w:p>
+      <w:pPr>
+        <w:pStyle w:val="ListParagraph"/>
+      </w:pPr>
+    </w:p>
+    <w:p>
+      <w:r>
+        <w:t xml:space="preserve">vw_ProductionSummary aggregates the entire ProductionLog to produce the Kanban board metrics: </w:t>
       </w:r>
     </w:p>
     <w:p>
@@ -2509,6 +2960,7 @@
         </w:numPr>
       </w:pPr>
       <w:r>
+        <w:lastRenderedPageBreak/>
         <w:t xml:space="preserve">remaining order quantity. </w:t>
       </w:r>
     </w:p>
@@ -2518,29 +2970,8 @@
       </w:pPr>
     </w:p>
     <w:p>
-      <w:proofErr w:type="spellStart"/>
-      <w:r>
-        <w:t>vw_ActiveAlerts</w:t>
-      </w:r>
-      <w:proofErr w:type="spellEnd"/>
-      <w:r>
-        <w:t xml:space="preserve"> joins </w:t>
-      </w:r>
-      <w:proofErr w:type="spellStart"/>
-      <w:r>
-        <w:t>LowStockAlert</w:t>
-      </w:r>
-      <w:proofErr w:type="spellEnd"/>
-      <w:r>
-        <w:t xml:space="preserve"> with Workstation, Part, and </w:t>
-      </w:r>
-      <w:proofErr w:type="spellStart"/>
-      <w:r>
-        <w:t>WorkstationBin</w:t>
-      </w:r>
-      <w:proofErr w:type="spellEnd"/>
-      <w:r>
-        <w:t xml:space="preserve"> to produce actionable rows for the Runner Display, showing </w:t>
+      <w:r>
+        <w:t xml:space="preserve">vw_ActiveAlerts joins LowStockAlert with Workstation, Part, and WorkstationBin to produce actionable rows for the Runner Display, showing </w:t>
       </w:r>
     </w:p>
     <w:p>
@@ -2576,7 +3007,7 @@
           <w:color w:val="auto"/>
         </w:rPr>
       </w:pPr>
-      <w:bookmarkStart w:id="12" w:name="_Toc227281524"/>
+      <w:bookmarkStart w:id="12" w:name="_Toc227285427"/>
       <w:r>
         <w:rPr>
           <w:color w:val="auto"/>
@@ -2592,15 +3023,7 @@
     </w:p>
     <w:p>
       <w:r>
-        <w:t>The P</w:t>
-      </w:r>
-      <w:proofErr w:type="spellStart"/>
-      <w:r>
-        <w:t>roductionLog</w:t>
-      </w:r>
-      <w:proofErr w:type="spellEnd"/>
-      <w:r>
-        <w:t xml:space="preserve"> table received three indices: </w:t>
+        <w:t xml:space="preserve">The ProductionLog table received three indices: </w:t>
       </w:r>
     </w:p>
     <w:p>
@@ -2612,15 +3035,7 @@
         </w:numPr>
       </w:pPr>
       <w:r>
-        <w:t xml:space="preserve">one on </w:t>
-      </w:r>
-      <w:proofErr w:type="spellStart"/>
-      <w:r>
-        <w:t>stationID</w:t>
-      </w:r>
-      <w:proofErr w:type="spellEnd"/>
-      <w:r>
-        <w:t xml:space="preserve"> for per-station filtering </w:t>
+        <w:t xml:space="preserve">one on stationID for per-station filtering </w:t>
       </w:r>
     </w:p>
     <w:p>
@@ -2644,52 +3059,12 @@
         </w:numPr>
       </w:pPr>
       <w:r>
-        <w:t xml:space="preserve">one on </w:t>
-      </w:r>
-      <w:proofErr w:type="spellStart"/>
-      <w:r>
-        <w:t>passedQA</w:t>
-      </w:r>
-      <w:proofErr w:type="spellEnd"/>
-      <w:r>
-        <w:t xml:space="preserve"> with </w:t>
-      </w:r>
-      <w:proofErr w:type="spellStart"/>
-      <w:r>
-        <w:t>stationID</w:t>
-      </w:r>
-      <w:proofErr w:type="spellEnd"/>
-      <w:r>
-        <w:t xml:space="preserve"> and </w:t>
-      </w:r>
-      <w:proofErr w:type="spellStart"/>
-      <w:r>
-        <w:t>workerID</w:t>
-      </w:r>
-      <w:proofErr w:type="spellEnd"/>
-      <w:r>
-        <w:t xml:space="preserve"> as included columns to cover the yield calculation in </w:t>
-      </w:r>
-      <w:proofErr w:type="spellStart"/>
-      <w:r>
-        <w:t>vw_ProductionSummary</w:t>
-      </w:r>
-      <w:proofErr w:type="spellEnd"/>
-      <w:r>
-        <w:t xml:space="preserve"> without requiring a key lookup. </w:t>
-      </w:r>
-    </w:p>
-    <w:p>
-      <w:r>
-        <w:t xml:space="preserve">The </w:t>
-      </w:r>
-      <w:proofErr w:type="spellStart"/>
-      <w:r>
-        <w:t>WorkstationBin</w:t>
-      </w:r>
-      <w:proofErr w:type="spellEnd"/>
-      <w:r>
-        <w:t xml:space="preserve"> table received </w:t>
+        <w:t xml:space="preserve">one on passedQA with stationID and workerID as included columns to cover the yield calculation in vw_ProductionSummary without requiring a key lookup. </w:t>
+      </w:r>
+    </w:p>
+    <w:p>
+      <w:r>
+        <w:t xml:space="preserve">The WorkstationBin table received </w:t>
       </w:r>
     </w:p>
     <w:p>
@@ -2701,23 +3076,7 @@
         </w:numPr>
       </w:pPr>
       <w:r>
-        <w:t xml:space="preserve">an index on </w:t>
-      </w:r>
-      <w:proofErr w:type="spellStart"/>
-      <w:r>
-        <w:t>stationID</w:t>
-      </w:r>
-      <w:proofErr w:type="spellEnd"/>
-      <w:r>
-        <w:t xml:space="preserve"> including </w:t>
-      </w:r>
-      <w:proofErr w:type="spellStart"/>
-      <w:r>
-        <w:t>partID</w:t>
-      </w:r>
-      <w:proofErr w:type="spellEnd"/>
-      <w:r>
-        <w:t xml:space="preserve">  </w:t>
+        <w:t xml:space="preserve">an index on stationID including partID  </w:t>
       </w:r>
     </w:p>
     <w:p>
@@ -2728,11 +3087,9 @@
           <w:numId w:val="15"/>
         </w:numPr>
       </w:pPr>
-      <w:proofErr w:type="spellStart"/>
       <w:r>
         <w:t>currentQuantity</w:t>
       </w:r>
-      <w:proofErr w:type="spellEnd"/>
     </w:p>
     <w:p>
       <w:pPr>
@@ -2743,34 +3100,17 @@
         </w:numPr>
       </w:pPr>
       <w:r>
-        <w:lastRenderedPageBreak/>
-        <w:t xml:space="preserve">allowing </w:t>
-      </w:r>
-      <w:proofErr w:type="spellStart"/>
-      <w:r>
-        <w:t>sp_BuildLamp</w:t>
-      </w:r>
-      <w:proofErr w:type="spellEnd"/>
-      <w:r>
-        <w:t xml:space="preserve"> to check bin levels and perform the decrement UPDATE without scanning the full table. </w:t>
-      </w:r>
-    </w:p>
-    <w:p>
-      <w:pPr>
-        <w:pStyle w:val="ListParagraph"/>
-      </w:pPr>
-    </w:p>
-    <w:p>
-      <w:r>
-        <w:t xml:space="preserve">The </w:t>
-      </w:r>
-      <w:proofErr w:type="spellStart"/>
-      <w:r>
-        <w:t>LowStockAlert</w:t>
-      </w:r>
-      <w:proofErr w:type="spellEnd"/>
-      <w:r>
-        <w:t xml:space="preserve"> table received </w:t>
+        <w:t xml:space="preserve">allowing sp_BuildLamp to check bin levels and perform the decrement UPDATE without scanning the full table. </w:t>
+      </w:r>
+    </w:p>
+    <w:p>
+      <w:pPr>
+        <w:pStyle w:val="ListParagraph"/>
+      </w:pPr>
+    </w:p>
+    <w:p>
+      <w:r>
+        <w:t xml:space="preserve">The LowStockAlert table received </w:t>
       </w:r>
     </w:p>
     <w:p>
@@ -2782,53 +3122,37 @@
         </w:numPr>
       </w:pPr>
       <w:r>
-        <w:t>a filtered index on (</w:t>
-      </w:r>
-      <w:proofErr w:type="spellStart"/>
-      <w:r>
-        <w:t>isResolved</w:t>
-      </w:r>
-      <w:proofErr w:type="spellEnd"/>
-      <w:r>
-        <w:t xml:space="preserve">, </w:t>
-      </w:r>
-      <w:proofErr w:type="spellStart"/>
-      <w:r>
-        <w:t>stationID</w:t>
-      </w:r>
-      <w:proofErr w:type="spellEnd"/>
-      <w:r>
-        <w:t xml:space="preserve">) WHERE </w:t>
-      </w:r>
-      <w:proofErr w:type="spellStart"/>
-      <w:r>
-        <w:t>isResolved</w:t>
-      </w:r>
-      <w:proofErr w:type="spellEnd"/>
-      <w:r>
-        <w:t xml:space="preserve"> = 0, so only active alerts are indexed; this keeps the index small and makes the Runner Display query fast regardless of how many resolved historical alerts accumulate over time.</w:t>
+        <w:t>a filtered index on (isResolved, stationID) WHERE isResolved = 0, so only active alerts are indexed; this keeps the index small and makes the Runner Display query fast regardless of how many resolved historical alerts accumulate over time.</w:t>
       </w:r>
     </w:p>
     <w:p>
       <w:pPr>
         <w:pStyle w:val="Heading1"/>
-        <w:shd w:val="clear" w:color="auto" w:fill="D1D1D1" w:themeFill="background2" w:themeFillShade="E6"/>
         <w:rPr>
           <w:rFonts w:ascii="Aptos" w:hAnsi="Aptos"/>
           <w:b/>
           <w:bCs/>
           <w:color w:val="000000" w:themeColor="text1"/>
         </w:rPr>
-      </w:pPr>
-      <w:r>
+        <w:sectPr>
+          <w:pgSz w:w="12240" w:h="15840"/>
+          <w:pgMar w:top="1440" w:right="1440" w:bottom="1440" w:left="1440" w:header="708" w:footer="708" w:gutter="0"/>
+          <w:cols w:space="708"/>
+          <w:docGrid w:linePitch="360"/>
+        </w:sectPr>
+      </w:pPr>
+    </w:p>
+    <w:p>
+      <w:pPr>
+        <w:pStyle w:val="Heading1"/>
         <w:rPr>
           <w:rFonts w:ascii="Aptos" w:hAnsi="Aptos"/>
           <w:b/>
           <w:bCs/>
           <w:color w:val="000000" w:themeColor="text1"/>
         </w:rPr>
-        <w:t xml:space="preserve">5. </w:t>
-      </w:r>
+      </w:pPr>
+      <w:bookmarkStart w:id="13" w:name="_Toc227285428"/>
       <w:r>
         <w:rPr>
           <w:rFonts w:ascii="Aptos" w:hAnsi="Aptos"/>
@@ -2836,8 +3160,19 @@
           <w:bCs/>
           <w:color w:val="000000" w:themeColor="text1"/>
         </w:rPr>
+        <w:lastRenderedPageBreak/>
+        <w:t xml:space="preserve">5. </w:t>
+      </w:r>
+      <w:r>
+        <w:rPr>
+          <w:rFonts w:ascii="Aptos" w:hAnsi="Aptos"/>
+          <w:b/>
+          <w:bCs/>
+          <w:color w:val="000000" w:themeColor="text1"/>
+        </w:rPr>
         <w:t>APPLICATION IMPLEMENTATION</w:t>
       </w:r>
+      <w:bookmarkEnd w:id="13"/>
     </w:p>
     <w:p>
       <w:pPr>
@@ -2847,12 +3182,14 @@
           <w:color w:val="auto"/>
         </w:rPr>
       </w:pPr>
+      <w:bookmarkStart w:id="14" w:name="_Toc227285429"/>
       <w:r>
         <w:rPr>
           <w:color w:val="auto"/>
         </w:rPr>
         <w:t>Application Implementation</w:t>
       </w:r>
+      <w:bookmarkEnd w:id="14"/>
     </w:p>
     <w:p>
       <w:r>
@@ -2861,46 +3198,12 @@
     </w:p>
     <w:p>
       <w:r>
-        <w:t xml:space="preserve">Each connects to </w:t>
-      </w:r>
-      <w:proofErr w:type="spellStart"/>
-      <w:r>
-        <w:t>FogLampAssemblyDB</w:t>
-      </w:r>
-      <w:proofErr w:type="spellEnd"/>
-      <w:r>
-        <w:t xml:space="preserve"> using Windows Authentication via the </w:t>
-      </w:r>
-      <w:proofErr w:type="spellStart"/>
-      <w:proofErr w:type="gramStart"/>
-      <w:r>
-        <w:t>System.Data.SqlClient</w:t>
-      </w:r>
-      <w:proofErr w:type="spellEnd"/>
-      <w:proofErr w:type="gramEnd"/>
-      <w:r>
-        <w:t xml:space="preserve"> NuGet package (version 4.9.1). </w:t>
-      </w:r>
-    </w:p>
-    <w:p>
-      <w:r>
-        <w:t xml:space="preserve">The connection string is declared as a named constant </w:t>
-      </w:r>
-      <w:proofErr w:type="spellStart"/>
-      <w:r>
-        <w:t>kConnectionString</w:t>
-      </w:r>
-      <w:proofErr w:type="spellEnd"/>
-      <w:r>
-        <w:t xml:space="preserve"> at the top of each </w:t>
-      </w:r>
-      <w:proofErr w:type="spellStart"/>
-      <w:r>
-        <w:t>MainWindow.xaml.cs</w:t>
-      </w:r>
-      <w:proofErr w:type="spellEnd"/>
-      <w:r>
-        <w:t xml:space="preserve"> file, making it trivial to update for a different SQL Server instance name or for a multi-machine deployment where the database server is on a separate computer.</w:t>
+        <w:t xml:space="preserve">Each connects to FogLampAssemblyDB using Windows Authentication via the System.Data.SqlClient NuGet package (version 4.9.1). </w:t>
+      </w:r>
+    </w:p>
+    <w:p>
+      <w:r>
+        <w:t>The connection string is declared as a named constant kConnectionString at the top of each MainWindow.xaml.cs file, making it trivial to update for a different SQL Server instance name or for a multi-machine deployment where the database server is on a separate computer.</w:t>
       </w:r>
     </w:p>
     <w:p>
@@ -2911,12 +3214,14 @@
           <w:color w:val="auto"/>
         </w:rPr>
       </w:pPr>
+      <w:bookmarkStart w:id="15" w:name="_Toc227285430"/>
       <w:r>
         <w:rPr>
           <w:color w:val="auto"/>
         </w:rPr>
         <w:t>Configuration Tool</w:t>
       </w:r>
+      <w:bookmarkEnd w:id="15"/>
     </w:p>
     <w:p>
       <w:r>
@@ -2932,23 +3237,7 @@
         </w:numPr>
       </w:pPr>
       <w:r>
-        <w:t xml:space="preserve">On startup it executes a SELECT against the Configuration table and fills a </w:t>
-      </w:r>
-      <w:proofErr w:type="spellStart"/>
-      <w:r>
-        <w:t>DataTable</w:t>
-      </w:r>
-      <w:proofErr w:type="spellEnd"/>
-      <w:r>
-        <w:t xml:space="preserve"> via </w:t>
-      </w:r>
-      <w:proofErr w:type="spellStart"/>
-      <w:r>
-        <w:t>SqlDataAdapter</w:t>
-      </w:r>
-      <w:proofErr w:type="spellEnd"/>
-      <w:r>
-        <w:t xml:space="preserve">. </w:t>
+        <w:t xml:space="preserve">On startup it executes a SELECT against the Configuration table and fills a DataTable via SqlDataAdapter. </w:t>
       </w:r>
     </w:p>
     <w:p>
@@ -2960,15 +3249,7 @@
         </w:numPr>
       </w:pPr>
       <w:r>
-        <w:t xml:space="preserve">The </w:t>
-      </w:r>
-      <w:proofErr w:type="spellStart"/>
-      <w:r>
-        <w:t>DataTable</w:t>
-      </w:r>
-      <w:proofErr w:type="spellEnd"/>
-      <w:r>
-        <w:t xml:space="preserve"> is bound directly to a WPF DataGrid, making all rows immediately editable in-place. </w:t>
+        <w:t xml:space="preserve">The DataTable is bound directly to a WPF DataGrid, making all rows immediately editable in-place. </w:t>
       </w:r>
     </w:p>
     <w:p>
@@ -2980,31 +3261,7 @@
         </w:numPr>
       </w:pPr>
       <w:r>
-        <w:t xml:space="preserve">A </w:t>
-      </w:r>
-      <w:proofErr w:type="spellStart"/>
-      <w:r>
-        <w:t>SqlCommandBuilder</w:t>
-      </w:r>
-      <w:proofErr w:type="spellEnd"/>
-      <w:r>
-        <w:t xml:space="preserve"> generates the UPDATE command automatically from the SELECT statement, so clicking Save Changes calls </w:t>
-      </w:r>
-      <w:proofErr w:type="spellStart"/>
-      <w:r>
-        <w:t>dataAdapter.Update</w:t>
-      </w:r>
-      <w:proofErr w:type="spellEnd"/>
-      <w:r>
-        <w:t>(</w:t>
-      </w:r>
-      <w:proofErr w:type="spellStart"/>
-      <w:r>
-        <w:t>configTable</w:t>
-      </w:r>
-      <w:proofErr w:type="spellEnd"/>
-      <w:r>
-        <w:t xml:space="preserve">) and all modified rows are committed in a single operation. </w:t>
+        <w:t xml:space="preserve">A SqlCommandBuilder generates the UPDATE command automatically from the SELECT statement, so clicking Save Changes calls dataAdapter.Update(configTable) and all modified rows are committed in a single operation. </w:t>
       </w:r>
     </w:p>
     <w:p>
@@ -3016,23 +3273,7 @@
         </w:numPr>
       </w:pPr>
       <w:r>
-        <w:t xml:space="preserve">The </w:t>
-      </w:r>
-      <w:proofErr w:type="spellStart"/>
-      <w:r>
-        <w:t>configID</w:t>
-      </w:r>
-      <w:proofErr w:type="spellEnd"/>
-      <w:r>
-        <w:t xml:space="preserve"> column is set to </w:t>
-      </w:r>
-      <w:proofErr w:type="spellStart"/>
-      <w:r>
-        <w:t>ReadOnly</w:t>
-      </w:r>
-      <w:proofErr w:type="spellEnd"/>
-      <w:r>
-        <w:t xml:space="preserve"> = true in code to prevent accidental primary key modification. </w:t>
+        <w:t xml:space="preserve">The configID column is set to ReadOnly = true in code to prevent accidental primary key modification. </w:t>
       </w:r>
     </w:p>
     <w:p>
@@ -3044,15 +3285,7 @@
         </w:numPr>
       </w:pPr>
       <w:r>
-        <w:t xml:space="preserve">A Reset Simulation button calls </w:t>
-      </w:r>
-      <w:proofErr w:type="spellStart"/>
-      <w:r>
-        <w:t>sp_ResetSimulation</w:t>
-      </w:r>
-      <w:proofErr w:type="spellEnd"/>
-      <w:r>
-        <w:t xml:space="preserve"> after a Yes/No confirmation dialog, clearing all logs and restoring bin counts to their defaults.</w:t>
+        <w:t>A Reset Simulation button calls sp_ResetSimulation after a Yes/No confirmation dialog, clearing all logs and restoring bin counts to their defaults.</w:t>
       </w:r>
     </w:p>
     <w:p>
@@ -3063,12 +3296,14 @@
           <w:color w:val="auto"/>
         </w:rPr>
       </w:pPr>
+      <w:bookmarkStart w:id="16" w:name="_Toc227285431"/>
       <w:r>
         <w:rPr>
           <w:color w:val="auto"/>
         </w:rPr>
         <w:t>Workstation Simulation</w:t>
       </w:r>
+      <w:bookmarkEnd w:id="16"/>
     </w:p>
     <w:p>
       <w:r>
@@ -3077,24 +3312,7 @@
     </w:p>
     <w:p>
       <w:r>
-        <w:lastRenderedPageBreak/>
-        <w:t xml:space="preserve">On start, the selected station ID is </w:t>
-      </w:r>
-      <w:proofErr w:type="gramStart"/>
-      <w:r>
-        <w:t>recorded</w:t>
-      </w:r>
-      <w:proofErr w:type="gramEnd"/>
-      <w:r>
-        <w:t xml:space="preserve"> and a background Thread is launched that loops indefinitely, calling </w:t>
-      </w:r>
-      <w:proofErr w:type="spellStart"/>
-      <w:r>
-        <w:t>sp_BuildLamp</w:t>
-      </w:r>
-      <w:proofErr w:type="spellEnd"/>
-      <w:r>
-        <w:t xml:space="preserve"> on each iteration. </w:t>
+        <w:t xml:space="preserve">On start, the selected station ID is recorded and a background Thread is launched that loops indefinitely, calling sp_BuildLamp on each iteration. </w:t>
       </w:r>
     </w:p>
     <w:p>
@@ -3153,15 +3371,7 @@
         </w:numPr>
       </w:pPr>
       <w:r>
-        <w:t xml:space="preserve">the thread reads the </w:t>
-      </w:r>
-      <w:proofErr w:type="spellStart"/>
-      <w:r>
-        <w:t>TimeScaleMultiplier</w:t>
-      </w:r>
-      <w:proofErr w:type="spellEnd"/>
-      <w:r>
-        <w:t xml:space="preserve"> from the Configuration table </w:t>
+        <w:t xml:space="preserve">the thread reads the TimeScaleMultiplier from the Configuration table </w:t>
       </w:r>
     </w:p>
     <w:p>
@@ -3173,23 +3383,7 @@
         </w:numPr>
       </w:pPr>
       <w:r>
-        <w:t xml:space="preserve">calculates the real-world sleep duration as </w:t>
-      </w:r>
-      <w:proofErr w:type="spellStart"/>
-      <w:r>
-        <w:t>buildTime</w:t>
-      </w:r>
-      <w:proofErr w:type="spellEnd"/>
-      <w:r>
-        <w:t xml:space="preserve"> / </w:t>
-      </w:r>
-      <w:proofErr w:type="spellStart"/>
-      <w:r>
-        <w:t>timeScale</w:t>
-      </w:r>
-      <w:proofErr w:type="spellEnd"/>
-      <w:r>
-        <w:t xml:space="preserve"> * 1000 millisecond</w:t>
+        <w:t>calculates the real-world sleep duration as buildTime / timeScale * 1000 millisecond</w:t>
       </w:r>
       <w:r>
         <w:t>s</w:t>
@@ -3207,15 +3401,7 @@
         </w:numPr>
       </w:pPr>
       <w:r>
-        <w:t xml:space="preserve">then arms the stopwatch by writing the current tick count and sleep duration to three shared fields before calling </w:t>
-      </w:r>
-      <w:proofErr w:type="spellStart"/>
-      <w:r>
-        <w:t>Thread.Sleep</w:t>
-      </w:r>
-      <w:proofErr w:type="spellEnd"/>
-      <w:r>
-        <w:t xml:space="preserve">. </w:t>
+        <w:t xml:space="preserve">then arms the stopwatch by writing the current tick count and sleep duration to three shared fields before calling Thread.Sleep. </w:t>
       </w:r>
     </w:p>
     <w:p>
@@ -3233,15 +3419,7 @@
     <w:p/>
     <w:p>
       <w:r>
-        <w:t xml:space="preserve">The stopwatch label and progress bar are driven by a separate </w:t>
-      </w:r>
-      <w:proofErr w:type="spellStart"/>
-      <w:r>
-        <w:t>DispatcherTimer</w:t>
-      </w:r>
-      <w:proofErr w:type="spellEnd"/>
-      <w:r>
-        <w:t xml:space="preserve"> firing every 100 milliseconds on the UI thread. </w:t>
+        <w:t xml:space="preserve">The stopwatch label and progress bar are driven by a separate DispatcherTimer firing every 100 milliseconds on the UI thread. </w:t>
       </w:r>
     </w:p>
     <w:p>
@@ -3276,15 +3454,7 @@
         </w:numPr>
       </w:pPr>
       <w:r>
-        <w:t xml:space="preserve">formats the result as </w:t>
-      </w:r>
-      <w:proofErr w:type="gramStart"/>
-      <w:r>
-        <w:t>M:SS.cc</w:t>
-      </w:r>
-      <w:proofErr w:type="gramEnd"/>
-      <w:r>
-        <w:t xml:space="preserve"> </w:t>
+        <w:t xml:space="preserve">formats the result as M:SS.cc </w:t>
       </w:r>
     </w:p>
     <w:p>
@@ -3327,33 +3497,18 @@
           <w:color w:val="auto"/>
         </w:rPr>
       </w:pPr>
+      <w:bookmarkStart w:id="17" w:name="_Toc227285432"/>
       <w:r>
         <w:rPr>
           <w:color w:val="auto"/>
         </w:rPr>
-        <w:lastRenderedPageBreak/>
         <w:t>Workstation Andon Display</w:t>
       </w:r>
-    </w:p>
-    <w:p>
-      <w:r>
-        <w:t xml:space="preserve">The Workstation Andon Display uses a </w:t>
-      </w:r>
-      <w:proofErr w:type="spellStart"/>
-      <w:r>
-        <w:t>DispatcherTimer</w:t>
-      </w:r>
-      <w:proofErr w:type="spellEnd"/>
-      <w:r>
-        <w:t xml:space="preserve"> to poll </w:t>
-      </w:r>
-      <w:proofErr w:type="spellStart"/>
-      <w:r>
-        <w:t>vw_WorkstationStatus</w:t>
-      </w:r>
-      <w:proofErr w:type="spellEnd"/>
-      <w:r>
-        <w:t xml:space="preserve"> for a user-selected station every two seconds. </w:t>
+      <w:bookmarkEnd w:id="17"/>
+    </w:p>
+    <w:p>
+      <w:r>
+        <w:t xml:space="preserve">The Workstation Andon Display uses a DispatcherTimer to poll vw_WorkstationStatus for a user-selected station every two seconds. </w:t>
       </w:r>
     </w:p>
     <w:p>
@@ -3373,21 +3528,14 @@
         </w:numPr>
       </w:pPr>
       <w:r>
+        <w:lastRenderedPageBreak/>
         <w:t>six rows (one per part) and assigns them to the DataGrid</w:t>
       </w:r>
       <w:r>
         <w:t>’</w:t>
       </w:r>
       <w:r>
-        <w:t>s I</w:t>
-      </w:r>
-      <w:proofErr w:type="spellStart"/>
-      <w:r>
-        <w:t>temsSource</w:t>
-      </w:r>
-      <w:proofErr w:type="spellEnd"/>
-      <w:r>
-        <w:t xml:space="preserve"> as a new List. </w:t>
+        <w:t xml:space="preserve">s ItemsSource as a new List. </w:t>
       </w:r>
     </w:p>
     <w:p>
@@ -3398,23 +3546,7 @@
     </w:p>
     <w:p>
       <w:r>
-        <w:t xml:space="preserve">A </w:t>
-      </w:r>
-      <w:proofErr w:type="spellStart"/>
-      <w:r>
-        <w:t>DataTrigger</w:t>
-      </w:r>
-      <w:proofErr w:type="spellEnd"/>
-      <w:r>
-        <w:t xml:space="preserve"> in the row style sets the row background to red and the text to white whenever the </w:t>
-      </w:r>
-      <w:proofErr w:type="spellStart"/>
-      <w:r>
-        <w:t>IsLow</w:t>
-      </w:r>
-      <w:proofErr w:type="spellEnd"/>
-      <w:r>
-        <w:t xml:space="preserve"> property is true, giving the assembler an immediate visual indication that a runner is needed. </w:t>
+        <w:t xml:space="preserve">A DataTrigger in the row style sets the row background to red and the text to white whenever the IsLow property is true, giving the assembler an immediate visual indication that a runner is needed. </w:t>
       </w:r>
     </w:p>
     <w:p>
@@ -3437,15 +3569,7 @@
         <w:t>!</w:t>
       </w:r>
       <w:r>
-        <w:t xml:space="preserve"> BIN LOW is shown or collapsed based on whether any part in the current refresh reports </w:t>
-      </w:r>
-      <w:proofErr w:type="spellStart"/>
-      <w:r>
-        <w:t>IsLow</w:t>
-      </w:r>
-      <w:proofErr w:type="spellEnd"/>
-      <w:r>
-        <w:t xml:space="preserve">. </w:t>
+        <w:t xml:space="preserve"> BIN LOW is shown or collapsed based on whether any part in the current refresh reports IsLow. </w:t>
       </w:r>
     </w:p>
     <w:p>
@@ -3458,6 +3582,491 @@
       </w:pPr>
       <w:r>
         <w:t>The station status label turns red for Blocked and green for Running. The application is designed to run as multiple instances simultaneously, with one instance per active workstation, each monitoring its own station through the dropdown selector.</w:t>
+      </w:r>
+    </w:p>
+    <w:p>
+      <w:pPr>
+        <w:pStyle w:val="Heading2"/>
+        <w:shd w:val="clear" w:color="auto" w:fill="A5C9EB" w:themeFill="text2" w:themeFillTint="40"/>
+        <w:rPr>
+          <w:color w:val="auto"/>
+        </w:rPr>
+      </w:pPr>
+      <w:bookmarkStart w:id="18" w:name="_Toc227285433"/>
+      <w:r>
+        <w:rPr>
+          <w:color w:val="auto"/>
+        </w:rPr>
+        <w:t>Runner Display</w:t>
+      </w:r>
+      <w:bookmarkEnd w:id="18"/>
+    </w:p>
+    <w:p>
+      <w:r>
+        <w:t xml:space="preserve">The Runner Display polls vw_ActiveAlerts every two seconds and populates a DataGrid. Because every visible row represents a bin that needs immediate action, all rows are styled with a bright red background and white bold text so the alerts cannot be overlooked. </w:t>
+      </w:r>
+    </w:p>
+    <w:p>
+      <w:r>
+        <w:t>An alert count banner above the grid switches between a green background reading all bins OK and a red background reading ACTION REQUIRED: N bin(s) need replacement! depending on whether any active alerts exist at the time of the refresh.</w:t>
+      </w:r>
+    </w:p>
+    <w:p>
+      <w:r>
+        <w:t>The runner has two action buttons</w:t>
+      </w:r>
+      <w:r>
+        <w:t>:</w:t>
+      </w:r>
+    </w:p>
+    <w:p>
+      <w:pPr>
+        <w:pStyle w:val="ListParagraph"/>
+        <w:numPr>
+          <w:ilvl w:val="0"/>
+          <w:numId w:val="21"/>
+        </w:numPr>
+      </w:pPr>
+      <w:r>
+        <w:t xml:space="preserve">Refill Selected Station </w:t>
+      </w:r>
+    </w:p>
+    <w:p>
+      <w:pPr>
+        <w:pStyle w:val="ListParagraph"/>
+        <w:numPr>
+          <w:ilvl w:val="1"/>
+          <w:numId w:val="21"/>
+        </w:numPr>
+      </w:pPr>
+      <w:r>
+        <w:t xml:space="preserve">reads the stationID from the currently selected DataGrid row  </w:t>
+      </w:r>
+    </w:p>
+    <w:p>
+      <w:pPr>
+        <w:pStyle w:val="ListParagraph"/>
+        <w:numPr>
+          <w:ilvl w:val="1"/>
+          <w:numId w:val="21"/>
+        </w:numPr>
+      </w:pPr>
+      <w:r>
+        <w:t xml:space="preserve">calls sp_RefillAllBins for that station, simulating the runner pressing a physical button at the bin after replacing it. </w:t>
+      </w:r>
+    </w:p>
+    <w:p>
+      <w:pPr>
+        <w:pStyle w:val="ListParagraph"/>
+        <w:numPr>
+          <w:ilvl w:val="0"/>
+          <w:numId w:val="21"/>
+        </w:numPr>
+      </w:pPr>
+      <w:r>
+        <w:t xml:space="preserve">Refill All Stations </w:t>
+      </w:r>
+    </w:p>
+    <w:p>
+      <w:pPr>
+        <w:pStyle w:val="ListParagraph"/>
+        <w:numPr>
+          <w:ilvl w:val="1"/>
+          <w:numId w:val="21"/>
+        </w:numPr>
+      </w:pPr>
+      <w:r>
+        <w:t xml:space="preserve">queries all distinct station IDs currently in vw_ActiveAlerts  </w:t>
+      </w:r>
+    </w:p>
+    <w:p>
+      <w:pPr>
+        <w:pStyle w:val="ListParagraph"/>
+        <w:numPr>
+          <w:ilvl w:val="1"/>
+          <w:numId w:val="21"/>
+        </w:numPr>
+      </w:pPr>
+      <w:r>
+        <w:t xml:space="preserve">calls sp_RefillAllBins for each one, handling the case where multiple stations need attention simultaneously. </w:t>
+      </w:r>
+    </w:p>
+    <w:p>
+      <w:pPr>
+        <w:pStyle w:val="ListParagraph"/>
+        <w:numPr>
+          <w:ilvl w:val="0"/>
+          <w:numId w:val="21"/>
+        </w:numPr>
+      </w:pPr>
+      <w:r>
+        <w:t>Both buttons refresh the grid immediately after completion so the runner can confirm the alerts have cleared.</w:t>
+      </w:r>
+    </w:p>
+    <w:p>
+      <w:pPr>
+        <w:pStyle w:val="Heading2"/>
+        <w:shd w:val="clear" w:color="auto" w:fill="A5C9EB" w:themeFill="text2" w:themeFillTint="40"/>
+        <w:rPr>
+          <w:color w:val="auto"/>
+        </w:rPr>
+      </w:pPr>
+      <w:bookmarkStart w:id="19" w:name="_Toc227285434"/>
+      <w:r>
+        <w:rPr>
+          <w:color w:val="auto"/>
+        </w:rPr>
+        <w:lastRenderedPageBreak/>
+        <w:t>Assembly Line Kanban</w:t>
+      </w:r>
+      <w:r>
+        <w:rPr>
+          <w:color w:val="auto"/>
+        </w:rPr>
+        <w:t xml:space="preserve"> Board</w:t>
+      </w:r>
+      <w:bookmarkEnd w:id="19"/>
+    </w:p>
+    <w:p>
+      <w:r>
+        <w:t xml:space="preserve">The Assembly Line Kanban Board uses a DispatcherTimer to run two queries every two seconds. </w:t>
+      </w:r>
+    </w:p>
+    <w:p>
+      <w:pPr>
+        <w:pStyle w:val="ListParagraph"/>
+        <w:numPr>
+          <w:ilvl w:val="0"/>
+          <w:numId w:val="22"/>
+        </w:numPr>
+      </w:pPr>
+      <w:r>
+        <w:t xml:space="preserve">The first query </w:t>
+      </w:r>
+    </w:p>
+    <w:p>
+      <w:pPr>
+        <w:pStyle w:val="ListParagraph"/>
+        <w:numPr>
+          <w:ilvl w:val="1"/>
+          <w:numId w:val="22"/>
+        </w:numPr>
+      </w:pPr>
+      <w:r>
+        <w:t xml:space="preserve">reads vw_ProductionSummary </w:t>
+      </w:r>
+    </w:p>
+    <w:p>
+      <w:pPr>
+        <w:pStyle w:val="ListParagraph"/>
+        <w:numPr>
+          <w:ilvl w:val="1"/>
+          <w:numId w:val="22"/>
+        </w:numPr>
+      </w:pPr>
+      <w:r>
+        <w:t xml:space="preserve">populates four large metric tiles arranged in a row: </w:t>
+      </w:r>
+    </w:p>
+    <w:p>
+      <w:pPr>
+        <w:pStyle w:val="ListParagraph"/>
+        <w:numPr>
+          <w:ilvl w:val="2"/>
+          <w:numId w:val="22"/>
+        </w:numPr>
+      </w:pPr>
+      <w:r>
+        <w:t>ORDER (the target lamp count from Configuration)</w:t>
+      </w:r>
+    </w:p>
+    <w:p>
+      <w:pPr>
+        <w:pStyle w:val="ListParagraph"/>
+        <w:numPr>
+          <w:ilvl w:val="2"/>
+          <w:numId w:val="22"/>
+        </w:numPr>
+      </w:pPr>
+      <w:r>
+        <w:t xml:space="preserve">IN-PROCESS (a direct COUNT of Running workstations) </w:t>
+      </w:r>
+    </w:p>
+    <w:p>
+      <w:pPr>
+        <w:pStyle w:val="ListParagraph"/>
+        <w:numPr>
+          <w:ilvl w:val="2"/>
+          <w:numId w:val="22"/>
+        </w:numPr>
+      </w:pPr>
+      <w:r>
+        <w:t>PRODUCED (total passed lamps logged to date)</w:t>
+      </w:r>
+    </w:p>
+    <w:p>
+      <w:pPr>
+        <w:pStyle w:val="ListParagraph"/>
+        <w:numPr>
+          <w:ilvl w:val="2"/>
+          <w:numId w:val="22"/>
+        </w:numPr>
+      </w:pPr>
+      <w:r>
+        <w:t xml:space="preserve">YIELD (the pass rate as a percentage). </w:t>
+      </w:r>
+    </w:p>
+    <w:p>
+      <w:pPr>
+        <w:pStyle w:val="ListParagraph"/>
+        <w:numPr>
+          <w:ilvl w:val="2"/>
+          <w:numId w:val="22"/>
+        </w:numPr>
+      </w:pPr>
+      <w:r>
+        <w:t>A remaining order label beneath the tiles counts down how many more good lamps are needed to fill the order.</w:t>
+      </w:r>
+    </w:p>
+    <w:p>
+      <w:pPr>
+        <w:pStyle w:val="ListParagraph"/>
+        <w:numPr>
+          <w:ilvl w:val="0"/>
+          <w:numId w:val="22"/>
+        </w:numPr>
+      </w:pPr>
+      <w:r>
+        <w:t>The second query</w:t>
+      </w:r>
+    </w:p>
+    <w:p>
+      <w:pPr>
+        <w:pStyle w:val="ListParagraph"/>
+        <w:numPr>
+          <w:ilvl w:val="1"/>
+          <w:numId w:val="22"/>
+        </w:numPr>
+      </w:pPr>
+      <w:r>
+        <w:t>joins Workstation, Worker, and ProductionLog using LEFT JOIN so that stations with no production yet still appear with zero counts.</w:t>
+      </w:r>
+    </w:p>
+    <w:p>
+      <w:pPr>
+        <w:pStyle w:val="ListParagraph"/>
+        <w:numPr>
+          <w:ilvl w:val="1"/>
+          <w:numId w:val="22"/>
+        </w:numPr>
+      </w:pPr>
+      <w:r>
+        <w:t xml:space="preserve">It groups by station and aggregates </w:t>
+      </w:r>
+    </w:p>
+    <w:p>
+      <w:pPr>
+        <w:pStyle w:val="ListParagraph"/>
+        <w:numPr>
+          <w:ilvl w:val="2"/>
+          <w:numId w:val="22"/>
+        </w:numPr>
+      </w:pPr>
+      <w:r>
+        <w:t xml:space="preserve">total produced </w:t>
+      </w:r>
+    </w:p>
+    <w:p>
+      <w:pPr>
+        <w:pStyle w:val="ListParagraph"/>
+        <w:numPr>
+          <w:ilvl w:val="2"/>
+          <w:numId w:val="22"/>
+        </w:numPr>
+      </w:pPr>
+      <w:r>
+        <w:t xml:space="preserve">passed </w:t>
+      </w:r>
+    </w:p>
+    <w:p>
+      <w:pPr>
+        <w:pStyle w:val="ListParagraph"/>
+        <w:numPr>
+          <w:ilvl w:val="2"/>
+          <w:numId w:val="22"/>
+        </w:numPr>
+      </w:pPr>
+      <w:r>
+        <w:t>failed lamps for each.</w:t>
+      </w:r>
+    </w:p>
+    <w:p>
+      <w:pPr>
+        <w:pStyle w:val="ListParagraph"/>
+        <w:numPr>
+          <w:ilvl w:val="1"/>
+          <w:numId w:val="22"/>
+        </w:numPr>
+      </w:pPr>
+      <w:r>
+        <w:t xml:space="preserve"> The results are bound to a DataGrid below the metric tiles. </w:t>
+      </w:r>
+    </w:p>
+    <w:p>
+      <w:pPr>
+        <w:pStyle w:val="ListParagraph"/>
+        <w:numPr>
+          <w:ilvl w:val="1"/>
+          <w:numId w:val="22"/>
+        </w:numPr>
+        <w:sectPr>
+          <w:pgSz w:w="12240" w:h="15840"/>
+          <w:pgMar w:top="1440" w:right="1440" w:bottom="1440" w:left="1440" w:header="708" w:footer="708" w:gutter="0"/>
+          <w:cols w:space="708"/>
+          <w:docGrid w:linePitch="360"/>
+        </w:sectPr>
+      </w:pPr>
+      <w:r>
+        <w:t>A DataTrigger highlights rows where the station status is Blocked in light red, giving the supervisor a quick view of which stations are stalled while the rest of the line continues runnin</w:t>
+      </w:r>
+      <w:r>
+        <w:t>g.</w:t>
+      </w:r>
+    </w:p>
+    <w:p>
+      <w:pPr>
+        <w:pStyle w:val="Heading1"/>
+        <w:rPr>
+          <w:rFonts w:ascii="Aptos" w:hAnsi="Aptos"/>
+          <w:b/>
+          <w:bCs/>
+          <w:color w:val="000000" w:themeColor="text1"/>
+        </w:rPr>
+      </w:pPr>
+      <w:bookmarkStart w:id="20" w:name="_Toc227285435"/>
+      <w:r>
+        <w:rPr>
+          <w:rFonts w:ascii="Aptos" w:hAnsi="Aptos"/>
+          <w:b/>
+          <w:bCs/>
+          <w:color w:val="000000" w:themeColor="text1"/>
+        </w:rPr>
+        <w:lastRenderedPageBreak/>
+        <w:t xml:space="preserve">6. </w:t>
+      </w:r>
+      <w:r>
+        <w:rPr>
+          <w:rFonts w:ascii="Aptos" w:hAnsi="Aptos"/>
+          <w:b/>
+          <w:bCs/>
+          <w:color w:val="000000" w:themeColor="text1"/>
+        </w:rPr>
+        <w:t>Design Decisions and Challenges</w:t>
+      </w:r>
+      <w:bookmarkEnd w:id="20"/>
+    </w:p>
+    <w:p>
+      <w:pPr>
+        <w:pStyle w:val="Heading2"/>
+        <w:shd w:val="clear" w:color="auto" w:fill="A5C9EB" w:themeFill="text2" w:themeFillTint="40"/>
+        <w:rPr>
+          <w:color w:val="auto"/>
+        </w:rPr>
+      </w:pPr>
+      <w:bookmarkStart w:id="21" w:name="_Toc227285436"/>
+      <w:r>
+        <w:rPr>
+          <w:color w:val="auto"/>
+        </w:rPr>
+        <w:t>True Randomness in SQL</w:t>
+      </w:r>
+      <w:bookmarkEnd w:id="21"/>
+    </w:p>
+    <w:p>
+      <w:r>
+        <w:t>SQL Server</w:t>
+      </w:r>
+      <w:r>
+        <w:t>’</w:t>
+      </w:r>
+      <w:r>
+        <w:t>s RAND() function returns the same value for every call within a single batch, which would cause every lamp to have an identical build time.</w:t>
+      </w:r>
+    </w:p>
+    <w:p>
+      <w:r>
+        <w:t>I resolved this by computing the random seed using CHECKSUM(NEWID()). NEWID() generates a new globally unique identifier on every invocation, and CHECKSUM maps it to an integer. Taking the absolute value modulo 10000 and dividing by 10000.0 produces a float between 0.0 and 1.0 that is genuinely independent on each call. This seed is passed to fn_GetBuildTime for the timing randomness and computed a second time for the QA check, ensuring the two random events are uncorrelated.</w:t>
+      </w:r>
+    </w:p>
+    <w:p>
+      <w:pPr>
+        <w:pStyle w:val="Heading2"/>
+        <w:shd w:val="clear" w:color="auto" w:fill="A5C9EB" w:themeFill="text2" w:themeFillTint="40"/>
+        <w:rPr>
+          <w:color w:val="auto"/>
+        </w:rPr>
+      </w:pPr>
+      <w:r>
+        <w:rPr>
+          <w:color w:val="auto"/>
+        </w:rPr>
+        <w:t>Simulation Timing Correctness</w:t>
+      </w:r>
+    </w:p>
+    <w:p>
+      <w:r>
+        <w:t xml:space="preserve">An early version of the simulation incremented the lamp counter and updated the result display immediately after sp_BuildLamp returned, then called Thread.Sleep for the build duration. </w:t>
+      </w:r>
+    </w:p>
+    <w:p>
+      <w:r>
+        <w:t>This caused the application to show a lamp as produced the instant the stored procedure was called, before any simulated assembly time had passed. A lamp cannot physically be completed at the exact moment a worker starts on it.</w:t>
+      </w:r>
+    </w:p>
+    <w:p>
+      <w:r>
+        <w:t>The fix was to reorder the operations: arm the stopwatch, call Thread.Sleep, and only then increment the counter and update the display. The stored procedure still writes the ProductionLog record at call time, which represents the moment the parts are consumed and assembly begins. The C# counter and result label are updated only after the sleep, representing the moment packaging is complete. This separation matches the physical workflow and produces correct visual behaviour: pressing Start shows the progress bar filling from zero, and the first lamp count appears only after a full build cycle has elapsed.</w:t>
+      </w:r>
+    </w:p>
+    <w:p>
+      <w:pPr>
+        <w:pStyle w:val="Heading2"/>
+        <w:shd w:val="clear" w:color="auto" w:fill="A5C9EB" w:themeFill="text2" w:themeFillTint="40"/>
+        <w:rPr>
+          <w:color w:val="auto"/>
+        </w:rPr>
+      </w:pPr>
+      <w:r>
+        <w:rPr>
+          <w:color w:val="auto"/>
+        </w:rPr>
+        <w:t>Multi-Machine Architecture</w:t>
+      </w:r>
+    </w:p>
+    <w:p>
+      <w:r>
+        <w:t xml:space="preserve">The system is designed so that every component communicates exclusively through the SQL Server database. No direct network connections exist between the five C# applications. </w:t>
+      </w:r>
+    </w:p>
+    <w:p>
+      <w:r>
+        <w:t>This means any program can run on any machine on the network as long as it can reach the database server. Deploying to multiple machines requires only updating the kConnectionString constant in each program to point at the server</w:t>
+      </w:r>
+      <w:r>
+        <w:t>’</w:t>
+      </w:r>
+      <w:r>
+        <w:t xml:space="preserve">s hostname or IP address. For environments where Windows Authentication is not available across </w:t>
+      </w:r>
+      <w:r>
+        <w:lastRenderedPageBreak/>
+        <w:t>machines, the connection string can be switched to SQL Server Authentication by adding a User Id and Password parameter. SQL Server</w:t>
+      </w:r>
+      <w:r>
+        <w:t>’</w:t>
+      </w:r>
+      <w:r>
+        <w:t>s TCP/IP protocol must be enabled and port 1433 opened in the firewall on the server machine.</w:t>
       </w:r>
     </w:p>
     <w:sectPr>
@@ -4187,6 +4796,119 @@
     </w:lvl>
   </w:abstractNum>
   <w:abstractNum w:abstractNumId="6" w15:restartNumberingAfterBreak="0">
+    <w:nsid w:val="25F14132"/>
+    <w:multiLevelType w:val="hybridMultilevel"/>
+    <w:tmpl w:val="A6F0ADEA"/>
+    <w:lvl w:ilvl="0" w:tplc="10090001">
+      <w:start w:val="1"/>
+      <w:numFmt w:val="bullet"/>
+      <w:lvlText w:val=""/>
+      <w:lvlJc w:val="left"/>
+      <w:pPr>
+        <w:ind w:left="720" w:hanging="360"/>
+      </w:pPr>
+      <w:rPr>
+        <w:rFonts w:ascii="Symbol" w:hAnsi="Symbol" w:hint="default"/>
+      </w:rPr>
+    </w:lvl>
+    <w:lvl w:ilvl="1" w:tplc="10090003">
+      <w:start w:val="1"/>
+      <w:numFmt w:val="bullet"/>
+      <w:lvlText w:val="o"/>
+      <w:lvlJc w:val="left"/>
+      <w:pPr>
+        <w:ind w:left="1440" w:hanging="360"/>
+      </w:pPr>
+      <w:rPr>
+        <w:rFonts w:ascii="Courier New" w:hAnsi="Courier New" w:cs="Courier New" w:hint="default"/>
+      </w:rPr>
+    </w:lvl>
+    <w:lvl w:ilvl="2" w:tplc="10090005" w:tentative="1">
+      <w:start w:val="1"/>
+      <w:numFmt w:val="bullet"/>
+      <w:lvlText w:val=""/>
+      <w:lvlJc w:val="left"/>
+      <w:pPr>
+        <w:ind w:left="2160" w:hanging="360"/>
+      </w:pPr>
+      <w:rPr>
+        <w:rFonts w:ascii="Wingdings" w:hAnsi="Wingdings" w:hint="default"/>
+      </w:rPr>
+    </w:lvl>
+    <w:lvl w:ilvl="3" w:tplc="10090001" w:tentative="1">
+      <w:start w:val="1"/>
+      <w:numFmt w:val="bullet"/>
+      <w:lvlText w:val=""/>
+      <w:lvlJc w:val="left"/>
+      <w:pPr>
+        <w:ind w:left="2880" w:hanging="360"/>
+      </w:pPr>
+      <w:rPr>
+        <w:rFonts w:ascii="Symbol" w:hAnsi="Symbol" w:hint="default"/>
+      </w:rPr>
+    </w:lvl>
+    <w:lvl w:ilvl="4" w:tplc="10090003" w:tentative="1">
+      <w:start w:val="1"/>
+      <w:numFmt w:val="bullet"/>
+      <w:lvlText w:val="o"/>
+      <w:lvlJc w:val="left"/>
+      <w:pPr>
+        <w:ind w:left="3600" w:hanging="360"/>
+      </w:pPr>
+      <w:rPr>
+        <w:rFonts w:ascii="Courier New" w:hAnsi="Courier New" w:cs="Courier New" w:hint="default"/>
+      </w:rPr>
+    </w:lvl>
+    <w:lvl w:ilvl="5" w:tplc="10090005" w:tentative="1">
+      <w:start w:val="1"/>
+      <w:numFmt w:val="bullet"/>
+      <w:lvlText w:val=""/>
+      <w:lvlJc w:val="left"/>
+      <w:pPr>
+        <w:ind w:left="4320" w:hanging="360"/>
+      </w:pPr>
+      <w:rPr>
+        <w:rFonts w:ascii="Wingdings" w:hAnsi="Wingdings" w:hint="default"/>
+      </w:rPr>
+    </w:lvl>
+    <w:lvl w:ilvl="6" w:tplc="10090001" w:tentative="1">
+      <w:start w:val="1"/>
+      <w:numFmt w:val="bullet"/>
+      <w:lvlText w:val=""/>
+      <w:lvlJc w:val="left"/>
+      <w:pPr>
+        <w:ind w:left="5040" w:hanging="360"/>
+      </w:pPr>
+      <w:rPr>
+        <w:rFonts w:ascii="Symbol" w:hAnsi="Symbol" w:hint="default"/>
+      </w:rPr>
+    </w:lvl>
+    <w:lvl w:ilvl="7" w:tplc="10090003" w:tentative="1">
+      <w:start w:val="1"/>
+      <w:numFmt w:val="bullet"/>
+      <w:lvlText w:val="o"/>
+      <w:lvlJc w:val="left"/>
+      <w:pPr>
+        <w:ind w:left="5760" w:hanging="360"/>
+      </w:pPr>
+      <w:rPr>
+        <w:rFonts w:ascii="Courier New" w:hAnsi="Courier New" w:cs="Courier New" w:hint="default"/>
+      </w:rPr>
+    </w:lvl>
+    <w:lvl w:ilvl="8" w:tplc="10090005" w:tentative="1">
+      <w:start w:val="1"/>
+      <w:numFmt w:val="bullet"/>
+      <w:lvlText w:val=""/>
+      <w:lvlJc w:val="left"/>
+      <w:pPr>
+        <w:ind w:left="6480" w:hanging="360"/>
+      </w:pPr>
+      <w:rPr>
+        <w:rFonts w:ascii="Wingdings" w:hAnsi="Wingdings" w:hint="default"/>
+      </w:rPr>
+    </w:lvl>
+  </w:abstractNum>
+  <w:abstractNum w:abstractNumId="7" w15:restartNumberingAfterBreak="0">
     <w:nsid w:val="2D183672"/>
     <w:multiLevelType w:val="hybridMultilevel"/>
     <w:tmpl w:val="EB384C80"/>
@@ -4272,7 +4994,7 @@
       </w:pPr>
     </w:lvl>
   </w:abstractNum>
-  <w:abstractNum w:abstractNumId="7" w15:restartNumberingAfterBreak="0">
+  <w:abstractNum w:abstractNumId="8" w15:restartNumberingAfterBreak="0">
     <w:nsid w:val="406536A7"/>
     <w:multiLevelType w:val="hybridMultilevel"/>
     <w:tmpl w:val="B6F2FEAE"/>
@@ -4385,7 +5107,7 @@
       </w:rPr>
     </w:lvl>
   </w:abstractNum>
-  <w:abstractNum w:abstractNumId="8" w15:restartNumberingAfterBreak="0">
+  <w:abstractNum w:abstractNumId="9" w15:restartNumberingAfterBreak="0">
     <w:nsid w:val="49144844"/>
     <w:multiLevelType w:val="hybridMultilevel"/>
     <w:tmpl w:val="2394601C"/>
@@ -4498,7 +5220,7 @@
       </w:rPr>
     </w:lvl>
   </w:abstractNum>
-  <w:abstractNum w:abstractNumId="9" w15:restartNumberingAfterBreak="0">
+  <w:abstractNum w:abstractNumId="10" w15:restartNumberingAfterBreak="0">
     <w:nsid w:val="49AC7DE0"/>
     <w:multiLevelType w:val="multilevel"/>
     <w:tmpl w:val="B8C29B34"/>
@@ -4647,7 +5369,7 @@
       </w:rPr>
     </w:lvl>
   </w:abstractNum>
-  <w:abstractNum w:abstractNumId="10" w15:restartNumberingAfterBreak="0">
+  <w:abstractNum w:abstractNumId="11" w15:restartNumberingAfterBreak="0">
     <w:nsid w:val="50785CC2"/>
     <w:multiLevelType w:val="hybridMultilevel"/>
     <w:tmpl w:val="678031B4"/>
@@ -4760,7 +5482,120 @@
       </w:rPr>
     </w:lvl>
   </w:abstractNum>
-  <w:abstractNum w:abstractNumId="11" w15:restartNumberingAfterBreak="0">
+  <w:abstractNum w:abstractNumId="12" w15:restartNumberingAfterBreak="0">
+    <w:nsid w:val="559E47EF"/>
+    <w:multiLevelType w:val="hybridMultilevel"/>
+    <w:tmpl w:val="C2C6C804"/>
+    <w:lvl w:ilvl="0" w:tplc="10090001">
+      <w:start w:val="1"/>
+      <w:numFmt w:val="bullet"/>
+      <w:lvlText w:val=""/>
+      <w:lvlJc w:val="left"/>
+      <w:pPr>
+        <w:ind w:left="720" w:hanging="360"/>
+      </w:pPr>
+      <w:rPr>
+        <w:rFonts w:ascii="Symbol" w:hAnsi="Symbol" w:hint="default"/>
+      </w:rPr>
+    </w:lvl>
+    <w:lvl w:ilvl="1" w:tplc="10090003">
+      <w:start w:val="1"/>
+      <w:numFmt w:val="bullet"/>
+      <w:lvlText w:val="o"/>
+      <w:lvlJc w:val="left"/>
+      <w:pPr>
+        <w:ind w:left="1440" w:hanging="360"/>
+      </w:pPr>
+      <w:rPr>
+        <w:rFonts w:ascii="Courier New" w:hAnsi="Courier New" w:cs="Courier New" w:hint="default"/>
+      </w:rPr>
+    </w:lvl>
+    <w:lvl w:ilvl="2" w:tplc="10090005">
+      <w:start w:val="1"/>
+      <w:numFmt w:val="bullet"/>
+      <w:lvlText w:val=""/>
+      <w:lvlJc w:val="left"/>
+      <w:pPr>
+        <w:ind w:left="2160" w:hanging="360"/>
+      </w:pPr>
+      <w:rPr>
+        <w:rFonts w:ascii="Wingdings" w:hAnsi="Wingdings" w:hint="default"/>
+      </w:rPr>
+    </w:lvl>
+    <w:lvl w:ilvl="3" w:tplc="10090001" w:tentative="1">
+      <w:start w:val="1"/>
+      <w:numFmt w:val="bullet"/>
+      <w:lvlText w:val=""/>
+      <w:lvlJc w:val="left"/>
+      <w:pPr>
+        <w:ind w:left="2880" w:hanging="360"/>
+      </w:pPr>
+      <w:rPr>
+        <w:rFonts w:ascii="Symbol" w:hAnsi="Symbol" w:hint="default"/>
+      </w:rPr>
+    </w:lvl>
+    <w:lvl w:ilvl="4" w:tplc="10090003" w:tentative="1">
+      <w:start w:val="1"/>
+      <w:numFmt w:val="bullet"/>
+      <w:lvlText w:val="o"/>
+      <w:lvlJc w:val="left"/>
+      <w:pPr>
+        <w:ind w:left="3600" w:hanging="360"/>
+      </w:pPr>
+      <w:rPr>
+        <w:rFonts w:ascii="Courier New" w:hAnsi="Courier New" w:cs="Courier New" w:hint="default"/>
+      </w:rPr>
+    </w:lvl>
+    <w:lvl w:ilvl="5" w:tplc="10090005" w:tentative="1">
+      <w:start w:val="1"/>
+      <w:numFmt w:val="bullet"/>
+      <w:lvlText w:val=""/>
+      <w:lvlJc w:val="left"/>
+      <w:pPr>
+        <w:ind w:left="4320" w:hanging="360"/>
+      </w:pPr>
+      <w:rPr>
+        <w:rFonts w:ascii="Wingdings" w:hAnsi="Wingdings" w:hint="default"/>
+      </w:rPr>
+    </w:lvl>
+    <w:lvl w:ilvl="6" w:tplc="10090001" w:tentative="1">
+      <w:start w:val="1"/>
+      <w:numFmt w:val="bullet"/>
+      <w:lvlText w:val=""/>
+      <w:lvlJc w:val="left"/>
+      <w:pPr>
+        <w:ind w:left="5040" w:hanging="360"/>
+      </w:pPr>
+      <w:rPr>
+        <w:rFonts w:ascii="Symbol" w:hAnsi="Symbol" w:hint="default"/>
+      </w:rPr>
+    </w:lvl>
+    <w:lvl w:ilvl="7" w:tplc="10090003" w:tentative="1">
+      <w:start w:val="1"/>
+      <w:numFmt w:val="bullet"/>
+      <w:lvlText w:val="o"/>
+      <w:lvlJc w:val="left"/>
+      <w:pPr>
+        <w:ind w:left="5760" w:hanging="360"/>
+      </w:pPr>
+      <w:rPr>
+        <w:rFonts w:ascii="Courier New" w:hAnsi="Courier New" w:cs="Courier New" w:hint="default"/>
+      </w:rPr>
+    </w:lvl>
+    <w:lvl w:ilvl="8" w:tplc="10090005" w:tentative="1">
+      <w:start w:val="1"/>
+      <w:numFmt w:val="bullet"/>
+      <w:lvlText w:val=""/>
+      <w:lvlJc w:val="left"/>
+      <w:pPr>
+        <w:ind w:left="6480" w:hanging="360"/>
+      </w:pPr>
+      <w:rPr>
+        <w:rFonts w:ascii="Wingdings" w:hAnsi="Wingdings" w:hint="default"/>
+      </w:rPr>
+    </w:lvl>
+  </w:abstractNum>
+  <w:abstractNum w:abstractNumId="13" w15:restartNumberingAfterBreak="0">
     <w:nsid w:val="5D9B3D15"/>
     <w:multiLevelType w:val="multilevel"/>
     <w:tmpl w:val="2FBEE524"/>
@@ -4909,7 +5744,7 @@
       </w:rPr>
     </w:lvl>
   </w:abstractNum>
-  <w:abstractNum w:abstractNumId="12" w15:restartNumberingAfterBreak="0">
+  <w:abstractNum w:abstractNumId="14" w15:restartNumberingAfterBreak="0">
     <w:nsid w:val="5FA7446C"/>
     <w:multiLevelType w:val="hybridMultilevel"/>
     <w:tmpl w:val="2D14BBE8"/>
@@ -5022,7 +5857,7 @@
       </w:rPr>
     </w:lvl>
   </w:abstractNum>
-  <w:abstractNum w:abstractNumId="13" w15:restartNumberingAfterBreak="0">
+  <w:abstractNum w:abstractNumId="15" w15:restartNumberingAfterBreak="0">
     <w:nsid w:val="639F097A"/>
     <w:multiLevelType w:val="hybridMultilevel"/>
     <w:tmpl w:val="881AD294"/>
@@ -5135,7 +5970,7 @@
       </w:rPr>
     </w:lvl>
   </w:abstractNum>
-  <w:abstractNum w:abstractNumId="14" w15:restartNumberingAfterBreak="0">
+  <w:abstractNum w:abstractNumId="16" w15:restartNumberingAfterBreak="0">
     <w:nsid w:val="671B3650"/>
     <w:multiLevelType w:val="hybridMultilevel"/>
     <w:tmpl w:val="F72E60C8"/>
@@ -5248,7 +6083,7 @@
       </w:rPr>
     </w:lvl>
   </w:abstractNum>
-  <w:abstractNum w:abstractNumId="15" w15:restartNumberingAfterBreak="0">
+  <w:abstractNum w:abstractNumId="17" w15:restartNumberingAfterBreak="0">
     <w:nsid w:val="724523D1"/>
     <w:multiLevelType w:val="hybridMultilevel"/>
     <w:tmpl w:val="7BB8A27C"/>
@@ -5334,7 +6169,7 @@
       </w:pPr>
     </w:lvl>
   </w:abstractNum>
-  <w:abstractNum w:abstractNumId="16" w15:restartNumberingAfterBreak="0">
+  <w:abstractNum w:abstractNumId="18" w15:restartNumberingAfterBreak="0">
     <w:nsid w:val="73B6659D"/>
     <w:multiLevelType w:val="multilevel"/>
     <w:tmpl w:val="19B6D302"/>
@@ -5483,7 +6318,7 @@
       </w:rPr>
     </w:lvl>
   </w:abstractNum>
-  <w:abstractNum w:abstractNumId="17" w15:restartNumberingAfterBreak="0">
+  <w:abstractNum w:abstractNumId="19" w15:restartNumberingAfterBreak="0">
     <w:nsid w:val="79155B46"/>
     <w:multiLevelType w:val="hybridMultilevel"/>
     <w:tmpl w:val="8888497E"/>
@@ -5596,7 +6431,7 @@
       </w:rPr>
     </w:lvl>
   </w:abstractNum>
-  <w:abstractNum w:abstractNumId="18" w15:restartNumberingAfterBreak="0">
+  <w:abstractNum w:abstractNumId="20" w15:restartNumberingAfterBreak="0">
     <w:nsid w:val="7AD16F69"/>
     <w:multiLevelType w:val="hybridMultilevel"/>
     <w:tmpl w:val="B08C5E3E"/>
@@ -5709,7 +6544,7 @@
       </w:rPr>
     </w:lvl>
   </w:abstractNum>
-  <w:abstractNum w:abstractNumId="19" w15:restartNumberingAfterBreak="0">
+  <w:abstractNum w:abstractNumId="21" w15:restartNumberingAfterBreak="0">
     <w:nsid w:val="7C790E04"/>
     <w:multiLevelType w:val="multilevel"/>
     <w:tmpl w:val="D6D2B538"/>
@@ -5862,19 +6697,19 @@
     <w:abstractNumId w:val="2"/>
   </w:num>
   <w:num w:numId="2" w16cid:durableId="1371960010">
-    <w:abstractNumId w:val="19"/>
+    <w:abstractNumId w:val="21"/>
   </w:num>
   <w:num w:numId="3" w16cid:durableId="1405028834">
-    <w:abstractNumId w:val="16"/>
+    <w:abstractNumId w:val="18"/>
   </w:num>
   <w:num w:numId="4" w16cid:durableId="164131932">
-    <w:abstractNumId w:val="11"/>
+    <w:abstractNumId w:val="13"/>
   </w:num>
   <w:num w:numId="5" w16cid:durableId="1636910233">
-    <w:abstractNumId w:val="9"/>
+    <w:abstractNumId w:val="10"/>
   </w:num>
   <w:num w:numId="6" w16cid:durableId="987246510">
-    <w:abstractNumId w:val="15"/>
+    <w:abstractNumId w:val="17"/>
   </w:num>
   <w:num w:numId="7" w16cid:durableId="922488949">
     <w:abstractNumId w:val="1"/>
@@ -5883,40 +6718,46 @@
     <w:abstractNumId w:val="3"/>
   </w:num>
   <w:num w:numId="9" w16cid:durableId="1132405274">
-    <w:abstractNumId w:val="14"/>
+    <w:abstractNumId w:val="16"/>
   </w:num>
   <w:num w:numId="10" w16cid:durableId="908998290">
-    <w:abstractNumId w:val="6"/>
+    <w:abstractNumId w:val="7"/>
   </w:num>
   <w:num w:numId="11" w16cid:durableId="1320425814">
     <w:abstractNumId w:val="4"/>
   </w:num>
   <w:num w:numId="12" w16cid:durableId="1592548144">
-    <w:abstractNumId w:val="18"/>
+    <w:abstractNumId w:val="20"/>
   </w:num>
   <w:num w:numId="13" w16cid:durableId="377247495">
-    <w:abstractNumId w:val="12"/>
+    <w:abstractNumId w:val="14"/>
   </w:num>
   <w:num w:numId="14" w16cid:durableId="336736483">
     <w:abstractNumId w:val="5"/>
   </w:num>
   <w:num w:numId="15" w16cid:durableId="638538552">
+    <w:abstractNumId w:val="9"/>
+  </w:num>
+  <w:num w:numId="16" w16cid:durableId="2071688141">
+    <w:abstractNumId w:val="11"/>
+  </w:num>
+  <w:num w:numId="17" w16cid:durableId="677462565">
     <w:abstractNumId w:val="8"/>
   </w:num>
-  <w:num w:numId="16" w16cid:durableId="2071688141">
-    <w:abstractNumId w:val="10"/>
-  </w:num>
-  <w:num w:numId="17" w16cid:durableId="677462565">
-    <w:abstractNumId w:val="7"/>
-  </w:num>
   <w:num w:numId="18" w16cid:durableId="869756951">
-    <w:abstractNumId w:val="13"/>
+    <w:abstractNumId w:val="15"/>
   </w:num>
   <w:num w:numId="19" w16cid:durableId="1526285372">
-    <w:abstractNumId w:val="17"/>
+    <w:abstractNumId w:val="19"/>
   </w:num>
   <w:num w:numId="20" w16cid:durableId="841629299">
     <w:abstractNumId w:val="0"/>
+  </w:num>
+  <w:num w:numId="21" w16cid:durableId="798304692">
+    <w:abstractNumId w:val="6"/>
+  </w:num>
+  <w:num w:numId="22" w16cid:durableId="629558449">
+    <w:abstractNumId w:val="12"/>
   </w:num>
 </w:numbering>
 </file>

</xml_diff>